<commit_message>
Auto sync 2026-09-07 09:20:21
</commit_message>
<xml_diff>
--- a/04-需求管理/PRD-OMS发货单拆单与合单功能-v1.0.docx
+++ b/04-需求管理/PRD-OMS发货单拆单与合单功能-v1.0.docx
@@ -335,6 +335,20 @@
     </w:p>
     <w:p>
       <w:pPr>
+        <w:keepNext w:val="0"/>
+        <w:spacing w:before="0" w:after="120" w:line="264" w:lineRule="auto"/>
+      </w:pPr>
+      <w:r>
+        <w:rPr>
+          <w:rFonts w:ascii="Microsoft YaHei" w:hAnsi="Microsoft YaHei" w:eastAsia="Microsoft YaHei"/>
+          <w:color w:val="243447"/>
+          <w:sz w:val="21"/>
+        </w:rPr>
+        <w:t>当前发货单仍绑定原始订单，因此还需补齐退款、取消与退货场景：售后业务归属于原订单商品行，物流履约归属于实际发货单商品行，系统通过数量来源映射同时保留两种关系，避免拆合后退货无法定位或错误冲减其他原订单。</w:t>
+      </w:r>
+    </w:p>
+    <w:p>
+      <w:pPr>
         <w:pStyle w:val="Heading1"/>
         <w:keepNext/>
       </w:pPr>
@@ -475,6 +489,30 @@
           <w:color w:val="243447"/>
           <w:sz w:val="20"/>
         </w:rPr>
+        <w:t>售后闭环：</w:t>
+      </w:r>
+      <w:r>
+        <w:rPr>
+          <w:rFonts w:ascii="Microsoft YaHei" w:hAnsi="Microsoft YaHei" w:eastAsia="Microsoft YaHei"/>
+          <w:color w:val="243447"/>
+          <w:sz w:val="20"/>
+        </w:rPr>
+        <w:t>退货仍从原订单商品行发起，并能定位拆合后的实际发货单及可退数量；发货前退款或取消实时扣减可履约数量。</w:t>
+      </w:r>
+    </w:p>
+    <w:p>
+      <w:pPr>
+        <w:pStyle w:val="ListBullet"/>
+        <w:spacing w:after="80" w:line="280" w:lineRule="auto"/>
+        <w:ind w:left="720" w:hanging="360"/>
+      </w:pPr>
+      <w:r>
+        <w:rPr>
+          <w:rFonts w:ascii="Microsoft YaHei" w:hAnsi="Microsoft YaHei" w:eastAsia="Microsoft YaHei"/>
+          <w:b/>
+          <w:color w:val="243447"/>
+          <w:sz w:val="20"/>
+        </w:rPr>
         <w:t>可控同步：</w:t>
       </w:r>
       <w:r>
@@ -1792,6 +1830,110 @@
           </w:p>
         </w:tc>
       </w:tr>
+      <w:tr>
+        <w:trPr>
+          <w:cantSplit/>
+        </w:trPr>
+        <w:tc>
+          <w:tcPr>
+            <w:tcW w:type="dxa" w:w="1600"/>
+            <w:tcMar>
+              <w:top w:w="80" w:type="dxa"/>
+              <w:start w:w="120" w:type="dxa"/>
+              <w:bottom w:w="80" w:type="dxa"/>
+              <w:end w:w="120" w:type="dxa"/>
+            </w:tcMar>
+            <w:vAlign w:val="center"/>
+          </w:tcPr>
+          <w:p>
+            <w:pPr>
+              <w:spacing w:before="0" w:after="20" w:line="259" w:lineRule="auto"/>
+            </w:pPr>
+            <w:r>
+              <w:rPr>
+                <w:rFonts w:ascii="Microsoft YaHei" w:hAnsi="Microsoft YaHei" w:eastAsia="Microsoft YaHei"/>
+                <w:color w:val="243447"/>
+                <w:sz w:val="17"/>
+              </w:rPr>
+            </w:r>
+            <w:r>
+              <w:rPr>
+                <w:rFonts w:ascii="Microsoft YaHei" w:hAnsi="Microsoft YaHei" w:eastAsia="Microsoft YaHei"/>
+                <w:b w:val="0"/>
+                <w:color w:val="243447"/>
+                <w:sz w:val="17"/>
+              </w:rPr>
+              <w:t>退货关联与售后联动</w:t>
+            </w:r>
+          </w:p>
+        </w:tc>
+        <w:tc>
+          <w:tcPr>
+            <w:tcW w:type="dxa" w:w="5100"/>
+            <w:tcMar>
+              <w:top w:w="80" w:type="dxa"/>
+              <w:start w:w="120" w:type="dxa"/>
+              <w:bottom w:w="80" w:type="dxa"/>
+              <w:end w:w="120" w:type="dxa"/>
+            </w:tcMar>
+            <w:vAlign w:val="center"/>
+          </w:tcPr>
+          <w:p>
+            <w:pPr>
+              <w:spacing w:before="0" w:after="20" w:line="259" w:lineRule="auto"/>
+            </w:pPr>
+            <w:r>
+              <w:rPr>
+                <w:rFonts w:ascii="Microsoft YaHei" w:hAnsi="Microsoft YaHei" w:eastAsia="Microsoft YaHei"/>
+                <w:color w:val="243447"/>
+                <w:sz w:val="17"/>
+              </w:rPr>
+            </w:r>
+            <w:r>
+              <w:rPr>
+                <w:rFonts w:ascii="Microsoft YaHei" w:hAnsi="Microsoft YaHei" w:eastAsia="Microsoft YaHei"/>
+                <w:b w:val="0"/>
+                <w:color w:val="243447"/>
+                <w:sz w:val="17"/>
+              </w:rPr>
+              <w:t>复用现有售后退款模块：售后归属原订单商品行，同时关联实际发货单商品行；拆合前校验退款、取消、退货占用数量。</w:t>
+            </w:r>
+          </w:p>
+        </w:tc>
+        <w:tc>
+          <w:tcPr>
+            <w:tcW w:type="dxa" w:w="2660"/>
+            <w:tcMar>
+              <w:top w:w="80" w:type="dxa"/>
+              <w:start w:w="120" w:type="dxa"/>
+              <w:bottom w:w="80" w:type="dxa"/>
+              <w:end w:w="120" w:type="dxa"/>
+            </w:tcMar>
+            <w:vAlign w:val="center"/>
+          </w:tcPr>
+          <w:p>
+            <w:pPr>
+              <w:spacing w:before="0" w:after="20" w:line="259" w:lineRule="auto"/>
+            </w:pPr>
+            <w:r>
+              <w:rPr>
+                <w:rFonts w:ascii="Microsoft YaHei" w:hAnsi="Microsoft YaHei" w:eastAsia="Microsoft YaHei"/>
+                <w:color w:val="243447"/>
+                <w:sz w:val="17"/>
+              </w:rPr>
+            </w:r>
+            <w:r>
+              <w:rPr>
+                <w:rFonts w:ascii="Microsoft YaHei" w:hAnsi="Microsoft YaHei" w:eastAsia="Microsoft YaHei"/>
+                <w:b w:val="0"/>
+                <w:color w:val="243447"/>
+                <w:sz w:val="17"/>
+              </w:rPr>
+              <w:t>发货管理入口 + 售后退款流程</w:t>
+            </w:r>
+          </w:p>
+        </w:tc>
+      </w:tr>
     </w:tbl>
     <w:p>
       <w:pPr>
@@ -2781,6 +2923,280 @@
                 <w:sz w:val="17"/>
               </w:rPr>
               <w:t>新增关系层，不覆盖历史</w:t>
+            </w:r>
+          </w:p>
+        </w:tc>
+      </w:tr>
+      <w:tr>
+        <w:trPr>
+          <w:cantSplit/>
+        </w:trPr>
+        <w:tc>
+          <w:tcPr>
+            <w:tcW w:type="dxa" w:w="2700"/>
+            <w:tcMar>
+              <w:top w:w="80" w:type="dxa"/>
+              <w:start w:w="120" w:type="dxa"/>
+              <w:bottom w:w="80" w:type="dxa"/>
+              <w:end w:w="120" w:type="dxa"/>
+            </w:tcMar>
+            <w:vAlign w:val="center"/>
+          </w:tcPr>
+          <w:p>
+            <w:pPr>
+              <w:spacing w:before="0" w:after="20" w:line="259" w:lineRule="auto"/>
+            </w:pPr>
+            <w:r>
+              <w:rPr>
+                <w:rFonts w:ascii="Microsoft YaHei" w:hAnsi="Microsoft YaHei" w:eastAsia="Microsoft YaHei"/>
+                <w:color w:val="243447"/>
+                <w:sz w:val="17"/>
+              </w:rPr>
+            </w:r>
+            <w:r>
+              <w:rPr>
+                <w:rFonts w:ascii="Microsoft YaHei" w:hAnsi="Microsoft YaHei" w:eastAsia="Microsoft YaHei"/>
+                <w:b w:val="0"/>
+                <w:color w:val="243447"/>
+                <w:sz w:val="17"/>
+              </w:rPr>
+              <w:t>发货前发生退款或取消</w:t>
+            </w:r>
+          </w:p>
+        </w:tc>
+        <w:tc>
+          <w:tcPr>
+            <w:tcW w:type="dxa" w:w="2200"/>
+            <w:tcMar>
+              <w:top w:w="80" w:type="dxa"/>
+              <w:start w:w="120" w:type="dxa"/>
+              <w:bottom w:w="80" w:type="dxa"/>
+              <w:end w:w="120" w:type="dxa"/>
+            </w:tcMar>
+            <w:vAlign w:val="center"/>
+          </w:tcPr>
+          <w:p>
+            <w:pPr>
+              <w:spacing w:before="0" w:after="20" w:line="259" w:lineRule="auto"/>
+            </w:pPr>
+            <w:r>
+              <w:rPr>
+                <w:rFonts w:ascii="Microsoft YaHei" w:hAnsi="Microsoft YaHei" w:eastAsia="Microsoft YaHei"/>
+                <w:color w:val="243447"/>
+                <w:sz w:val="17"/>
+              </w:rPr>
+            </w:r>
+            <w:r>
+              <w:rPr>
+                <w:rFonts w:ascii="Microsoft YaHei" w:hAnsi="Microsoft YaHei" w:eastAsia="Microsoft YaHei"/>
+                <w:b w:val="0"/>
+                <w:color w:val="243447"/>
+                <w:sz w:val="17"/>
+              </w:rPr>
+              <w:t>仅对扣除售后占用后的剩余履约数量拆合</w:t>
+            </w:r>
+          </w:p>
+        </w:tc>
+        <w:tc>
+          <w:tcPr>
+            <w:tcW w:type="dxa" w:w="2000"/>
+            <w:tcMar>
+              <w:top w:w="80" w:type="dxa"/>
+              <w:start w:w="120" w:type="dxa"/>
+              <w:bottom w:w="80" w:type="dxa"/>
+              <w:end w:w="120" w:type="dxa"/>
+            </w:tcMar>
+            <w:vAlign w:val="center"/>
+          </w:tcPr>
+          <w:p>
+            <w:pPr>
+              <w:spacing w:before="0" w:after="20" w:line="259" w:lineRule="auto"/>
+            </w:pPr>
+            <w:r>
+              <w:rPr>
+                <w:rFonts w:ascii="Microsoft YaHei" w:hAnsi="Microsoft YaHei" w:eastAsia="Microsoft YaHei"/>
+                <w:color w:val="243447"/>
+                <w:sz w:val="17"/>
+              </w:rPr>
+            </w:r>
+            <w:r>
+              <w:rPr>
+                <w:rFonts w:ascii="Microsoft YaHei" w:hAnsi="Microsoft YaHei" w:eastAsia="Microsoft YaHei"/>
+                <w:b w:val="0"/>
+                <w:color w:val="243447"/>
+                <w:sz w:val="17"/>
+              </w:rPr>
+              <w:t>发货管理 / 旺店通驳回订单Tab</w:t>
+            </w:r>
+          </w:p>
+        </w:tc>
+        <w:tc>
+          <w:tcPr>
+            <w:tcW w:type="dxa" w:w="2460"/>
+            <w:tcMar>
+              <w:top w:w="80" w:type="dxa"/>
+              <w:start w:w="120" w:type="dxa"/>
+              <w:bottom w:w="80" w:type="dxa"/>
+              <w:end w:w="120" w:type="dxa"/>
+            </w:tcMar>
+            <w:vAlign w:val="center"/>
+          </w:tcPr>
+          <w:p>
+            <w:pPr>
+              <w:spacing w:before="0" w:after="20" w:line="259" w:lineRule="auto"/>
+            </w:pPr>
+            <w:r>
+              <w:rPr>
+                <w:rFonts w:ascii="Microsoft YaHei" w:hAnsi="Microsoft YaHei" w:eastAsia="Microsoft YaHei"/>
+                <w:color w:val="243447"/>
+                <w:sz w:val="17"/>
+              </w:rPr>
+            </w:r>
+            <w:r>
+              <w:rPr>
+                <w:rFonts w:ascii="Microsoft YaHei" w:hAnsi="Microsoft YaHei" w:eastAsia="Microsoft YaHei"/>
+                <w:b w:val="0"/>
+                <w:color w:val="243447"/>
+                <w:sz w:val="17"/>
+              </w:rPr>
+              <w:t>全量取消时当前发货单失效，不再拆合</w:t>
+            </w:r>
+          </w:p>
+        </w:tc>
+      </w:tr>
+      <w:tr>
+        <w:trPr>
+          <w:cantSplit/>
+        </w:trPr>
+        <w:tc>
+          <w:tcPr>
+            <w:tcW w:type="dxa" w:w="2700"/>
+            <w:tcMar>
+              <w:top w:w="80" w:type="dxa"/>
+              <w:start w:w="120" w:type="dxa"/>
+              <w:bottom w:w="80" w:type="dxa"/>
+              <w:end w:w="120" w:type="dxa"/>
+            </w:tcMar>
+            <w:vAlign w:val="center"/>
+          </w:tcPr>
+          <w:p>
+            <w:pPr>
+              <w:spacing w:before="0" w:after="20" w:line="259" w:lineRule="auto"/>
+            </w:pPr>
+            <w:r>
+              <w:rPr>
+                <w:rFonts w:ascii="Microsoft YaHei" w:hAnsi="Microsoft YaHei" w:eastAsia="Microsoft YaHei"/>
+                <w:color w:val="243447"/>
+                <w:sz w:val="17"/>
+              </w:rPr>
+            </w:r>
+            <w:r>
+              <w:rPr>
+                <w:rFonts w:ascii="Microsoft YaHei" w:hAnsi="Microsoft YaHei" w:eastAsia="Microsoft YaHei"/>
+                <w:b w:val="0"/>
+                <w:color w:val="243447"/>
+                <w:sz w:val="17"/>
+              </w:rPr>
+              <w:t>发货后发生退货</w:t>
+            </w:r>
+          </w:p>
+        </w:tc>
+        <w:tc>
+          <w:tcPr>
+            <w:tcW w:type="dxa" w:w="2200"/>
+            <w:tcMar>
+              <w:top w:w="80" w:type="dxa"/>
+              <w:start w:w="120" w:type="dxa"/>
+              <w:bottom w:w="80" w:type="dxa"/>
+              <w:end w:w="120" w:type="dxa"/>
+            </w:tcMar>
+            <w:vAlign w:val="center"/>
+          </w:tcPr>
+          <w:p>
+            <w:pPr>
+              <w:spacing w:before="0" w:after="20" w:line="259" w:lineRule="auto"/>
+            </w:pPr>
+            <w:r>
+              <w:rPr>
+                <w:rFonts w:ascii="Microsoft YaHei" w:hAnsi="Microsoft YaHei" w:eastAsia="Microsoft YaHei"/>
+                <w:color w:val="243447"/>
+                <w:sz w:val="17"/>
+              </w:rPr>
+            </w:r>
+            <w:r>
+              <w:rPr>
+                <w:rFonts w:ascii="Microsoft YaHei" w:hAnsi="Microsoft YaHei" w:eastAsia="Microsoft YaHei"/>
+                <w:b w:val="0"/>
+                <w:color w:val="243447"/>
+                <w:sz w:val="17"/>
+              </w:rPr>
+              <w:t>从原订单商品行发起退货，并映射实际发货单明细</w:t>
+            </w:r>
+          </w:p>
+        </w:tc>
+        <w:tc>
+          <w:tcPr>
+            <w:tcW w:type="dxa" w:w="2000"/>
+            <w:tcMar>
+              <w:top w:w="80" w:type="dxa"/>
+              <w:start w:w="120" w:type="dxa"/>
+              <w:bottom w:w="80" w:type="dxa"/>
+              <w:end w:w="120" w:type="dxa"/>
+            </w:tcMar>
+            <w:vAlign w:val="center"/>
+          </w:tcPr>
+          <w:p>
+            <w:pPr>
+              <w:spacing w:before="0" w:after="20" w:line="259" w:lineRule="auto"/>
+            </w:pPr>
+            <w:r>
+              <w:rPr>
+                <w:rFonts w:ascii="Microsoft YaHei" w:hAnsi="Microsoft YaHei" w:eastAsia="Microsoft YaHei"/>
+                <w:color w:val="243447"/>
+                <w:sz w:val="17"/>
+              </w:rPr>
+            </w:r>
+            <w:r>
+              <w:rPr>
+                <w:rFonts w:ascii="Microsoft YaHei" w:hAnsi="Microsoft YaHei" w:eastAsia="Microsoft YaHei"/>
+                <w:b w:val="0"/>
+                <w:color w:val="243447"/>
+                <w:sz w:val="17"/>
+              </w:rPr>
+              <w:t>售后退款模块 / 发货管理退货关联</w:t>
+            </w:r>
+          </w:p>
+        </w:tc>
+        <w:tc>
+          <w:tcPr>
+            <w:tcW w:type="dxa" w:w="2460"/>
+            <w:tcMar>
+              <w:top w:w="80" w:type="dxa"/>
+              <w:start w:w="120" w:type="dxa"/>
+              <w:bottom w:w="80" w:type="dxa"/>
+              <w:end w:w="120" w:type="dxa"/>
+            </w:tcMar>
+            <w:vAlign w:val="center"/>
+          </w:tcPr>
+          <w:p>
+            <w:pPr>
+              <w:spacing w:before="0" w:after="20" w:line="259" w:lineRule="auto"/>
+            </w:pPr>
+            <w:r>
+              <w:rPr>
+                <w:rFonts w:ascii="Microsoft YaHei" w:hAnsi="Microsoft YaHei" w:eastAsia="Microsoft YaHei"/>
+                <w:color w:val="243447"/>
+                <w:sz w:val="17"/>
+              </w:rPr>
+            </w:r>
+            <w:r>
+              <w:rPr>
+                <w:rFonts w:ascii="Microsoft YaHei" w:hAnsi="Microsoft YaHei" w:eastAsia="Microsoft YaHei"/>
+                <w:b w:val="0"/>
+                <w:color w:val="243447"/>
+                <w:sz w:val="17"/>
+              </w:rPr>
+              <w:t>原订单承担售后归属，实际发货单承担退货履约追溯</w:t>
             </w:r>
           </w:p>
         </w:tc>
@@ -3852,6 +4268,110 @@
                 <w:sz w:val="17"/>
               </w:rPr>
               <w:t>重复点击不得生成重复发货单；提交前再次确认来源单仍可处理。</w:t>
+            </w:r>
+          </w:p>
+        </w:tc>
+      </w:tr>
+      <w:tr>
+        <w:trPr>
+          <w:cantSplit/>
+        </w:trPr>
+        <w:tc>
+          <w:tcPr>
+            <w:tcW w:type="dxa" w:w="900"/>
+            <w:tcMar>
+              <w:top w:w="80" w:type="dxa"/>
+              <w:start w:w="120" w:type="dxa"/>
+              <w:bottom w:w="80" w:type="dxa"/>
+              <w:end w:w="120" w:type="dxa"/>
+            </w:tcMar>
+            <w:vAlign w:val="center"/>
+          </w:tcPr>
+          <w:p>
+            <w:pPr>
+              <w:spacing w:before="0" w:after="20" w:line="259" w:lineRule="auto"/>
+            </w:pPr>
+            <w:r>
+              <w:rPr>
+                <w:rFonts w:ascii="Microsoft YaHei" w:hAnsi="Microsoft YaHei" w:eastAsia="Microsoft YaHei"/>
+                <w:color w:val="243447"/>
+                <w:sz w:val="17"/>
+              </w:rPr>
+            </w:r>
+            <w:r>
+              <w:rPr>
+                <w:rFonts w:ascii="Microsoft YaHei" w:hAnsi="Microsoft YaHei" w:eastAsia="Microsoft YaHei"/>
+                <w:b w:val="0"/>
+                <w:color w:val="243447"/>
+                <w:sz w:val="17"/>
+              </w:rPr>
+              <w:t>P0</w:t>
+            </w:r>
+          </w:p>
+        </w:tc>
+        <w:tc>
+          <w:tcPr>
+            <w:tcW w:type="dxa" w:w="2700"/>
+            <w:tcMar>
+              <w:top w:w="80" w:type="dxa"/>
+              <w:start w:w="120" w:type="dxa"/>
+              <w:bottom w:w="80" w:type="dxa"/>
+              <w:end w:w="120" w:type="dxa"/>
+            </w:tcMar>
+            <w:vAlign w:val="center"/>
+          </w:tcPr>
+          <w:p>
+            <w:pPr>
+              <w:spacing w:before="0" w:after="20" w:line="259" w:lineRule="auto"/>
+            </w:pPr>
+            <w:r>
+              <w:rPr>
+                <w:rFonts w:ascii="Microsoft YaHei" w:hAnsi="Microsoft YaHei" w:eastAsia="Microsoft YaHei"/>
+                <w:color w:val="243447"/>
+                <w:sz w:val="17"/>
+              </w:rPr>
+            </w:r>
+            <w:r>
+              <w:rPr>
+                <w:rFonts w:ascii="Microsoft YaHei" w:hAnsi="Microsoft YaHei" w:eastAsia="Microsoft YaHei"/>
+                <w:b w:val="0"/>
+                <w:color w:val="243447"/>
+                <w:sz w:val="17"/>
+              </w:rPr>
+              <w:t>退货关联与售后数量校验</w:t>
+            </w:r>
+          </w:p>
+        </w:tc>
+        <w:tc>
+          <w:tcPr>
+            <w:tcW w:type="dxa" w:w="5760"/>
+            <w:tcMar>
+              <w:top w:w="80" w:type="dxa"/>
+              <w:start w:w="120" w:type="dxa"/>
+              <w:bottom w:w="80" w:type="dxa"/>
+              <w:end w:w="120" w:type="dxa"/>
+            </w:tcMar>
+            <w:vAlign w:val="center"/>
+          </w:tcPr>
+          <w:p>
+            <w:pPr>
+              <w:spacing w:before="0" w:after="20" w:line="259" w:lineRule="auto"/>
+            </w:pPr>
+            <w:r>
+              <w:rPr>
+                <w:rFonts w:ascii="Microsoft YaHei" w:hAnsi="Microsoft YaHei" w:eastAsia="Microsoft YaHei"/>
+                <w:color w:val="243447"/>
+                <w:sz w:val="17"/>
+              </w:rPr>
+            </w:r>
+            <w:r>
+              <w:rPr>
+                <w:rFonts w:ascii="Microsoft YaHei" w:hAnsi="Microsoft YaHei" w:eastAsia="Microsoft YaHei"/>
+                <w:b w:val="0"/>
+                <w:color w:val="243447"/>
+                <w:sz w:val="17"/>
+              </w:rPr>
+              <w:t>保存原订单商品行与实际发货单商品行映射；拆合提交时重新校验退款、取消、退货占用及剩余可履约数量。</w:t>
             </w:r>
           </w:p>
         </w:tc>
@@ -4715,6 +5235,77 @@
           </w:p>
         </w:tc>
       </w:tr>
+      <w:tr>
+        <w:trPr>
+          <w:cantSplit/>
+        </w:trPr>
+        <w:tc>
+          <w:tcPr>
+            <w:tcW w:type="dxa" w:w="2500"/>
+            <w:tcMar>
+              <w:top w:w="80" w:type="dxa"/>
+              <w:start w:w="120" w:type="dxa"/>
+              <w:bottom w:w="80" w:type="dxa"/>
+              <w:end w:w="120" w:type="dxa"/>
+            </w:tcMar>
+            <w:vAlign w:val="center"/>
+          </w:tcPr>
+          <w:p>
+            <w:pPr>
+              <w:spacing w:before="0" w:after="20" w:line="259" w:lineRule="auto"/>
+            </w:pPr>
+            <w:r>
+              <w:rPr>
+                <w:rFonts w:ascii="Microsoft YaHei" w:hAnsi="Microsoft YaHei" w:eastAsia="Microsoft YaHei"/>
+                <w:color w:val="243447"/>
+                <w:sz w:val="18"/>
+              </w:rPr>
+            </w:r>
+            <w:r>
+              <w:rPr>
+                <w:rFonts w:ascii="Microsoft YaHei" w:hAnsi="Microsoft YaHei" w:eastAsia="Microsoft YaHei"/>
+                <w:b w:val="0"/>
+                <w:color w:val="243447"/>
+                <w:sz w:val="18"/>
+              </w:rPr>
+              <w:t>退货关联弹窗</w:t>
+            </w:r>
+          </w:p>
+        </w:tc>
+        <w:tc>
+          <w:tcPr>
+            <w:tcW w:type="dxa" w:w="6860"/>
+            <w:tcMar>
+              <w:top w:w="80" w:type="dxa"/>
+              <w:start w:w="120" w:type="dxa"/>
+              <w:bottom w:w="80" w:type="dxa"/>
+              <w:end w:w="120" w:type="dxa"/>
+            </w:tcMar>
+            <w:vAlign w:val="center"/>
+          </w:tcPr>
+          <w:p>
+            <w:pPr>
+              <w:spacing w:before="0" w:after="20" w:line="259" w:lineRule="auto"/>
+            </w:pPr>
+            <w:r>
+              <w:rPr>
+                <w:rFonts w:ascii="Microsoft YaHei" w:hAnsi="Microsoft YaHei" w:eastAsia="Microsoft YaHei"/>
+                <w:color w:val="243447"/>
+                <w:sz w:val="18"/>
+              </w:rPr>
+            </w:r>
+            <w:r>
+              <w:rPr>
+                <w:rFonts w:ascii="Microsoft YaHei" w:hAnsi="Microsoft YaHei" w:eastAsia="Microsoft YaHei"/>
+                <w:b w:val="0"/>
+                <w:color w:val="243447"/>
+                <w:sz w:val="18"/>
+              </w:rPr>
+              <w:t>从发货单、驳回订单或拆合记录进入；分别演示发货前退款/取消和发货后退货，展示原订单商品行、实际发货单商品行、已退数量与可退数量。</w:t>
+            </w:r>
+          </w:p>
+        </w:tc>
+      </w:tr>
     </w:tbl>
     <w:p>
       <w:pPr>
@@ -5707,6 +6298,77 @@
           </w:p>
         </w:tc>
       </w:tr>
+      <w:tr>
+        <w:trPr>
+          <w:cantSplit/>
+        </w:trPr>
+        <w:tc>
+          <w:tcPr>
+            <w:tcW w:type="dxa" w:w="2200"/>
+            <w:tcMar>
+              <w:top w:w="80" w:type="dxa"/>
+              <w:start w:w="120" w:type="dxa"/>
+              <w:bottom w:w="80" w:type="dxa"/>
+              <w:end w:w="120" w:type="dxa"/>
+            </w:tcMar>
+            <w:vAlign w:val="center"/>
+          </w:tcPr>
+          <w:p>
+            <w:pPr>
+              <w:spacing w:before="0" w:after="20" w:line="259" w:lineRule="auto"/>
+            </w:pPr>
+            <w:r>
+              <w:rPr>
+                <w:rFonts w:ascii="Microsoft YaHei" w:hAnsi="Microsoft YaHei" w:eastAsia="Microsoft YaHei"/>
+                <w:color w:val="243447"/>
+                <w:sz w:val="18"/>
+              </w:rPr>
+            </w:r>
+            <w:r>
+              <w:rPr>
+                <w:rFonts w:ascii="Microsoft YaHei" w:hAnsi="Microsoft YaHei" w:eastAsia="Microsoft YaHei"/>
+                <w:b w:val="0"/>
+                <w:color w:val="243447"/>
+                <w:sz w:val="18"/>
+              </w:rPr>
+              <w:t>售后数量校验</w:t>
+            </w:r>
+          </w:p>
+        </w:tc>
+        <w:tc>
+          <w:tcPr>
+            <w:tcW w:type="dxa" w:w="7160"/>
+            <w:tcMar>
+              <w:top w:w="80" w:type="dxa"/>
+              <w:start w:w="120" w:type="dxa"/>
+              <w:bottom w:w="80" w:type="dxa"/>
+              <w:end w:w="120" w:type="dxa"/>
+            </w:tcMar>
+            <w:vAlign w:val="center"/>
+          </w:tcPr>
+          <w:p>
+            <w:pPr>
+              <w:spacing w:before="0" w:after="20" w:line="259" w:lineRule="auto"/>
+            </w:pPr>
+            <w:r>
+              <w:rPr>
+                <w:rFonts w:ascii="Microsoft YaHei" w:hAnsi="Microsoft YaHei" w:eastAsia="Microsoft YaHei"/>
+                <w:color w:val="243447"/>
+                <w:sz w:val="18"/>
+              </w:rPr>
+            </w:r>
+            <w:r>
+              <w:rPr>
+                <w:rFonts w:ascii="Microsoft YaHei" w:hAnsi="Microsoft YaHei" w:eastAsia="Microsoft YaHei"/>
+                <w:b w:val="0"/>
+                <w:color w:val="243447"/>
+                <w:sz w:val="18"/>
+              </w:rPr>
+              <w:t>可拆数量以扣除退款、取消等售后占用后的剩余履约数量为准；确认拆单时必须重新读取最新售后状态和数量，发生变化则阻止提交并刷新方案。</w:t>
+            </w:r>
+          </w:p>
+        </w:tc>
+      </w:tr>
     </w:tbl>
     <w:p>
       <w:pPr>
@@ -6228,6 +6890,77 @@
                 <w:sz w:val="18"/>
               </w:rPr>
               <w:t>生成一个合并发货单号，并关联全部来源订单、发货单及上一层拆合批次。</w:t>
+            </w:r>
+          </w:p>
+        </w:tc>
+      </w:tr>
+      <w:tr>
+        <w:trPr>
+          <w:cantSplit/>
+        </w:trPr>
+        <w:tc>
+          <w:tcPr>
+            <w:tcW w:type="dxa" w:w="2200"/>
+            <w:tcMar>
+              <w:top w:w="80" w:type="dxa"/>
+              <w:start w:w="120" w:type="dxa"/>
+              <w:bottom w:w="80" w:type="dxa"/>
+              <w:end w:w="120" w:type="dxa"/>
+            </w:tcMar>
+            <w:vAlign w:val="center"/>
+          </w:tcPr>
+          <w:p>
+            <w:pPr>
+              <w:spacing w:before="0" w:after="20" w:line="259" w:lineRule="auto"/>
+            </w:pPr>
+            <w:r>
+              <w:rPr>
+                <w:rFonts w:ascii="Microsoft YaHei" w:hAnsi="Microsoft YaHei" w:eastAsia="Microsoft YaHei"/>
+                <w:color w:val="243447"/>
+                <w:sz w:val="18"/>
+              </w:rPr>
+            </w:r>
+            <w:r>
+              <w:rPr>
+                <w:rFonts w:ascii="Microsoft YaHei" w:hAnsi="Microsoft YaHei" w:eastAsia="Microsoft YaHei"/>
+                <w:b w:val="0"/>
+                <w:color w:val="243447"/>
+                <w:sz w:val="18"/>
+              </w:rPr>
+              <w:t>售后数量校验</w:t>
+            </w:r>
+          </w:p>
+        </w:tc>
+        <w:tc>
+          <w:tcPr>
+            <w:tcW w:type="dxa" w:w="7160"/>
+            <w:tcMar>
+              <w:top w:w="80" w:type="dxa"/>
+              <w:start w:w="120" w:type="dxa"/>
+              <w:bottom w:w="80" w:type="dxa"/>
+              <w:end w:w="120" w:type="dxa"/>
+            </w:tcMar>
+            <w:vAlign w:val="center"/>
+          </w:tcPr>
+          <w:p>
+            <w:pPr>
+              <w:spacing w:before="0" w:after="20" w:line="259" w:lineRule="auto"/>
+            </w:pPr>
+            <w:r>
+              <w:rPr>
+                <w:rFonts w:ascii="Microsoft YaHei" w:hAnsi="Microsoft YaHei" w:eastAsia="Microsoft YaHei"/>
+                <w:color w:val="243447"/>
+                <w:sz w:val="18"/>
+              </w:rPr>
+            </w:r>
+            <w:r>
+              <w:rPr>
+                <w:rFonts w:ascii="Microsoft YaHei" w:hAnsi="Microsoft YaHei" w:eastAsia="Microsoft YaHei"/>
+                <w:b w:val="0"/>
+                <w:color w:val="243447"/>
+                <w:sz w:val="18"/>
+              </w:rPr>
+              <w:t>每张来源单只允许以扣除退款、取消等占用后的剩余履约数量参与合单；确认合单时重新校验，任一来源发生变化则整体阻止提交。</w:t>
             </w:r>
           </w:p>
         </w:tc>
@@ -6960,6 +7693,77 @@
                 <w:color w:val="243447"/>
                 <w:sz w:val="18"/>
               </w:rPr>
+              <w:t>退货履约映射</w:t>
+            </w:r>
+          </w:p>
+        </w:tc>
+        <w:tc>
+          <w:tcPr>
+            <w:tcW w:type="dxa" w:w="6960"/>
+            <w:tcMar>
+              <w:top w:w="80" w:type="dxa"/>
+              <w:start w:w="120" w:type="dxa"/>
+              <w:bottom w:w="80" w:type="dxa"/>
+              <w:end w:w="120" w:type="dxa"/>
+            </w:tcMar>
+            <w:vAlign w:val="center"/>
+          </w:tcPr>
+          <w:p>
+            <w:pPr>
+              <w:spacing w:before="0" w:after="20" w:line="259" w:lineRule="auto"/>
+            </w:pPr>
+            <w:r>
+              <w:rPr>
+                <w:rFonts w:ascii="Microsoft YaHei" w:hAnsi="Microsoft YaHei" w:eastAsia="Microsoft YaHei"/>
+                <w:color w:val="243447"/>
+                <w:sz w:val="18"/>
+              </w:rPr>
+            </w:r>
+            <w:r>
+              <w:rPr>
+                <w:rFonts w:ascii="Microsoft YaHei" w:hAnsi="Microsoft YaHei" w:eastAsia="Microsoft YaHei"/>
+                <w:b w:val="0"/>
+                <w:color w:val="243447"/>
+                <w:sz w:val="18"/>
+              </w:rPr>
+              <w:t>退货明细同时保存原订单商品行ID、实际发货单商品行ID、售后/退货明细ID及本次映射数量；合单汇总相同SKU时不得丢失原订单数量来源。</w:t>
+            </w:r>
+          </w:p>
+        </w:tc>
+      </w:tr>
+      <w:tr>
+        <w:trPr>
+          <w:cantSplit/>
+        </w:trPr>
+        <w:tc>
+          <w:tcPr>
+            <w:tcW w:type="dxa" w:w="2400"/>
+            <w:tcMar>
+              <w:top w:w="80" w:type="dxa"/>
+              <w:start w:w="120" w:type="dxa"/>
+              <w:bottom w:w="80" w:type="dxa"/>
+              <w:end w:w="120" w:type="dxa"/>
+            </w:tcMar>
+            <w:vAlign w:val="center"/>
+          </w:tcPr>
+          <w:p>
+            <w:pPr>
+              <w:spacing w:before="0" w:after="20" w:line="259" w:lineRule="auto"/>
+            </w:pPr>
+            <w:r>
+              <w:rPr>
+                <w:rFonts w:ascii="Microsoft YaHei" w:hAnsi="Microsoft YaHei" w:eastAsia="Microsoft YaHei"/>
+                <w:color w:val="243447"/>
+                <w:sz w:val="18"/>
+              </w:rPr>
+            </w:r>
+            <w:r>
+              <w:rPr>
+                <w:rFonts w:ascii="Microsoft YaHei" w:hAnsi="Microsoft YaHei" w:eastAsia="Microsoft YaHei"/>
+                <w:b w:val="0"/>
+                <w:color w:val="243447"/>
+                <w:sz w:val="18"/>
+              </w:rPr>
               <w:t>审计信息</w:t>
             </w:r>
           </w:p>
@@ -7665,6 +8469,815 @@
       </w:r>
     </w:p>
     <w:p>
+      <w:pPr>
+        <w:pStyle w:val="Heading2"/>
+        <w:keepNext/>
+      </w:pPr>
+      <w:r>
+        <w:t>7.8 退货与售后关联规则</w:t>
+      </w:r>
+    </w:p>
+    <w:tbl>
+      <w:tblPr>
+        <w:tblStyle w:val="TableGrid"/>
+        <w:tblW w:type="dxa" w:w="9360"/>
+        <w:jc w:val="left"/>
+        <w:tblLayout w:type="fixed"/>
+        <w:tblLook w:firstColumn="1" w:firstRow="1" w:lastColumn="0" w:lastRow="0" w:noHBand="0" w:noVBand="1" w:val="04A0"/>
+        <w:tblInd w:w="120" w:type="dxa"/>
+      </w:tblPr>
+      <w:tblGrid>
+        <w:gridCol w:w="2200"/>
+        <w:gridCol w:w="7160"/>
+      </w:tblGrid>
+      <w:tr>
+        <w:trPr>
+          <w:cantSplit/>
+          <w:tblHeader w:val="true"/>
+        </w:trPr>
+        <w:tc>
+          <w:tcPr>
+            <w:tcW w:type="dxa" w:w="2200"/>
+            <w:tcMar>
+              <w:top w:w="80" w:type="dxa"/>
+              <w:start w:w="120" w:type="dxa"/>
+              <w:bottom w:w="80" w:type="dxa"/>
+              <w:end w:w="120" w:type="dxa"/>
+            </w:tcMar>
+            <w:vAlign w:val="center"/>
+            <w:shd w:fill="F2F4F7"/>
+          </w:tcPr>
+          <w:p>
+            <w:pPr>
+              <w:spacing w:before="0" w:after="20" w:line="259" w:lineRule="auto"/>
+            </w:pPr>
+            <w:r>
+              <w:rPr>
+                <w:rFonts w:ascii="Microsoft YaHei" w:hAnsi="Microsoft YaHei" w:eastAsia="Microsoft YaHei"/>
+                <w:b/>
+                <w:color w:val="243447"/>
+                <w:sz w:val="17"/>
+              </w:rPr>
+            </w:r>
+            <w:r>
+              <w:rPr>
+                <w:rFonts w:ascii="Microsoft YaHei" w:hAnsi="Microsoft YaHei" w:eastAsia="Microsoft YaHei"/>
+                <w:b/>
+                <w:color w:val="243447"/>
+                <w:sz w:val="17"/>
+              </w:rPr>
+              <w:t>规则项</w:t>
+            </w:r>
+          </w:p>
+        </w:tc>
+        <w:tc>
+          <w:tcPr>
+            <w:tcW w:type="dxa" w:w="7160"/>
+            <w:tcMar>
+              <w:top w:w="80" w:type="dxa"/>
+              <w:start w:w="120" w:type="dxa"/>
+              <w:bottom w:w="80" w:type="dxa"/>
+              <w:end w:w="120" w:type="dxa"/>
+            </w:tcMar>
+            <w:vAlign w:val="center"/>
+            <w:shd w:fill="F2F4F7"/>
+          </w:tcPr>
+          <w:p>
+            <w:pPr>
+              <w:spacing w:before="0" w:after="20" w:line="259" w:lineRule="auto"/>
+            </w:pPr>
+            <w:r>
+              <w:rPr>
+                <w:rFonts w:ascii="Microsoft YaHei" w:hAnsi="Microsoft YaHei" w:eastAsia="Microsoft YaHei"/>
+                <w:b/>
+                <w:color w:val="243447"/>
+                <w:sz w:val="17"/>
+              </w:rPr>
+            </w:r>
+            <w:r>
+              <w:rPr>
+                <w:rFonts w:ascii="Microsoft YaHei" w:hAnsi="Microsoft YaHei" w:eastAsia="Microsoft YaHei"/>
+                <w:b/>
+                <w:color w:val="243447"/>
+                <w:sz w:val="17"/>
+              </w:rPr>
+              <w:t>要求</w:t>
+            </w:r>
+          </w:p>
+        </w:tc>
+      </w:tr>
+      <w:tr>
+        <w:trPr>
+          <w:cantSplit/>
+        </w:trPr>
+        <w:tc>
+          <w:tcPr>
+            <w:tcW w:type="dxa" w:w="2200"/>
+            <w:tcMar>
+              <w:top w:w="80" w:type="dxa"/>
+              <w:start w:w="120" w:type="dxa"/>
+              <w:bottom w:w="80" w:type="dxa"/>
+              <w:end w:w="120" w:type="dxa"/>
+            </w:tcMar>
+            <w:vAlign w:val="center"/>
+          </w:tcPr>
+          <w:p>
+            <w:pPr>
+              <w:spacing w:before="0" w:after="20" w:line="259" w:lineRule="auto"/>
+            </w:pPr>
+            <w:r>
+              <w:rPr>
+                <w:rFonts w:ascii="Microsoft YaHei" w:hAnsi="Microsoft YaHei" w:eastAsia="Microsoft YaHei"/>
+                <w:color w:val="243447"/>
+                <w:sz w:val="17"/>
+              </w:rPr>
+            </w:r>
+            <w:r>
+              <w:rPr>
+                <w:rFonts w:ascii="Microsoft YaHei" w:hAnsi="Microsoft YaHei" w:eastAsia="Microsoft YaHei"/>
+                <w:b w:val="0"/>
+                <w:color w:val="243447"/>
+                <w:sz w:val="17"/>
+              </w:rPr>
+              <w:t>双重归属</w:t>
+            </w:r>
+          </w:p>
+        </w:tc>
+        <w:tc>
+          <w:tcPr>
+            <w:tcW w:type="dxa" w:w="7160"/>
+            <w:tcMar>
+              <w:top w:w="80" w:type="dxa"/>
+              <w:start w:w="120" w:type="dxa"/>
+              <w:bottom w:w="80" w:type="dxa"/>
+              <w:end w:w="120" w:type="dxa"/>
+            </w:tcMar>
+            <w:vAlign w:val="center"/>
+          </w:tcPr>
+          <w:p>
+            <w:pPr>
+              <w:spacing w:before="0" w:after="20" w:line="259" w:lineRule="auto"/>
+            </w:pPr>
+            <w:r>
+              <w:rPr>
+                <w:rFonts w:ascii="Microsoft YaHei" w:hAnsi="Microsoft YaHei" w:eastAsia="Microsoft YaHei"/>
+                <w:color w:val="243447"/>
+                <w:sz w:val="17"/>
+              </w:rPr>
+            </w:r>
+            <w:r>
+              <w:rPr>
+                <w:rFonts w:ascii="Microsoft YaHei" w:hAnsi="Microsoft YaHei" w:eastAsia="Microsoft YaHei"/>
+                <w:b w:val="0"/>
+                <w:color w:val="243447"/>
+                <w:sz w:val="17"/>
+              </w:rPr>
+              <w:t>售后、退款与财务归属于原订单商品行；退货物流与实际发出数量归属于当前实际发货单商品行。每条退货数量必须同时保留两种关联。</w:t>
+            </w:r>
+          </w:p>
+        </w:tc>
+      </w:tr>
+      <w:tr>
+        <w:trPr>
+          <w:cantSplit/>
+        </w:trPr>
+        <w:tc>
+          <w:tcPr>
+            <w:tcW w:type="dxa" w:w="2200"/>
+            <w:tcMar>
+              <w:top w:w="80" w:type="dxa"/>
+              <w:start w:w="120" w:type="dxa"/>
+              <w:bottom w:w="80" w:type="dxa"/>
+              <w:end w:w="120" w:type="dxa"/>
+            </w:tcMar>
+            <w:vAlign w:val="center"/>
+          </w:tcPr>
+          <w:p>
+            <w:pPr>
+              <w:spacing w:before="0" w:after="20" w:line="259" w:lineRule="auto"/>
+            </w:pPr>
+            <w:r>
+              <w:rPr>
+                <w:rFonts w:ascii="Microsoft YaHei" w:hAnsi="Microsoft YaHei" w:eastAsia="Microsoft YaHei"/>
+                <w:color w:val="243447"/>
+                <w:sz w:val="17"/>
+              </w:rPr>
+            </w:r>
+            <w:r>
+              <w:rPr>
+                <w:rFonts w:ascii="Microsoft YaHei" w:hAnsi="Microsoft YaHei" w:eastAsia="Microsoft YaHei"/>
+                <w:b w:val="0"/>
+                <w:color w:val="243447"/>
+                <w:sz w:val="17"/>
+              </w:rPr>
+              <w:t>发货前退款/取消</w:t>
+            </w:r>
+          </w:p>
+        </w:tc>
+        <w:tc>
+          <w:tcPr>
+            <w:tcW w:type="dxa" w:w="7160"/>
+            <w:tcMar>
+              <w:top w:w="80" w:type="dxa"/>
+              <w:start w:w="120" w:type="dxa"/>
+              <w:bottom w:w="80" w:type="dxa"/>
+              <w:end w:w="120" w:type="dxa"/>
+            </w:tcMar>
+            <w:vAlign w:val="center"/>
+          </w:tcPr>
+          <w:p>
+            <w:pPr>
+              <w:spacing w:before="0" w:after="20" w:line="259" w:lineRule="auto"/>
+            </w:pPr>
+            <w:r>
+              <w:rPr>
+                <w:rFonts w:ascii="Microsoft YaHei" w:hAnsi="Microsoft YaHei" w:eastAsia="Microsoft YaHei"/>
+                <w:color w:val="243447"/>
+                <w:sz w:val="17"/>
+              </w:rPr>
+            </w:r>
+            <w:r>
+              <w:rPr>
+                <w:rFonts w:ascii="Microsoft YaHei" w:hAnsi="Microsoft YaHei" w:eastAsia="Microsoft YaHei"/>
+                <w:b w:val="0"/>
+                <w:color w:val="243447"/>
+                <w:sz w:val="17"/>
+              </w:rPr>
+              <w:t>退款或取消成功后先扣减剩余履约数量，拆单、合单与同步旺店通只处理剩余数量；某发货单剩余数量为0时，该发货单失效且不可继续拆合或同步。</w:t>
+            </w:r>
+          </w:p>
+        </w:tc>
+      </w:tr>
+      <w:tr>
+        <w:trPr>
+          <w:cantSplit/>
+        </w:trPr>
+        <w:tc>
+          <w:tcPr>
+            <w:tcW w:type="dxa" w:w="2200"/>
+            <w:tcMar>
+              <w:top w:w="80" w:type="dxa"/>
+              <w:start w:w="120" w:type="dxa"/>
+              <w:bottom w:w="80" w:type="dxa"/>
+              <w:end w:w="120" w:type="dxa"/>
+            </w:tcMar>
+            <w:vAlign w:val="center"/>
+          </w:tcPr>
+          <w:p>
+            <w:pPr>
+              <w:spacing w:before="0" w:after="20" w:line="259" w:lineRule="auto"/>
+            </w:pPr>
+            <w:r>
+              <w:rPr>
+                <w:rFonts w:ascii="Microsoft YaHei" w:hAnsi="Microsoft YaHei" w:eastAsia="Microsoft YaHei"/>
+                <w:color w:val="243447"/>
+                <w:sz w:val="17"/>
+              </w:rPr>
+            </w:r>
+            <w:r>
+              <w:rPr>
+                <w:rFonts w:ascii="Microsoft YaHei" w:hAnsi="Microsoft YaHei" w:eastAsia="Microsoft YaHei"/>
+                <w:b w:val="0"/>
+                <w:color w:val="243447"/>
+                <w:sz w:val="17"/>
+              </w:rPr>
+              <w:t>拆单后退货</w:t>
+            </w:r>
+          </w:p>
+        </w:tc>
+        <w:tc>
+          <w:tcPr>
+            <w:tcW w:type="dxa" w:w="7160"/>
+            <w:tcMar>
+              <w:top w:w="80" w:type="dxa"/>
+              <w:start w:w="120" w:type="dxa"/>
+              <w:bottom w:w="80" w:type="dxa"/>
+              <w:end w:w="120" w:type="dxa"/>
+            </w:tcMar>
+            <w:vAlign w:val="center"/>
+          </w:tcPr>
+          <w:p>
+            <w:pPr>
+              <w:spacing w:before="0" w:after="20" w:line="259" w:lineRule="auto"/>
+            </w:pPr>
+            <w:r>
+              <w:rPr>
+                <w:rFonts w:ascii="Microsoft YaHei" w:hAnsi="Microsoft YaHei" w:eastAsia="Microsoft YaHei"/>
+                <w:color w:val="243447"/>
+                <w:sz w:val="17"/>
+              </w:rPr>
+            </w:r>
+            <w:r>
+              <w:rPr>
+                <w:rFonts w:ascii="Microsoft YaHei" w:hAnsi="Microsoft YaHei" w:eastAsia="Microsoft YaHei"/>
+                <w:b w:val="0"/>
+                <w:color w:val="243447"/>
+                <w:sz w:val="17"/>
+              </w:rPr>
+              <w:t>一个原订单商品行可能分布在多个拆单子发货单。退货从原订单商品行发起后，应按实际发货明细选择或分配到一个或多个子发货单。</w:t>
+            </w:r>
+          </w:p>
+        </w:tc>
+      </w:tr>
+      <w:tr>
+        <w:trPr>
+          <w:cantSplit/>
+        </w:trPr>
+        <w:tc>
+          <w:tcPr>
+            <w:tcW w:type="dxa" w:w="2200"/>
+            <w:tcMar>
+              <w:top w:w="80" w:type="dxa"/>
+              <w:start w:w="120" w:type="dxa"/>
+              <w:bottom w:w="80" w:type="dxa"/>
+              <w:end w:w="120" w:type="dxa"/>
+            </w:tcMar>
+            <w:vAlign w:val="center"/>
+          </w:tcPr>
+          <w:p>
+            <w:pPr>
+              <w:spacing w:before="0" w:after="20" w:line="259" w:lineRule="auto"/>
+            </w:pPr>
+            <w:r>
+              <w:rPr>
+                <w:rFonts w:ascii="Microsoft YaHei" w:hAnsi="Microsoft YaHei" w:eastAsia="Microsoft YaHei"/>
+                <w:color w:val="243447"/>
+                <w:sz w:val="17"/>
+              </w:rPr>
+            </w:r>
+            <w:r>
+              <w:rPr>
+                <w:rFonts w:ascii="Microsoft YaHei" w:hAnsi="Microsoft YaHei" w:eastAsia="Microsoft YaHei"/>
+                <w:b w:val="0"/>
+                <w:color w:val="243447"/>
+                <w:sz w:val="17"/>
+              </w:rPr>
+              <w:t>合单后退货</w:t>
+            </w:r>
+          </w:p>
+        </w:tc>
+        <w:tc>
+          <w:tcPr>
+            <w:tcW w:type="dxa" w:w="7160"/>
+            <w:tcMar>
+              <w:top w:w="80" w:type="dxa"/>
+              <w:start w:w="120" w:type="dxa"/>
+              <w:bottom w:w="80" w:type="dxa"/>
+              <w:end w:w="120" w:type="dxa"/>
+            </w:tcMar>
+            <w:vAlign w:val="center"/>
+          </w:tcPr>
+          <w:p>
+            <w:pPr>
+              <w:spacing w:before="0" w:after="20" w:line="259" w:lineRule="auto"/>
+            </w:pPr>
+            <w:r>
+              <w:rPr>
+                <w:rFonts w:ascii="Microsoft YaHei" w:hAnsi="Microsoft YaHei" w:eastAsia="Microsoft YaHei"/>
+                <w:color w:val="243447"/>
+                <w:sz w:val="17"/>
+              </w:rPr>
+            </w:r>
+            <w:r>
+              <w:rPr>
+                <w:rFonts w:ascii="Microsoft YaHei" w:hAnsi="Microsoft YaHei" w:eastAsia="Microsoft YaHei"/>
+                <w:b w:val="0"/>
+                <w:color w:val="243447"/>
+                <w:sz w:val="17"/>
+              </w:rPr>
+              <w:t>一个合并发货单可能包含多个原订单。退货必须先确定原订单商品行，再定位合并发货单中的来源数量；不得以合并发货单为共同归属冲减其他原订单。</w:t>
+            </w:r>
+          </w:p>
+        </w:tc>
+      </w:tr>
+      <w:tr>
+        <w:trPr>
+          <w:cantSplit/>
+        </w:trPr>
+        <w:tc>
+          <w:tcPr>
+            <w:tcW w:type="dxa" w:w="2200"/>
+            <w:tcMar>
+              <w:top w:w="80" w:type="dxa"/>
+              <w:start w:w="120" w:type="dxa"/>
+              <w:bottom w:w="80" w:type="dxa"/>
+              <w:end w:w="120" w:type="dxa"/>
+            </w:tcMar>
+            <w:vAlign w:val="center"/>
+          </w:tcPr>
+          <w:p>
+            <w:pPr>
+              <w:spacing w:before="0" w:after="20" w:line="259" w:lineRule="auto"/>
+            </w:pPr>
+            <w:r>
+              <w:rPr>
+                <w:rFonts w:ascii="Microsoft YaHei" w:hAnsi="Microsoft YaHei" w:eastAsia="Microsoft YaHei"/>
+                <w:color w:val="243447"/>
+                <w:sz w:val="17"/>
+              </w:rPr>
+            </w:r>
+            <w:r>
+              <w:rPr>
+                <w:rFonts w:ascii="Microsoft YaHei" w:hAnsi="Microsoft YaHei" w:eastAsia="Microsoft YaHei"/>
+                <w:b w:val="0"/>
+                <w:color w:val="243447"/>
+                <w:sz w:val="17"/>
+              </w:rPr>
+              <w:t>相同SKU</w:t>
+            </w:r>
+          </w:p>
+        </w:tc>
+        <w:tc>
+          <w:tcPr>
+            <w:tcW w:type="dxa" w:w="7160"/>
+            <w:tcMar>
+              <w:top w:w="80" w:type="dxa"/>
+              <w:start w:w="120" w:type="dxa"/>
+              <w:bottom w:w="80" w:type="dxa"/>
+              <w:end w:w="120" w:type="dxa"/>
+            </w:tcMar>
+            <w:vAlign w:val="center"/>
+          </w:tcPr>
+          <w:p>
+            <w:pPr>
+              <w:spacing w:before="0" w:after="20" w:line="259" w:lineRule="auto"/>
+            </w:pPr>
+            <w:r>
+              <w:rPr>
+                <w:rFonts w:ascii="Microsoft YaHei" w:hAnsi="Microsoft YaHei" w:eastAsia="Microsoft YaHei"/>
+                <w:color w:val="243447"/>
+                <w:sz w:val="17"/>
+              </w:rPr>
+            </w:r>
+            <w:r>
+              <w:rPr>
+                <w:rFonts w:ascii="Microsoft YaHei" w:hAnsi="Microsoft YaHei" w:eastAsia="Microsoft YaHei"/>
+                <w:b w:val="0"/>
+                <w:color w:val="243447"/>
+                <w:sz w:val="17"/>
+              </w:rPr>
+              <w:t>多个原订单的相同SKU可在发货展示中汇总，但后台按原订单商品行分别保存来源数量；退货时按原订单来源分别计算，不允许跨来源共用可退数量。</w:t>
+            </w:r>
+          </w:p>
+        </w:tc>
+      </w:tr>
+      <w:tr>
+        <w:trPr>
+          <w:cantSplit/>
+        </w:trPr>
+        <w:tc>
+          <w:tcPr>
+            <w:tcW w:type="dxa" w:w="2200"/>
+            <w:tcMar>
+              <w:top w:w="80" w:type="dxa"/>
+              <w:start w:w="120" w:type="dxa"/>
+              <w:bottom w:w="80" w:type="dxa"/>
+              <w:end w:w="120" w:type="dxa"/>
+            </w:tcMar>
+            <w:vAlign w:val="center"/>
+          </w:tcPr>
+          <w:p>
+            <w:pPr>
+              <w:spacing w:before="0" w:after="20" w:line="259" w:lineRule="auto"/>
+            </w:pPr>
+            <w:r>
+              <w:rPr>
+                <w:rFonts w:ascii="Microsoft YaHei" w:hAnsi="Microsoft YaHei" w:eastAsia="Microsoft YaHei"/>
+                <w:color w:val="243447"/>
+                <w:sz w:val="17"/>
+              </w:rPr>
+            </w:r>
+            <w:r>
+              <w:rPr>
+                <w:rFonts w:ascii="Microsoft YaHei" w:hAnsi="Microsoft YaHei" w:eastAsia="Microsoft YaHei"/>
+                <w:b w:val="0"/>
+                <w:color w:val="243447"/>
+                <w:sz w:val="17"/>
+              </w:rPr>
+              <w:t>可退数量</w:t>
+            </w:r>
+          </w:p>
+        </w:tc>
+        <w:tc>
+          <w:tcPr>
+            <w:tcW w:type="dxa" w:w="7160"/>
+            <w:tcMar>
+              <w:top w:w="80" w:type="dxa"/>
+              <w:start w:w="120" w:type="dxa"/>
+              <w:bottom w:w="80" w:type="dxa"/>
+              <w:end w:w="120" w:type="dxa"/>
+            </w:tcMar>
+            <w:vAlign w:val="center"/>
+          </w:tcPr>
+          <w:p>
+            <w:pPr>
+              <w:spacing w:before="0" w:after="20" w:line="259" w:lineRule="auto"/>
+            </w:pPr>
+            <w:r>
+              <w:rPr>
+                <w:rFonts w:ascii="Microsoft YaHei" w:hAnsi="Microsoft YaHei" w:eastAsia="Microsoft YaHei"/>
+                <w:color w:val="243447"/>
+                <w:sz w:val="17"/>
+              </w:rPr>
+            </w:r>
+            <w:r>
+              <w:rPr>
+                <w:rFonts w:ascii="Microsoft YaHei" w:hAnsi="Microsoft YaHei" w:eastAsia="Microsoft YaHei"/>
+                <w:b w:val="0"/>
+                <w:color w:val="243447"/>
+                <w:sz w:val="17"/>
+              </w:rPr>
+              <w:t>原订单商品行可退数量＝累计已发货数量－累计有效退货数量。若业务将退款、拒收等状态占用同一数量口径，还需扣减尚未失效的在途占用数量。</w:t>
+            </w:r>
+          </w:p>
+        </w:tc>
+      </w:tr>
+      <w:tr>
+        <w:trPr>
+          <w:cantSplit/>
+        </w:trPr>
+        <w:tc>
+          <w:tcPr>
+            <w:tcW w:type="dxa" w:w="2200"/>
+            <w:tcMar>
+              <w:top w:w="80" w:type="dxa"/>
+              <w:start w:w="120" w:type="dxa"/>
+              <w:bottom w:w="80" w:type="dxa"/>
+              <w:end w:w="120" w:type="dxa"/>
+            </w:tcMar>
+            <w:vAlign w:val="center"/>
+          </w:tcPr>
+          <w:p>
+            <w:pPr>
+              <w:spacing w:before="0" w:after="20" w:line="259" w:lineRule="auto"/>
+            </w:pPr>
+            <w:r>
+              <w:rPr>
+                <w:rFonts w:ascii="Microsoft YaHei" w:hAnsi="Microsoft YaHei" w:eastAsia="Microsoft YaHei"/>
+                <w:color w:val="243447"/>
+                <w:sz w:val="17"/>
+              </w:rPr>
+            </w:r>
+            <w:r>
+              <w:rPr>
+                <w:rFonts w:ascii="Microsoft YaHei" w:hAnsi="Microsoft YaHei" w:eastAsia="Microsoft YaHei"/>
+                <w:b w:val="0"/>
+                <w:color w:val="243447"/>
+                <w:sz w:val="17"/>
+              </w:rPr>
+              <w:t>部分退货</w:t>
+            </w:r>
+          </w:p>
+        </w:tc>
+        <w:tc>
+          <w:tcPr>
+            <w:tcW w:type="dxa" w:w="7160"/>
+            <w:tcMar>
+              <w:top w:w="80" w:type="dxa"/>
+              <w:start w:w="120" w:type="dxa"/>
+              <w:bottom w:w="80" w:type="dxa"/>
+              <w:end w:w="120" w:type="dxa"/>
+            </w:tcMar>
+            <w:vAlign w:val="center"/>
+          </w:tcPr>
+          <w:p>
+            <w:pPr>
+              <w:spacing w:before="0" w:after="20" w:line="259" w:lineRule="auto"/>
+            </w:pPr>
+            <w:r>
+              <w:rPr>
+                <w:rFonts w:ascii="Microsoft YaHei" w:hAnsi="Microsoft YaHei" w:eastAsia="Microsoft YaHei"/>
+                <w:color w:val="243447"/>
+                <w:sz w:val="17"/>
+              </w:rPr>
+            </w:r>
+            <w:r>
+              <w:rPr>
+                <w:rFonts w:ascii="Microsoft YaHei" w:hAnsi="Microsoft YaHei" w:eastAsia="Microsoft YaHei"/>
+                <w:b w:val="0"/>
+                <w:color w:val="243447"/>
+                <w:sz w:val="17"/>
+              </w:rPr>
+              <w:t>一笔售后可关联多个实际发货单商品行，映射数量之和必须等于本次退货数量；允许拆单子单分别退回，但仍归属于同一原订单售后。</w:t>
+            </w:r>
+          </w:p>
+        </w:tc>
+      </w:tr>
+      <w:tr>
+        <w:trPr>
+          <w:cantSplit/>
+        </w:trPr>
+        <w:tc>
+          <w:tcPr>
+            <w:tcW w:type="dxa" w:w="2200"/>
+            <w:tcMar>
+              <w:top w:w="80" w:type="dxa"/>
+              <w:start w:w="120" w:type="dxa"/>
+              <w:bottom w:w="80" w:type="dxa"/>
+              <w:end w:w="120" w:type="dxa"/>
+            </w:tcMar>
+            <w:vAlign w:val="center"/>
+          </w:tcPr>
+          <w:p>
+            <w:pPr>
+              <w:spacing w:before="0" w:after="20" w:line="259" w:lineRule="auto"/>
+            </w:pPr>
+            <w:r>
+              <w:rPr>
+                <w:rFonts w:ascii="Microsoft YaHei" w:hAnsi="Microsoft YaHei" w:eastAsia="Microsoft YaHei"/>
+                <w:color w:val="243447"/>
+                <w:sz w:val="17"/>
+              </w:rPr>
+            </w:r>
+            <w:r>
+              <w:rPr>
+                <w:rFonts w:ascii="Microsoft YaHei" w:hAnsi="Microsoft YaHei" w:eastAsia="Microsoft YaHei"/>
+                <w:b w:val="0"/>
+                <w:color w:val="243447"/>
+                <w:sz w:val="17"/>
+              </w:rPr>
+              <w:t>驳回订单处理</w:t>
+            </w:r>
+          </w:p>
+        </w:tc>
+        <w:tc>
+          <w:tcPr>
+            <w:tcW w:type="dxa" w:w="7160"/>
+            <w:tcMar>
+              <w:top w:w="80" w:type="dxa"/>
+              <w:start w:w="120" w:type="dxa"/>
+              <w:bottom w:w="80" w:type="dxa"/>
+              <w:end w:w="120" w:type="dxa"/>
+            </w:tcMar>
+            <w:vAlign w:val="center"/>
+          </w:tcPr>
+          <w:p>
+            <w:pPr>
+              <w:spacing w:before="0" w:after="20" w:line="259" w:lineRule="auto"/>
+            </w:pPr>
+            <w:r>
+              <w:rPr>
+                <w:rFonts w:ascii="Microsoft YaHei" w:hAnsi="Microsoft YaHei" w:eastAsia="Microsoft YaHei"/>
+                <w:color w:val="243447"/>
+                <w:sz w:val="17"/>
+              </w:rPr>
+            </w:r>
+            <w:r>
+              <w:rPr>
+                <w:rFonts w:ascii="Microsoft YaHei" w:hAnsi="Microsoft YaHei" w:eastAsia="Microsoft YaHei"/>
+                <w:b w:val="0"/>
+                <w:color w:val="243447"/>
+                <w:sz w:val="17"/>
+              </w:rPr>
+              <w:t>旺店通驳回订单提交拆合前必须重新读取最新售后状态和剩余履约数量；全量退款或取消时不再拆合，按取消结果结束当前发货单。</w:t>
+            </w:r>
+          </w:p>
+        </w:tc>
+      </w:tr>
+      <w:tr>
+        <w:trPr>
+          <w:cantSplit/>
+        </w:trPr>
+        <w:tc>
+          <w:tcPr>
+            <w:tcW w:type="dxa" w:w="2200"/>
+            <w:tcMar>
+              <w:top w:w="80" w:type="dxa"/>
+              <w:start w:w="120" w:type="dxa"/>
+              <w:bottom w:w="80" w:type="dxa"/>
+              <w:end w:w="120" w:type="dxa"/>
+            </w:tcMar>
+            <w:vAlign w:val="center"/>
+          </w:tcPr>
+          <w:p>
+            <w:pPr>
+              <w:spacing w:before="0" w:after="20" w:line="259" w:lineRule="auto"/>
+            </w:pPr>
+            <w:r>
+              <w:rPr>
+                <w:rFonts w:ascii="Microsoft YaHei" w:hAnsi="Microsoft YaHei" w:eastAsia="Microsoft YaHei"/>
+                <w:color w:val="243447"/>
+                <w:sz w:val="17"/>
+              </w:rPr>
+            </w:r>
+            <w:r>
+              <w:rPr>
+                <w:rFonts w:ascii="Microsoft YaHei" w:hAnsi="Microsoft YaHei" w:eastAsia="Microsoft YaHei"/>
+                <w:b w:val="0"/>
+                <w:color w:val="243447"/>
+                <w:sz w:val="17"/>
+              </w:rPr>
+              <w:t>并发与幂等</w:t>
+            </w:r>
+          </w:p>
+        </w:tc>
+        <w:tc>
+          <w:tcPr>
+            <w:tcW w:type="dxa" w:w="7160"/>
+            <w:tcMar>
+              <w:top w:w="80" w:type="dxa"/>
+              <w:start w:w="120" w:type="dxa"/>
+              <w:bottom w:w="80" w:type="dxa"/>
+              <w:end w:w="120" w:type="dxa"/>
+            </w:tcMar>
+            <w:vAlign w:val="center"/>
+          </w:tcPr>
+          <w:p>
+            <w:pPr>
+              <w:spacing w:before="0" w:after="20" w:line="259" w:lineRule="auto"/>
+            </w:pPr>
+            <w:r>
+              <w:rPr>
+                <w:rFonts w:ascii="Microsoft YaHei" w:hAnsi="Microsoft YaHei" w:eastAsia="Microsoft YaHei"/>
+                <w:color w:val="243447"/>
+                <w:sz w:val="17"/>
+              </w:rPr>
+            </w:r>
+            <w:r>
+              <w:rPr>
+                <w:rFonts w:ascii="Microsoft YaHei" w:hAnsi="Microsoft YaHei" w:eastAsia="Microsoft YaHei"/>
+                <w:b w:val="0"/>
+                <w:color w:val="243447"/>
+                <w:sz w:val="17"/>
+              </w:rPr>
+              <w:t>拆合提交和退货创建均进行版本及数量复核；重复请求不得重复占用数量，累计退货数量不得超过累计已发货数量。</w:t>
+            </w:r>
+          </w:p>
+        </w:tc>
+      </w:tr>
+      <w:tr>
+        <w:trPr>
+          <w:cantSplit/>
+        </w:trPr>
+        <w:tc>
+          <w:tcPr>
+            <w:tcW w:type="dxa" w:w="2200"/>
+            <w:tcMar>
+              <w:top w:w="80" w:type="dxa"/>
+              <w:start w:w="120" w:type="dxa"/>
+              <w:bottom w:w="80" w:type="dxa"/>
+              <w:end w:w="120" w:type="dxa"/>
+            </w:tcMar>
+            <w:vAlign w:val="center"/>
+          </w:tcPr>
+          <w:p>
+            <w:pPr>
+              <w:spacing w:before="0" w:after="20" w:line="259" w:lineRule="auto"/>
+            </w:pPr>
+            <w:r>
+              <w:rPr>
+                <w:rFonts w:ascii="Microsoft YaHei" w:hAnsi="Microsoft YaHei" w:eastAsia="Microsoft YaHei"/>
+                <w:color w:val="243447"/>
+                <w:sz w:val="17"/>
+              </w:rPr>
+            </w:r>
+            <w:r>
+              <w:rPr>
+                <w:rFonts w:ascii="Microsoft YaHei" w:hAnsi="Microsoft YaHei" w:eastAsia="Microsoft YaHei"/>
+                <w:b w:val="0"/>
+                <w:color w:val="243447"/>
+                <w:sz w:val="17"/>
+              </w:rPr>
+              <w:t>历史保留</w:t>
+            </w:r>
+          </w:p>
+        </w:tc>
+        <w:tc>
+          <w:tcPr>
+            <w:tcW w:type="dxa" w:w="7160"/>
+            <w:tcMar>
+              <w:top w:w="80" w:type="dxa"/>
+              <w:start w:w="120" w:type="dxa"/>
+              <w:bottom w:w="80" w:type="dxa"/>
+              <w:end w:w="120" w:type="dxa"/>
+            </w:tcMar>
+            <w:vAlign w:val="center"/>
+          </w:tcPr>
+          <w:p>
+            <w:pPr>
+              <w:spacing w:before="0" w:after="20" w:line="259" w:lineRule="auto"/>
+            </w:pPr>
+            <w:r>
+              <w:rPr>
+                <w:rFonts w:ascii="Microsoft YaHei" w:hAnsi="Microsoft YaHei" w:eastAsia="Microsoft YaHei"/>
+                <w:color w:val="243447"/>
+                <w:sz w:val="17"/>
+              </w:rPr>
+            </w:r>
+            <w:r>
+              <w:rPr>
+                <w:rFonts w:ascii="Microsoft YaHei" w:hAnsi="Microsoft YaHei" w:eastAsia="Microsoft YaHei"/>
+                <w:b w:val="0"/>
+                <w:color w:val="243447"/>
+                <w:sz w:val="17"/>
+              </w:rPr>
+              <w:t>退货完成不回写或覆盖既有拆合记录；关联单据链需同时展示原订单、拆合批次、实际发货单及退货单。</w:t>
+            </w:r>
+          </w:p>
+        </w:tc>
+      </w:tr>
+    </w:tbl>
+    <w:p>
       <w:r>
         <w:br w:type="page"/>
       </w:r>
@@ -9567,6 +11180,526 @@
                 <w:sz w:val="16"/>
               </w:rPr>
               <w:t>进入技术异常排查，不更新错误订单。</w:t>
+            </w:r>
+          </w:p>
+        </w:tc>
+      </w:tr>
+      <w:tr>
+        <w:trPr>
+          <w:cantSplit/>
+        </w:trPr>
+        <w:tc>
+          <w:tcPr>
+            <w:tcW w:type="dxa" w:w="2750"/>
+            <w:tcMar>
+              <w:top w:w="80" w:type="dxa"/>
+              <w:start w:w="120" w:type="dxa"/>
+              <w:bottom w:w="80" w:type="dxa"/>
+              <w:end w:w="120" w:type="dxa"/>
+            </w:tcMar>
+            <w:vAlign w:val="center"/>
+          </w:tcPr>
+          <w:p>
+            <w:pPr>
+              <w:spacing w:before="0" w:after="20" w:line="259" w:lineRule="auto"/>
+            </w:pPr>
+            <w:r>
+              <w:rPr>
+                <w:rFonts w:ascii="Microsoft YaHei" w:hAnsi="Microsoft YaHei" w:eastAsia="Microsoft YaHei"/>
+                <w:color w:val="243447"/>
+                <w:sz w:val="16"/>
+              </w:rPr>
+            </w:r>
+            <w:r>
+              <w:rPr>
+                <w:rFonts w:ascii="Microsoft YaHei" w:hAnsi="Microsoft YaHei" w:eastAsia="Microsoft YaHei"/>
+                <w:b w:val="0"/>
+                <w:color w:val="243447"/>
+                <w:sz w:val="16"/>
+              </w:rPr>
+              <w:t>拆合编辑期间发生退款或取消</w:t>
+            </w:r>
+          </w:p>
+        </w:tc>
+        <w:tc>
+          <w:tcPr>
+            <w:tcW w:type="dxa" w:w="4350"/>
+            <w:tcMar>
+              <w:top w:w="80" w:type="dxa"/>
+              <w:start w:w="120" w:type="dxa"/>
+              <w:bottom w:w="80" w:type="dxa"/>
+              <w:end w:w="120" w:type="dxa"/>
+            </w:tcMar>
+            <w:vAlign w:val="center"/>
+          </w:tcPr>
+          <w:p>
+            <w:pPr>
+              <w:spacing w:before="0" w:after="20" w:line="259" w:lineRule="auto"/>
+            </w:pPr>
+            <w:r>
+              <w:rPr>
+                <w:rFonts w:ascii="Microsoft YaHei" w:hAnsi="Microsoft YaHei" w:eastAsia="Microsoft YaHei"/>
+                <w:color w:val="243447"/>
+                <w:sz w:val="16"/>
+              </w:rPr>
+            </w:r>
+            <w:r>
+              <w:rPr>
+                <w:rFonts w:ascii="Microsoft YaHei" w:hAnsi="Microsoft YaHei" w:eastAsia="Microsoft YaHei"/>
+                <w:b w:val="0"/>
+                <w:color w:val="243447"/>
+                <w:sz w:val="16"/>
+              </w:rPr>
+              <w:t>提交时重读售后状态和剩余履约数量；发现变化则整单拒绝提交，不沿用旧方案。</w:t>
+            </w:r>
+          </w:p>
+        </w:tc>
+        <w:tc>
+          <w:tcPr>
+            <w:tcW w:type="dxa" w:w="2260"/>
+            <w:tcMar>
+              <w:top w:w="80" w:type="dxa"/>
+              <w:start w:w="120" w:type="dxa"/>
+              <w:bottom w:w="80" w:type="dxa"/>
+              <w:end w:w="120" w:type="dxa"/>
+            </w:tcMar>
+            <w:vAlign w:val="center"/>
+          </w:tcPr>
+          <w:p>
+            <w:pPr>
+              <w:spacing w:before="0" w:after="20" w:line="259" w:lineRule="auto"/>
+            </w:pPr>
+            <w:r>
+              <w:rPr>
+                <w:rFonts w:ascii="Microsoft YaHei" w:hAnsi="Microsoft YaHei" w:eastAsia="Microsoft YaHei"/>
+                <w:color w:val="243447"/>
+                <w:sz w:val="16"/>
+              </w:rPr>
+            </w:r>
+            <w:r>
+              <w:rPr>
+                <w:rFonts w:ascii="Microsoft YaHei" w:hAnsi="Microsoft YaHei" w:eastAsia="Microsoft YaHei"/>
+                <w:b w:val="0"/>
+                <w:color w:val="243447"/>
+                <w:sz w:val="16"/>
+              </w:rPr>
+              <w:t>订单售后数量已变化，请刷新后重新拆合。</w:t>
+            </w:r>
+          </w:p>
+        </w:tc>
+      </w:tr>
+      <w:tr>
+        <w:trPr>
+          <w:cantSplit/>
+        </w:trPr>
+        <w:tc>
+          <w:tcPr>
+            <w:tcW w:type="dxa" w:w="2750"/>
+            <w:tcMar>
+              <w:top w:w="80" w:type="dxa"/>
+              <w:start w:w="120" w:type="dxa"/>
+              <w:bottom w:w="80" w:type="dxa"/>
+              <w:end w:w="120" w:type="dxa"/>
+            </w:tcMar>
+            <w:vAlign w:val="center"/>
+          </w:tcPr>
+          <w:p>
+            <w:pPr>
+              <w:spacing w:before="0" w:after="20" w:line="259" w:lineRule="auto"/>
+            </w:pPr>
+            <w:r>
+              <w:rPr>
+                <w:rFonts w:ascii="Microsoft YaHei" w:hAnsi="Microsoft YaHei" w:eastAsia="Microsoft YaHei"/>
+                <w:color w:val="243447"/>
+                <w:sz w:val="16"/>
+              </w:rPr>
+            </w:r>
+            <w:r>
+              <w:rPr>
+                <w:rFonts w:ascii="Microsoft YaHei" w:hAnsi="Microsoft YaHei" w:eastAsia="Microsoft YaHei"/>
+                <w:b w:val="0"/>
+                <w:color w:val="243447"/>
+                <w:sz w:val="16"/>
+              </w:rPr>
+              <w:t>退货数量超过可退数量</w:t>
+            </w:r>
+          </w:p>
+        </w:tc>
+        <w:tc>
+          <w:tcPr>
+            <w:tcW w:type="dxa" w:w="4350"/>
+            <w:tcMar>
+              <w:top w:w="80" w:type="dxa"/>
+              <w:start w:w="120" w:type="dxa"/>
+              <w:bottom w:w="80" w:type="dxa"/>
+              <w:end w:w="120" w:type="dxa"/>
+            </w:tcMar>
+            <w:vAlign w:val="center"/>
+          </w:tcPr>
+          <w:p>
+            <w:pPr>
+              <w:spacing w:before="0" w:after="20" w:line="259" w:lineRule="auto"/>
+            </w:pPr>
+            <w:r>
+              <w:rPr>
+                <w:rFonts w:ascii="Microsoft YaHei" w:hAnsi="Microsoft YaHei" w:eastAsia="Microsoft YaHei"/>
+                <w:color w:val="243447"/>
+                <w:sz w:val="16"/>
+              </w:rPr>
+            </w:r>
+            <w:r>
+              <w:rPr>
+                <w:rFonts w:ascii="Microsoft YaHei" w:hAnsi="Microsoft YaHei" w:eastAsia="Microsoft YaHei"/>
+                <w:b w:val="0"/>
+                <w:color w:val="243447"/>
+                <w:sz w:val="16"/>
+              </w:rPr>
+              <w:t>按原订单商品行及实际发货明细校验累计数量，阻止创建或确认。</w:t>
+            </w:r>
+          </w:p>
+        </w:tc>
+        <w:tc>
+          <w:tcPr>
+            <w:tcW w:type="dxa" w:w="2260"/>
+            <w:tcMar>
+              <w:top w:w="80" w:type="dxa"/>
+              <w:start w:w="120" w:type="dxa"/>
+              <w:bottom w:w="80" w:type="dxa"/>
+              <w:end w:w="120" w:type="dxa"/>
+            </w:tcMar>
+            <w:vAlign w:val="center"/>
+          </w:tcPr>
+          <w:p>
+            <w:pPr>
+              <w:spacing w:before="0" w:after="20" w:line="259" w:lineRule="auto"/>
+            </w:pPr>
+            <w:r>
+              <w:rPr>
+                <w:rFonts w:ascii="Microsoft YaHei" w:hAnsi="Microsoft YaHei" w:eastAsia="Microsoft YaHei"/>
+                <w:color w:val="243447"/>
+                <w:sz w:val="16"/>
+              </w:rPr>
+            </w:r>
+            <w:r>
+              <w:rPr>
+                <w:rFonts w:ascii="Microsoft YaHei" w:hAnsi="Microsoft YaHei" w:eastAsia="Microsoft YaHei"/>
+                <w:b w:val="0"/>
+                <w:color w:val="243447"/>
+                <w:sz w:val="16"/>
+              </w:rPr>
+              <w:t>可退数量不足，请刷新售后明细。</w:t>
+            </w:r>
+          </w:p>
+        </w:tc>
+      </w:tr>
+      <w:tr>
+        <w:trPr>
+          <w:cantSplit/>
+        </w:trPr>
+        <w:tc>
+          <w:tcPr>
+            <w:tcW w:type="dxa" w:w="2750"/>
+            <w:tcMar>
+              <w:top w:w="80" w:type="dxa"/>
+              <w:start w:w="120" w:type="dxa"/>
+              <w:bottom w:w="80" w:type="dxa"/>
+              <w:end w:w="120" w:type="dxa"/>
+            </w:tcMar>
+            <w:vAlign w:val="center"/>
+          </w:tcPr>
+          <w:p>
+            <w:pPr>
+              <w:spacing w:before="0" w:after="20" w:line="259" w:lineRule="auto"/>
+            </w:pPr>
+            <w:r>
+              <w:rPr>
+                <w:rFonts w:ascii="Microsoft YaHei" w:hAnsi="Microsoft YaHei" w:eastAsia="Microsoft YaHei"/>
+                <w:color w:val="243447"/>
+                <w:sz w:val="16"/>
+              </w:rPr>
+            </w:r>
+            <w:r>
+              <w:rPr>
+                <w:rFonts w:ascii="Microsoft YaHei" w:hAnsi="Microsoft YaHei" w:eastAsia="Microsoft YaHei"/>
+                <w:b w:val="0"/>
+                <w:color w:val="243447"/>
+                <w:sz w:val="16"/>
+              </w:rPr>
+              <w:t>合单内相同SKU来自多个原订单</w:t>
+            </w:r>
+          </w:p>
+        </w:tc>
+        <w:tc>
+          <w:tcPr>
+            <w:tcW w:type="dxa" w:w="4350"/>
+            <w:tcMar>
+              <w:top w:w="80" w:type="dxa"/>
+              <w:start w:w="120" w:type="dxa"/>
+              <w:bottom w:w="80" w:type="dxa"/>
+              <w:end w:w="120" w:type="dxa"/>
+            </w:tcMar>
+            <w:vAlign w:val="center"/>
+          </w:tcPr>
+          <w:p>
+            <w:pPr>
+              <w:spacing w:before="0" w:after="20" w:line="259" w:lineRule="auto"/>
+            </w:pPr>
+            <w:r>
+              <w:rPr>
+                <w:rFonts w:ascii="Microsoft YaHei" w:hAnsi="Microsoft YaHei" w:eastAsia="Microsoft YaHei"/>
+                <w:color w:val="243447"/>
+                <w:sz w:val="16"/>
+              </w:rPr>
+            </w:r>
+            <w:r>
+              <w:rPr>
+                <w:rFonts w:ascii="Microsoft YaHei" w:hAnsi="Microsoft YaHei" w:eastAsia="Microsoft YaHei"/>
+                <w:b w:val="0"/>
+                <w:color w:val="243447"/>
+                <w:sz w:val="16"/>
+              </w:rPr>
+              <w:t>按原订单商品行分别建立退货映射，不使用合并后的汇总数量直接冲减。</w:t>
+            </w:r>
+          </w:p>
+        </w:tc>
+        <w:tc>
+          <w:tcPr>
+            <w:tcW w:type="dxa" w:w="2260"/>
+            <w:tcMar>
+              <w:top w:w="80" w:type="dxa"/>
+              <w:start w:w="120" w:type="dxa"/>
+              <w:bottom w:w="80" w:type="dxa"/>
+              <w:end w:w="120" w:type="dxa"/>
+            </w:tcMar>
+            <w:vAlign w:val="center"/>
+          </w:tcPr>
+          <w:p>
+            <w:pPr>
+              <w:spacing w:before="0" w:after="20" w:line="259" w:lineRule="auto"/>
+            </w:pPr>
+            <w:r>
+              <w:rPr>
+                <w:rFonts w:ascii="Microsoft YaHei" w:hAnsi="Microsoft YaHei" w:eastAsia="Microsoft YaHei"/>
+                <w:color w:val="243447"/>
+                <w:sz w:val="16"/>
+              </w:rPr>
+            </w:r>
+            <w:r>
+              <w:rPr>
+                <w:rFonts w:ascii="Microsoft YaHei" w:hAnsi="Microsoft YaHei" w:eastAsia="Microsoft YaHei"/>
+                <w:b w:val="0"/>
+                <w:color w:val="243447"/>
+                <w:sz w:val="16"/>
+              </w:rPr>
+              <w:t>请选择本次退货所属的原订单明细。</w:t>
+            </w:r>
+          </w:p>
+        </w:tc>
+      </w:tr>
+      <w:tr>
+        <w:trPr>
+          <w:cantSplit/>
+        </w:trPr>
+        <w:tc>
+          <w:tcPr>
+            <w:tcW w:type="dxa" w:w="2750"/>
+            <w:tcMar>
+              <w:top w:w="80" w:type="dxa"/>
+              <w:start w:w="120" w:type="dxa"/>
+              <w:bottom w:w="80" w:type="dxa"/>
+              <w:end w:w="120" w:type="dxa"/>
+            </w:tcMar>
+            <w:vAlign w:val="center"/>
+          </w:tcPr>
+          <w:p>
+            <w:pPr>
+              <w:spacing w:before="0" w:after="20" w:line="259" w:lineRule="auto"/>
+            </w:pPr>
+            <w:r>
+              <w:rPr>
+                <w:rFonts w:ascii="Microsoft YaHei" w:hAnsi="Microsoft YaHei" w:eastAsia="Microsoft YaHei"/>
+                <w:color w:val="243447"/>
+                <w:sz w:val="16"/>
+              </w:rPr>
+            </w:r>
+            <w:r>
+              <w:rPr>
+                <w:rFonts w:ascii="Microsoft YaHei" w:hAnsi="Microsoft YaHei" w:eastAsia="Microsoft YaHei"/>
+                <w:b w:val="0"/>
+                <w:color w:val="243447"/>
+                <w:sz w:val="16"/>
+              </w:rPr>
+              <w:t>拆单商品跨多个子单部分退货</w:t>
+            </w:r>
+          </w:p>
+        </w:tc>
+        <w:tc>
+          <w:tcPr>
+            <w:tcW w:type="dxa" w:w="4350"/>
+            <w:tcMar>
+              <w:top w:w="80" w:type="dxa"/>
+              <w:start w:w="120" w:type="dxa"/>
+              <w:bottom w:w="80" w:type="dxa"/>
+              <w:end w:w="120" w:type="dxa"/>
+            </w:tcMar>
+            <w:vAlign w:val="center"/>
+          </w:tcPr>
+          <w:p>
+            <w:pPr>
+              <w:spacing w:before="0" w:after="20" w:line="259" w:lineRule="auto"/>
+            </w:pPr>
+            <w:r>
+              <w:rPr>
+                <w:rFonts w:ascii="Microsoft YaHei" w:hAnsi="Microsoft YaHei" w:eastAsia="Microsoft YaHei"/>
+                <w:color w:val="243447"/>
+                <w:sz w:val="16"/>
+              </w:rPr>
+            </w:r>
+            <w:r>
+              <w:rPr>
+                <w:rFonts w:ascii="Microsoft YaHei" w:hAnsi="Microsoft YaHei" w:eastAsia="Microsoft YaHei"/>
+                <w:b w:val="0"/>
+                <w:color w:val="243447"/>
+                <w:sz w:val="16"/>
+              </w:rPr>
+              <w:t>允许一笔售后拆成多条实际发货映射；校验映射数量合计。</w:t>
+            </w:r>
+          </w:p>
+        </w:tc>
+        <w:tc>
+          <w:tcPr>
+            <w:tcW w:type="dxa" w:w="2260"/>
+            <w:tcMar>
+              <w:top w:w="80" w:type="dxa"/>
+              <w:start w:w="120" w:type="dxa"/>
+              <w:bottom w:w="80" w:type="dxa"/>
+              <w:end w:w="120" w:type="dxa"/>
+            </w:tcMar>
+            <w:vAlign w:val="center"/>
+          </w:tcPr>
+          <w:p>
+            <w:pPr>
+              <w:spacing w:before="0" w:after="20" w:line="259" w:lineRule="auto"/>
+            </w:pPr>
+            <w:r>
+              <w:rPr>
+                <w:rFonts w:ascii="Microsoft YaHei" w:hAnsi="Microsoft YaHei" w:eastAsia="Microsoft YaHei"/>
+                <w:color w:val="243447"/>
+                <w:sz w:val="16"/>
+              </w:rPr>
+            </w:r>
+            <w:r>
+              <w:rPr>
+                <w:rFonts w:ascii="Microsoft YaHei" w:hAnsi="Microsoft YaHei" w:eastAsia="Microsoft YaHei"/>
+                <w:b w:val="0"/>
+                <w:color w:val="243447"/>
+                <w:sz w:val="16"/>
+              </w:rPr>
+              <w:t>退货数量必须完整分配到实际发货单。</w:t>
+            </w:r>
+          </w:p>
+        </w:tc>
+      </w:tr>
+      <w:tr>
+        <w:trPr>
+          <w:cantSplit/>
+        </w:trPr>
+        <w:tc>
+          <w:tcPr>
+            <w:tcW w:type="dxa" w:w="2750"/>
+            <w:tcMar>
+              <w:top w:w="80" w:type="dxa"/>
+              <w:start w:w="120" w:type="dxa"/>
+              <w:bottom w:w="80" w:type="dxa"/>
+              <w:end w:w="120" w:type="dxa"/>
+            </w:tcMar>
+            <w:vAlign w:val="center"/>
+          </w:tcPr>
+          <w:p>
+            <w:pPr>
+              <w:spacing w:before="0" w:after="20" w:line="259" w:lineRule="auto"/>
+            </w:pPr>
+            <w:r>
+              <w:rPr>
+                <w:rFonts w:ascii="Microsoft YaHei" w:hAnsi="Microsoft YaHei" w:eastAsia="Microsoft YaHei"/>
+                <w:color w:val="243447"/>
+                <w:sz w:val="16"/>
+              </w:rPr>
+            </w:r>
+            <w:r>
+              <w:rPr>
+                <w:rFonts w:ascii="Microsoft YaHei" w:hAnsi="Microsoft YaHei" w:eastAsia="Microsoft YaHei"/>
+                <w:b w:val="0"/>
+                <w:color w:val="243447"/>
+                <w:sz w:val="16"/>
+              </w:rPr>
+              <w:t>发货前商品被全量取消</w:t>
+            </w:r>
+          </w:p>
+        </w:tc>
+        <w:tc>
+          <w:tcPr>
+            <w:tcW w:type="dxa" w:w="4350"/>
+            <w:tcMar>
+              <w:top w:w="80" w:type="dxa"/>
+              <w:start w:w="120" w:type="dxa"/>
+              <w:bottom w:w="80" w:type="dxa"/>
+              <w:end w:w="120" w:type="dxa"/>
+            </w:tcMar>
+            <w:vAlign w:val="center"/>
+          </w:tcPr>
+          <w:p>
+            <w:pPr>
+              <w:spacing w:before="0" w:after="20" w:line="259" w:lineRule="auto"/>
+            </w:pPr>
+            <w:r>
+              <w:rPr>
+                <w:rFonts w:ascii="Microsoft YaHei" w:hAnsi="Microsoft YaHei" w:eastAsia="Microsoft YaHei"/>
+                <w:color w:val="243447"/>
+                <w:sz w:val="16"/>
+              </w:rPr>
+            </w:r>
+            <w:r>
+              <w:rPr>
+                <w:rFonts w:ascii="Microsoft YaHei" w:hAnsi="Microsoft YaHei" w:eastAsia="Microsoft YaHei"/>
+                <w:b w:val="0"/>
+                <w:color w:val="243447"/>
+                <w:sz w:val="16"/>
+              </w:rPr>
+              <w:t>将对应履约数量扣减为0；若发货单无其他商品则置为失效。</w:t>
+            </w:r>
+          </w:p>
+        </w:tc>
+        <w:tc>
+          <w:tcPr>
+            <w:tcW w:type="dxa" w:w="2260"/>
+            <w:tcMar>
+              <w:top w:w="80" w:type="dxa"/>
+              <w:start w:w="120" w:type="dxa"/>
+              <w:bottom w:w="80" w:type="dxa"/>
+              <w:end w:w="120" w:type="dxa"/>
+            </w:tcMar>
+            <w:vAlign w:val="center"/>
+          </w:tcPr>
+          <w:p>
+            <w:pPr>
+              <w:spacing w:before="0" w:after="20" w:line="259" w:lineRule="auto"/>
+            </w:pPr>
+            <w:r>
+              <w:rPr>
+                <w:rFonts w:ascii="Microsoft YaHei" w:hAnsi="Microsoft YaHei" w:eastAsia="Microsoft YaHei"/>
+                <w:color w:val="243447"/>
+                <w:sz w:val="16"/>
+              </w:rPr>
+            </w:r>
+            <w:r>
+              <w:rPr>
+                <w:rFonts w:ascii="Microsoft YaHei" w:hAnsi="Microsoft YaHei" w:eastAsia="Microsoft YaHei"/>
+                <w:b w:val="0"/>
+                <w:color w:val="243447"/>
+                <w:sz w:val="16"/>
+              </w:rPr>
+              <w:t>该发货单已无可履约商品，不能拆合或同步。</w:t>
             </w:r>
           </w:p>
         </w:tc>
@@ -9657,6 +11790,21 @@
     </w:p>
     <w:p>
       <w:pPr>
+        <w:pStyle w:val="ListBullet"/>
+        <w:spacing w:after="80" w:line="280" w:lineRule="auto"/>
+        <w:ind w:left="720" w:hanging="360"/>
+      </w:pPr>
+      <w:r>
+        <w:rPr>
+          <w:rFonts w:ascii="Microsoft YaHei" w:hAnsi="Microsoft YaHei" w:eastAsia="Microsoft YaHei"/>
+          <w:color w:val="243447"/>
+          <w:sz w:val="20"/>
+        </w:rPr>
+        <w:t>售后人员仍从原订单发起退款或退货；页面新增实际发货单关联信息，不改变现有售后归属和财务口径。</w:t>
+      </w:r>
+    </w:p>
+    <w:p>
+      <w:pPr>
         <w:pStyle w:val="Heading2"/>
         <w:keepNext/>
       </w:pPr>
@@ -10070,7 +12218,7 @@
                 <w:color w:val="243447"/>
                 <w:sz w:val="18"/>
               </w:rPr>
-              <w:t>售后/退款</w:t>
+              <w:t>售后/退款/退货</w:t>
             </w:r>
           </w:p>
         </w:tc>
@@ -10103,7 +12251,7 @@
                 <w:color w:val="243447"/>
                 <w:sz w:val="18"/>
               </w:rPr>
-              <w:t>仍以原订单商品行为归属；需通过结果商品来源映射定位。</w:t>
+              <w:t>仍以原订单商品行为业务归属；新增原订单商品行—实际发货单商品行—退货明细的数量映射，并向拆合服务提供售后占用及剩余履约数量。</w:t>
             </w:r>
           </w:p>
         </w:tc>
@@ -11124,7 +13272,7 @@
                 <w:color w:val="243447"/>
                 <w:sz w:val="16"/>
               </w:rPr>
-              <w:t>退款、取消、售后状态联动</w:t>
+              <w:t>退款、取消、退货状态与数量联动</w:t>
             </w:r>
           </w:p>
         </w:tc>
@@ -11157,7 +13305,7 @@
                 <w:color w:val="243447"/>
                 <w:sz w:val="16"/>
               </w:rPr>
-              <w:t>确认参与拆合前的拦截条件，以及售后按原订单回溯方式。</w:t>
+              <w:t>提供原订单商品行的售后占用、累计有效退货和剩余可履约数量；保存售后明细到实际发货单商品行的数量映射。</w:t>
             </w:r>
           </w:p>
         </w:tc>
@@ -11810,7 +13958,22 @@
           <w:color w:val="243447"/>
           <w:sz w:val="20"/>
         </w:rPr>
-        <w:t>订单取消、退款中、部分发货等状态的拆合准入规则。</w:t>
+        <w:t>订单/售后系统的数量占用状态枚举、释放时点，以及退款、取消、拒收是否共用同一可退数量口径。</w:t>
+      </w:r>
+    </w:p>
+    <w:p>
+      <w:pPr>
+        <w:pStyle w:val="ListBullet"/>
+        <w:spacing w:after="80" w:line="280" w:lineRule="auto"/>
+        <w:ind w:left="720" w:hanging="360"/>
+      </w:pPr>
+      <w:r>
+        <w:rPr>
+          <w:rFonts w:ascii="Microsoft YaHei" w:hAnsi="Microsoft YaHei" w:eastAsia="Microsoft YaHei"/>
+          <w:color w:val="243447"/>
+          <w:sz w:val="20"/>
+        </w:rPr>
+        <w:t>一笔售后跨多个实际发货单时，退货单由售后系统统一生成还是按实际发货单拆分生成。</w:t>
       </w:r>
     </w:p>
     <w:p>

</xml_diff>

<commit_message>
Auto sync 2026-09-08 10:21:11
</commit_message>
<xml_diff>
--- a/04-需求管理/PRD-OMS发货单拆单与合单功能-v1.0.docx
+++ b/04-需求管理/PRD-OMS发货单拆单与合单功能-v1.0.docx
@@ -4788,7 +4788,21 @@
         <w:keepNext/>
       </w:pPr>
       <w:r>
-        <w:t>6.3 退货关系流程</w:t>
+        <w:t>6.3 退货业务关系图</w:t>
+      </w:r>
+    </w:p>
+    <w:p>
+      <w:pPr>
+        <w:keepNext w:val="0"/>
+        <w:spacing w:before="0" w:after="100" w:line="264" w:lineRule="auto"/>
+      </w:pPr>
+      <w:r>
+        <w:rPr>
+          <w:rFonts w:ascii="Microsoft YaHei" w:hAnsi="Microsoft YaHei" w:eastAsia="Microsoft YaHei"/>
+          <w:color w:val="667085"/>
+          <w:sz w:val="18"/>
+        </w:rPr>
+        <w:t>本图仅用于PRD评审时说明退货与原订单、实际发货单的业务关系，不作为系统内退款关联页面的展示组件。系统页面直接展示数量摘要和关联明细。</w:t>
       </w:r>
     </w:p>
     <w:p>
@@ -5361,7 +5375,7 @@
                 <w:color w:val="243447"/>
                 <w:sz w:val="18"/>
               </w:rPr>
-              <w:t>从发货单、驳回订单或拆合记录进入；分别演示发货前退款/取消和发货后退货，并通过关系流程图展示原订单商品行、拆合来源映射、实际发货单商品行、退货明细及数量归属。</w:t>
+              <w:t>从发货单、驳回订单或拆合记录进入；分别展示发货前退款/取消和发货后退货。页面不展示流程图，直接使用数量摘要卡片和关联明细表呈现原订单商品行、实际发货单商品行、已退数量及可退数量。</w:t>
             </w:r>
           </w:p>
         </w:tc>
@@ -9332,6 +9346,77 @@
                 <w:sz w:val="17"/>
               </w:rPr>
               <w:t>退货完成不回写或覆盖既有拆合记录；关联单据链需同时展示原订单、拆合批次、实际发货单及退货单。</w:t>
+            </w:r>
+          </w:p>
+        </w:tc>
+      </w:tr>
+      <w:tr>
+        <w:trPr>
+          <w:cantSplit/>
+        </w:trPr>
+        <w:tc>
+          <w:tcPr>
+            <w:tcW w:type="dxa" w:w="2200"/>
+            <w:tcMar>
+              <w:top w:w="80" w:type="dxa"/>
+              <w:start w:w="120" w:type="dxa"/>
+              <w:bottom w:w="80" w:type="dxa"/>
+              <w:end w:w="120" w:type="dxa"/>
+            </w:tcMar>
+            <w:vAlign w:val="center"/>
+          </w:tcPr>
+          <w:p>
+            <w:pPr>
+              <w:spacing w:before="0" w:after="20" w:line="259" w:lineRule="auto"/>
+            </w:pPr>
+            <w:r>
+              <w:rPr>
+                <w:rFonts w:ascii="Microsoft YaHei" w:hAnsi="Microsoft YaHei" w:eastAsia="Microsoft YaHei"/>
+                <w:color w:val="243447"/>
+                <w:sz w:val="17"/>
+              </w:rPr>
+            </w:r>
+            <w:r>
+              <w:rPr>
+                <w:rFonts w:ascii="Microsoft YaHei" w:hAnsi="Microsoft YaHei" w:eastAsia="Microsoft YaHei"/>
+                <w:b w:val="0"/>
+                <w:color w:val="243447"/>
+                <w:sz w:val="17"/>
+              </w:rPr>
+              <w:t>页面展示</w:t>
+            </w:r>
+          </w:p>
+        </w:tc>
+        <w:tc>
+          <w:tcPr>
+            <w:tcW w:type="dxa" w:w="7160"/>
+            <w:tcMar>
+              <w:top w:w="80" w:type="dxa"/>
+              <w:start w:w="120" w:type="dxa"/>
+              <w:bottom w:w="80" w:type="dxa"/>
+              <w:end w:w="120" w:type="dxa"/>
+            </w:tcMar>
+            <w:vAlign w:val="center"/>
+          </w:tcPr>
+          <w:p>
+            <w:pPr>
+              <w:spacing w:before="0" w:after="20" w:line="259" w:lineRule="auto"/>
+            </w:pPr>
+            <w:r>
+              <w:rPr>
+                <w:rFonts w:ascii="Microsoft YaHei" w:hAnsi="Microsoft YaHei" w:eastAsia="Microsoft YaHei"/>
+                <w:color w:val="243447"/>
+                <w:sz w:val="17"/>
+              </w:rPr>
+            </w:r>
+            <w:r>
+              <w:rPr>
+                <w:rFonts w:ascii="Microsoft YaHei" w:hAnsi="Microsoft YaHei" w:eastAsia="Microsoft YaHei"/>
+                <w:b w:val="0"/>
+                <w:color w:val="243447"/>
+                <w:sz w:val="17"/>
+              </w:rPr>
+              <w:t>系统内退款/退货关联页面不展示流程图，直接展示订单与数量摘要、原订单商品行、实际发货单商品行、已发数量、已退数量和可退数量。</w:t>
             </w:r>
           </w:p>
         </w:tc>

</xml_diff>

<commit_message>
Auto sync 2026-09-08 13:37:01
</commit_message>
<xml_diff>
--- a/04-需求管理/PRD-OMS发货单拆单与合单功能-v1.0.docx
+++ b/04-需求管理/PRD-OMS发货单拆单与合单功能-v1.0.docx
@@ -344,7 +344,7 @@
           <w:color w:val="243447"/>
           <w:sz w:val="21"/>
         </w:rPr>
-        <w:t>当前发货单仍绑定原始订单，因此还需补齐退款、取消与退货场景：售后业务归属于原订单商品行，物流履约归属于实际发货单商品行，系统通过数量来源映射同时保留两种关系，避免拆合后退货无法定位或错误冲减其他原订单。</w:t>
+        <w:t>当前退款、退货流程统一通过售后订单发起。售后订单完成后，OMS向旺店通推送1条售后数据。由于发货单可能经历拆单或合单，系统需在售后订单中保留原订单商品行与实际发货单商品行的数量映射，但不得按多个拆单子单或合单来源重复推送多条旺店通数据。</w:t>
       </w:r>
     </w:p>
     <w:p>
@@ -497,7 +497,7 @@
           <w:color w:val="243447"/>
           <w:sz w:val="20"/>
         </w:rPr>
-        <w:t>退货仍从原订单商品行发起，并能定位拆合后的实际发货单及可退数量；发货前退款或取消实时扣减可履约数量。</w:t>
+        <w:t>退款、退货由售后订单发起；售后完成后向旺店通幂等推送1条数据，同时保留原订单与实际发货单的数量映射。</w:t>
       </w:r>
     </w:p>
     <w:p>
@@ -1863,7 +1863,7 @@
                 <w:color w:val="243447"/>
                 <w:sz w:val="17"/>
               </w:rPr>
-              <w:t>退货关联与售后联动</w:t>
+              <w:t>售后订单与旺店通联动</w:t>
             </w:r>
           </w:p>
         </w:tc>
@@ -1896,7 +1896,7 @@
                 <w:color w:val="243447"/>
                 <w:sz w:val="17"/>
               </w:rPr>
-              <w:t>复用现有售后退款模块：售后归属原订单商品行，同时关联实际发货单商品行；拆合前校验退款、取消、退货占用数量。</w:t>
+              <w:t>复用现有售后退款模块：退款、退货由售后订单发起；售后完成后向旺店通推送1条数据，并关联原订单商品行与实际发货单商品行。</w:t>
             </w:r>
           </w:p>
         </w:tc>
@@ -1929,7 +1929,7 @@
                 <w:color w:val="243447"/>
                 <w:sz w:val="17"/>
               </w:rPr>
-              <w:t>发货管理入口 + 售后退款流程</w:t>
+              <w:t>发货管理关联入口 + 售后退款流程</w:t>
             </w:r>
           </w:p>
         </w:tc>
@@ -2993,7 +2993,7 @@
                 <w:color w:val="243447"/>
                 <w:sz w:val="17"/>
               </w:rPr>
-              <w:t>仅对扣除售后占用后的剩余履约数量拆合</w:t>
+              <w:t>通过售后订单发起；处理中占用数量，完成后扣减剩余履约量</w:t>
             </w:r>
           </w:p>
         </w:tc>
@@ -3026,7 +3026,7 @@
                 <w:color w:val="243447"/>
                 <w:sz w:val="17"/>
               </w:rPr>
-              <w:t>发货管理 / 旺店通驳回订单Tab</w:t>
+              <w:t>售后退款模块 / 发货管理售后影响</w:t>
             </w:r>
           </w:p>
         </w:tc>
@@ -3059,7 +3059,7 @@
                 <w:color w:val="243447"/>
                 <w:sz w:val="17"/>
               </w:rPr>
-              <w:t>全量取消时当前发货单失效，不再拆合</w:t>
+              <w:t>售后完成后向旺店通推送1条数据；全量取消时当前发货单失效</w:t>
             </w:r>
           </w:p>
         </w:tc>
@@ -3130,7 +3130,7 @@
                 <w:color w:val="243447"/>
                 <w:sz w:val="17"/>
               </w:rPr>
-              <w:t>从原订单商品行发起退货，并映射实际发货单明细</w:t>
+              <w:t>通过售后订单发起，并映射实际发货单明细</w:t>
             </w:r>
           </w:p>
         </w:tc>
@@ -3196,7 +3196,7 @@
                 <w:color w:val="243447"/>
                 <w:sz w:val="17"/>
               </w:rPr>
-              <w:t>原订单承担售后归属，实际发货单承担退货履约追溯</w:t>
+              <w:t>售后完成后汇总映射并向旺店通推送1条数据</w:t>
             </w:r>
           </w:p>
         </w:tc>
@@ -4338,7 +4338,7 @@
                 <w:color w:val="243447"/>
                 <w:sz w:val="17"/>
               </w:rPr>
-              <w:t>退货关联与售后数量校验</w:t>
+              <w:t>售后订单关联与旺店通推送</w:t>
             </w:r>
           </w:p>
         </w:tc>
@@ -4371,7 +4371,7 @@
                 <w:color w:val="243447"/>
                 <w:sz w:val="17"/>
               </w:rPr>
-              <w:t>保存原订单商品行与实际发货单商品行映射；拆合提交时重新校验退款、取消、退货占用及剩余可履约数量。</w:t>
+              <w:t>保存原订单商品行与实际发货单商品行映射；售后完成后按售后订单维度向旺店通幂等推送1条数据，失败可重试但不得重复建单。</w:t>
             </w:r>
           </w:p>
         </w:tc>
@@ -4788,7 +4788,7 @@
         <w:keepNext/>
       </w:pPr>
       <w:r>
-        <w:t>6.3 退货业务关系图</w:t>
+        <w:t>6.3 售后订单与旺店通推送关系图</w:t>
       </w:r>
     </w:p>
     <w:p>
@@ -4802,7 +4802,7 @@
           <w:color w:val="667085"/>
           <w:sz w:val="18"/>
         </w:rPr>
-        <w:t>本图仅用于PRD评审时说明退货与原订单、实际发货单的业务关系，不作为系统内退款关联页面的展示组件。系统页面直接展示数量摘要和关联明细。</w:t>
+        <w:t>本图仅用于PRD评审时说明售后订单、拆合映射及旺店通推送关系，不作为系统内退款关联页面的展示组件。系统页面直接展示售后订单状态、数量摘要、关联明细和旺店通推送结果。</w:t>
       </w:r>
     </w:p>
     <w:p>
@@ -4810,7 +4810,7 @@
         <w:drawing>
           <wp:inline xmlns:a="http://schemas.openxmlformats.org/drawingml/2006/main" xmlns:pic="http://schemas.openxmlformats.org/drawingml/2006/picture">
             <wp:extent cx="5897880" cy="2817876"/>
-            <wp:docPr id="3" name="Picture 3" title="退货关系流程图" descr="展示发货前退款或取消如何扣减剩余履约数量，以及发货后退货如何从原订单商品行经拆合来源映射定位到实际发货单商品行。"/>
+            <wp:docPr id="3" name="Picture 3" title="售后订单与旺店通推送关系图" descr="展示退款或退货通过售后订单发起，售后完成后向旺店通推送1条数据；拆合后的多个实际发货明细作为同一售后数据的来源映射。"/>
             <wp:cNvGraphicFramePr>
               <a:graphicFrameLocks noChangeAspect="1"/>
             </wp:cNvGraphicFramePr>
@@ -4853,7 +4853,7 @@
           <w:color w:val="667085"/>
           <w:sz w:val="18"/>
         </w:rPr>
-        <w:t>图3  退货与原订单、实际发货单关系流程</w:t>
+        <w:t>图3  售后订单完成后向旺店通推送1条数据</w:t>
       </w:r>
     </w:p>
     <w:p>
@@ -5342,7 +5342,7 @@
                 <w:color w:val="243447"/>
                 <w:sz w:val="18"/>
               </w:rPr>
-              <w:t>退货关联弹窗</w:t>
+              <w:t>售后订单关联弹窗</w:t>
             </w:r>
           </w:p>
         </w:tc>
@@ -5375,7 +5375,7 @@
                 <w:color w:val="243447"/>
                 <w:sz w:val="18"/>
               </w:rPr>
-              <w:t>从发货单、驳回订单或拆合记录进入；分别展示发货前退款/取消和发货后退货。页面不展示流程图，直接使用数量摘要卡片和关联明细表呈现原订单商品行、实际发货单商品行、已退数量及可退数量。</w:t>
+              <w:t>从发货单、驳回订单或拆合记录进入；页面不展示流程图，直接展示售后订单号、售后状态、数量摘要、原订单与实际发货单明细，以及售后完成后的旺店通推送条数、状态、时间和请求号。</w:t>
             </w:r>
           </w:p>
         </w:tc>
@@ -7838,6 +7838,77 @@
                 <w:color w:val="243447"/>
                 <w:sz w:val="18"/>
               </w:rPr>
+              <w:t>售后推送记录</w:t>
+            </w:r>
+          </w:p>
+        </w:tc>
+        <w:tc>
+          <w:tcPr>
+            <w:tcW w:type="dxa" w:w="6960"/>
+            <w:tcMar>
+              <w:top w:w="80" w:type="dxa"/>
+              <w:start w:w="120" w:type="dxa"/>
+              <w:bottom w:w="80" w:type="dxa"/>
+              <w:end w:w="120" w:type="dxa"/>
+            </w:tcMar>
+            <w:vAlign w:val="center"/>
+          </w:tcPr>
+          <w:p>
+            <w:pPr>
+              <w:spacing w:before="0" w:after="20" w:line="259" w:lineRule="auto"/>
+            </w:pPr>
+            <w:r>
+              <w:rPr>
+                <w:rFonts w:ascii="Microsoft YaHei" w:hAnsi="Microsoft YaHei" w:eastAsia="Microsoft YaHei"/>
+                <w:color w:val="243447"/>
+                <w:sz w:val="18"/>
+              </w:rPr>
+            </w:r>
+            <w:r>
+              <w:rPr>
+                <w:rFonts w:ascii="Microsoft YaHei" w:hAnsi="Microsoft YaHei" w:eastAsia="Microsoft YaHei"/>
+                <w:b w:val="0"/>
+                <w:color w:val="243447"/>
+                <w:sz w:val="18"/>
+              </w:rPr>
+              <w:t>按售后订单保存售后完成时间、旺店通推送状态、接口请求号、首次/最近推送时间、重试次数和返回结果；一张售后订单完成只对应1条旺店通售后数据。</w:t>
+            </w:r>
+          </w:p>
+        </w:tc>
+      </w:tr>
+      <w:tr>
+        <w:trPr>
+          <w:cantSplit/>
+        </w:trPr>
+        <w:tc>
+          <w:tcPr>
+            <w:tcW w:type="dxa" w:w="2400"/>
+            <w:tcMar>
+              <w:top w:w="80" w:type="dxa"/>
+              <w:start w:w="120" w:type="dxa"/>
+              <w:bottom w:w="80" w:type="dxa"/>
+              <w:end w:w="120" w:type="dxa"/>
+            </w:tcMar>
+            <w:vAlign w:val="center"/>
+          </w:tcPr>
+          <w:p>
+            <w:pPr>
+              <w:spacing w:before="0" w:after="20" w:line="259" w:lineRule="auto"/>
+            </w:pPr>
+            <w:r>
+              <w:rPr>
+                <w:rFonts w:ascii="Microsoft YaHei" w:hAnsi="Microsoft YaHei" w:eastAsia="Microsoft YaHei"/>
+                <w:color w:val="243447"/>
+                <w:sz w:val="18"/>
+              </w:rPr>
+            </w:r>
+            <w:r>
+              <w:rPr>
+                <w:rFonts w:ascii="Microsoft YaHei" w:hAnsi="Microsoft YaHei" w:eastAsia="Microsoft YaHei"/>
+                <w:b w:val="0"/>
+                <w:color w:val="243447"/>
+                <w:sz w:val="18"/>
+              </w:rPr>
               <w:t>审计信息</w:t>
             </w:r>
           </w:p>
@@ -8744,7 +8815,7 @@
                 <w:color w:val="243447"/>
                 <w:sz w:val="17"/>
               </w:rPr>
-              <w:t>发货前退款/取消</w:t>
+              <w:t>售后发起入口</w:t>
             </w:r>
           </w:p>
         </w:tc>
@@ -8777,7 +8848,7 @@
                 <w:color w:val="243447"/>
                 <w:sz w:val="17"/>
               </w:rPr>
-              <w:t>退款或取消成功后先扣减剩余履约数量，拆单、合单与同步旺店通只处理剩余数量；某发货单剩余数量为0时，该发货单失效且不可继续拆合或同步。</w:t>
+              <w:t>退款、取消与退货均通过售后订单发起，不允许直接从发货单生成旺店通退款/退货数据。发货管理中的入口仅用于查看关联和跳转售后订单。</w:t>
             </w:r>
           </w:p>
         </w:tc>
@@ -8815,7 +8886,7 @@
                 <w:color w:val="243447"/>
                 <w:sz w:val="17"/>
               </w:rPr>
-              <w:t>拆单后退货</w:t>
+              <w:t>推送触发点</w:t>
             </w:r>
           </w:p>
         </w:tc>
@@ -8848,7 +8919,7 @@
                 <w:color w:val="243447"/>
                 <w:sz w:val="17"/>
               </w:rPr>
-              <w:t>一个原订单商品行可能分布在多个拆单子发货单。退货从原订单商品行发起后，应按实际发货明细选择或分配到一个或多个子发货单。</w:t>
+              <w:t>只有售后订单进入业务定义的“已完成”状态后，才自动触发旺店通推送；申请中、审核中或处理中均不推送。</w:t>
             </w:r>
           </w:p>
         </w:tc>
@@ -8886,7 +8957,7 @@
                 <w:color w:val="243447"/>
                 <w:sz w:val="17"/>
               </w:rPr>
-              <w:t>合单后退货</w:t>
+              <w:t>单条推送原则</w:t>
             </w:r>
           </w:p>
         </w:tc>
@@ -8919,7 +8990,7 @@
                 <w:color w:val="243447"/>
                 <w:sz w:val="17"/>
               </w:rPr>
-              <w:t>一个合并发货单可能包含多个原订单。退货必须先确定原订单商品行，再定位合并发货单中的来源数量；不得以合并发货单为共同归属冲减其他原订单。</w:t>
+              <w:t>一张售后订单完成只向旺店通推送1条售后数据。即使一张售后订单关联多个拆单子发货单、多个合单来源或多条实际发货明细，也不得按映射数量拆成多条推送。</w:t>
             </w:r>
           </w:p>
         </w:tc>
@@ -8957,7 +9028,7 @@
                 <w:color w:val="243447"/>
                 <w:sz w:val="17"/>
               </w:rPr>
-              <w:t>相同SKU</w:t>
+              <w:t>发货前退款/取消</w:t>
             </w:r>
           </w:p>
         </w:tc>
@@ -8990,7 +9061,7 @@
                 <w:color w:val="243447"/>
                 <w:sz w:val="17"/>
               </w:rPr>
-              <w:t>多个原订单的相同SKU可在发货展示中汇总，但后台按原订单商品行分别保存来源数量；退货时按原订单来源分别计算，不允许跨来源共用可退数量。</w:t>
+              <w:t>售后处理中先占用对应商品数量；售后完成后扣减剩余履约数量，并推送1条旺店通数据。某发货单剩余数量为0时，该发货单失效且不可继续拆合或同步。</w:t>
             </w:r>
           </w:p>
         </w:tc>
@@ -9028,7 +9099,7 @@
                 <w:color w:val="243447"/>
                 <w:sz w:val="17"/>
               </w:rPr>
-              <w:t>可退数量</w:t>
+              <w:t>拆单后退货</w:t>
             </w:r>
           </w:p>
         </w:tc>
@@ -9061,7 +9132,7 @@
                 <w:color w:val="243447"/>
                 <w:sz w:val="17"/>
               </w:rPr>
-              <w:t>原订单商品行可退数量＝累计已发货数量－累计有效退货数量。若业务将退款、拒收等状态占用同一数量口径，还需扣减尚未失效的在途占用数量。</w:t>
+              <w:t>一个原订单商品行可能分布在多个拆单子发货单。售后订单保存每个实际发货明细的映射数量；售后完成时汇总为1条旺店通售后数据。</w:t>
             </w:r>
           </w:p>
         </w:tc>
@@ -9099,7 +9170,7 @@
                 <w:color w:val="243447"/>
                 <w:sz w:val="17"/>
               </w:rPr>
-              <w:t>部分退货</w:t>
+              <w:t>合单后退货</w:t>
             </w:r>
           </w:p>
         </w:tc>
@@ -9132,7 +9203,7 @@
                 <w:color w:val="243447"/>
                 <w:sz w:val="17"/>
               </w:rPr>
-              <w:t>一笔售后可关联多个实际发货单商品行，映射数量之和必须等于本次退货数量；允许拆单子单分别退回，但仍归属于同一原订单售后。</w:t>
+              <w:t>一个合并发货单可能包含多个原订单。售后订单先确定原订单商品行，再定位合并发货单中的来源数量；完成后仍只推送1条数据，不得冲减其他原订单。</w:t>
             </w:r>
           </w:p>
         </w:tc>
@@ -9170,7 +9241,7 @@
                 <w:color w:val="243447"/>
                 <w:sz w:val="17"/>
               </w:rPr>
-              <w:t>驳回订单处理</w:t>
+              <w:t>相同SKU</w:t>
             </w:r>
           </w:p>
         </w:tc>
@@ -9203,7 +9274,7 @@
                 <w:color w:val="243447"/>
                 <w:sz w:val="17"/>
               </w:rPr>
-              <w:t>旺店通驳回订单提交拆合前必须重新读取最新售后状态和剩余履约数量；全量退款或取消时不再拆合，按取消结果结束当前发货单。</w:t>
+              <w:t>多个原订单的相同SKU可在发货展示中汇总，但后台按原订单商品行分别保存来源数量；退货时按原订单来源分别计算，不允许跨来源共用可退数量。</w:t>
             </w:r>
           </w:p>
         </w:tc>
@@ -9241,7 +9312,7 @@
                 <w:color w:val="243447"/>
                 <w:sz w:val="17"/>
               </w:rPr>
-              <w:t>并发与幂等</w:t>
+              <w:t>可退数量</w:t>
             </w:r>
           </w:p>
         </w:tc>
@@ -9274,7 +9345,7 @@
                 <w:color w:val="243447"/>
                 <w:sz w:val="17"/>
               </w:rPr>
-              <w:t>拆合提交和退货创建均进行版本及数量复核；重复请求不得重复占用数量，累计退货数量不得超过累计已发货数量。</w:t>
+              <w:t>原订单商品行可退数量＝累计已发货数量－累计有效退货数量。若业务将退款、拒收等状态占用同一数量口径，还需扣减尚未失效的在途占用数量。</w:t>
             </w:r>
           </w:p>
         </w:tc>
@@ -9312,7 +9383,7 @@
                 <w:color w:val="243447"/>
                 <w:sz w:val="17"/>
               </w:rPr>
-              <w:t>历史保留</w:t>
+              <w:t>部分退货</w:t>
             </w:r>
           </w:p>
         </w:tc>
@@ -9345,7 +9416,7 @@
                 <w:color w:val="243447"/>
                 <w:sz w:val="17"/>
               </w:rPr>
-              <w:t>退货完成不回写或覆盖既有拆合记录；关联单据链需同时展示原订单、拆合批次、实际发货单及退货单。</w:t>
+              <w:t>一张售后订单可关联多个实际发货单商品行，映射数量之和必须等于本次退货数量；映射用于内部追溯，不增加旺店通推送条数。</w:t>
             </w:r>
           </w:p>
         </w:tc>
@@ -9383,7 +9454,7 @@
                 <w:color w:val="243447"/>
                 <w:sz w:val="17"/>
               </w:rPr>
-              <w:t>页面展示</w:t>
+              <w:t>驳回订单处理</w:t>
             </w:r>
           </w:p>
         </w:tc>
@@ -9416,7 +9487,291 @@
                 <w:color w:val="243447"/>
                 <w:sz w:val="17"/>
               </w:rPr>
-              <w:t>系统内退款/退货关联页面不展示流程图，直接展示订单与数量摘要、原订单商品行、实际发货单商品行、已发数量、已退数量和可退数量。</w:t>
+              <w:t>旺店通驳回订单提交拆合前必须重新读取最新售后状态和剩余履约数量；全量退款或取消时不再拆合，按取消结果结束当前发货单。</w:t>
+            </w:r>
+          </w:p>
+        </w:tc>
+      </w:tr>
+      <w:tr>
+        <w:trPr>
+          <w:cantSplit/>
+        </w:trPr>
+        <w:tc>
+          <w:tcPr>
+            <w:tcW w:type="dxa" w:w="2200"/>
+            <w:tcMar>
+              <w:top w:w="80" w:type="dxa"/>
+              <w:start w:w="120" w:type="dxa"/>
+              <w:bottom w:w="80" w:type="dxa"/>
+              <w:end w:w="120" w:type="dxa"/>
+            </w:tcMar>
+            <w:vAlign w:val="center"/>
+          </w:tcPr>
+          <w:p>
+            <w:pPr>
+              <w:spacing w:before="0" w:after="20" w:line="259" w:lineRule="auto"/>
+            </w:pPr>
+            <w:r>
+              <w:rPr>
+                <w:rFonts w:ascii="Microsoft YaHei" w:hAnsi="Microsoft YaHei" w:eastAsia="Microsoft YaHei"/>
+                <w:color w:val="243447"/>
+                <w:sz w:val="17"/>
+              </w:rPr>
+            </w:r>
+            <w:r>
+              <w:rPr>
+                <w:rFonts w:ascii="Microsoft YaHei" w:hAnsi="Microsoft YaHei" w:eastAsia="Microsoft YaHei"/>
+                <w:b w:val="0"/>
+                <w:color w:val="243447"/>
+                <w:sz w:val="17"/>
+              </w:rPr>
+              <w:t>推送幂等</w:t>
+            </w:r>
+          </w:p>
+        </w:tc>
+        <w:tc>
+          <w:tcPr>
+            <w:tcW w:type="dxa" w:w="7160"/>
+            <w:tcMar>
+              <w:top w:w="80" w:type="dxa"/>
+              <w:start w:w="120" w:type="dxa"/>
+              <w:bottom w:w="80" w:type="dxa"/>
+              <w:end w:w="120" w:type="dxa"/>
+            </w:tcMar>
+            <w:vAlign w:val="center"/>
+          </w:tcPr>
+          <w:p>
+            <w:pPr>
+              <w:spacing w:before="0" w:after="20" w:line="259" w:lineRule="auto"/>
+            </w:pPr>
+            <w:r>
+              <w:rPr>
+                <w:rFonts w:ascii="Microsoft YaHei" w:hAnsi="Microsoft YaHei" w:eastAsia="Microsoft YaHei"/>
+                <w:color w:val="243447"/>
+                <w:sz w:val="17"/>
+              </w:rPr>
+            </w:r>
+            <w:r>
+              <w:rPr>
+                <w:rFonts w:ascii="Microsoft YaHei" w:hAnsi="Microsoft YaHei" w:eastAsia="Microsoft YaHei"/>
+                <w:b w:val="0"/>
+                <w:color w:val="243447"/>
+                <w:sz w:val="17"/>
+              </w:rPr>
+              <w:t>以售后订单唯一ID和完成版本生成稳定业务幂等键。售后完成事件重复触发或接口超时重试时，返回原推送结果，不得在旺店通重复生成售后数据。</w:t>
+            </w:r>
+          </w:p>
+        </w:tc>
+      </w:tr>
+      <w:tr>
+        <w:trPr>
+          <w:cantSplit/>
+        </w:trPr>
+        <w:tc>
+          <w:tcPr>
+            <w:tcW w:type="dxa" w:w="2200"/>
+            <w:tcMar>
+              <w:top w:w="80" w:type="dxa"/>
+              <w:start w:w="120" w:type="dxa"/>
+              <w:bottom w:w="80" w:type="dxa"/>
+              <w:end w:w="120" w:type="dxa"/>
+            </w:tcMar>
+            <w:vAlign w:val="center"/>
+          </w:tcPr>
+          <w:p>
+            <w:pPr>
+              <w:spacing w:before="0" w:after="20" w:line="259" w:lineRule="auto"/>
+            </w:pPr>
+            <w:r>
+              <w:rPr>
+                <w:rFonts w:ascii="Microsoft YaHei" w:hAnsi="Microsoft YaHei" w:eastAsia="Microsoft YaHei"/>
+                <w:color w:val="243447"/>
+                <w:sz w:val="17"/>
+              </w:rPr>
+            </w:r>
+            <w:r>
+              <w:rPr>
+                <w:rFonts w:ascii="Microsoft YaHei" w:hAnsi="Microsoft YaHei" w:eastAsia="Microsoft YaHei"/>
+                <w:b w:val="0"/>
+                <w:color w:val="243447"/>
+                <w:sz w:val="17"/>
+              </w:rPr>
+              <w:t>推送失败</w:t>
+            </w:r>
+          </w:p>
+        </w:tc>
+        <w:tc>
+          <w:tcPr>
+            <w:tcW w:type="dxa" w:w="7160"/>
+            <w:tcMar>
+              <w:top w:w="80" w:type="dxa"/>
+              <w:start w:w="120" w:type="dxa"/>
+              <w:bottom w:w="80" w:type="dxa"/>
+              <w:end w:w="120" w:type="dxa"/>
+            </w:tcMar>
+            <w:vAlign w:val="center"/>
+          </w:tcPr>
+          <w:p>
+            <w:pPr>
+              <w:spacing w:before="0" w:after="20" w:line="259" w:lineRule="auto"/>
+            </w:pPr>
+            <w:r>
+              <w:rPr>
+                <w:rFonts w:ascii="Microsoft YaHei" w:hAnsi="Microsoft YaHei" w:eastAsia="Microsoft YaHei"/>
+                <w:color w:val="243447"/>
+                <w:sz w:val="17"/>
+              </w:rPr>
+            </w:r>
+            <w:r>
+              <w:rPr>
+                <w:rFonts w:ascii="Microsoft YaHei" w:hAnsi="Microsoft YaHei" w:eastAsia="Microsoft YaHei"/>
+                <w:b w:val="0"/>
+                <w:color w:val="243447"/>
+                <w:sz w:val="17"/>
+              </w:rPr>
+              <w:t>售后完成与旺店通推送结果分开记录。推送失败不回退本地已完成售后状态，系统保留失败原因并支持自动或人工重试。</w:t>
+            </w:r>
+          </w:p>
+        </w:tc>
+      </w:tr>
+      <w:tr>
+        <w:trPr>
+          <w:cantSplit/>
+        </w:trPr>
+        <w:tc>
+          <w:tcPr>
+            <w:tcW w:type="dxa" w:w="2200"/>
+            <w:tcMar>
+              <w:top w:w="80" w:type="dxa"/>
+              <w:start w:w="120" w:type="dxa"/>
+              <w:bottom w:w="80" w:type="dxa"/>
+              <w:end w:w="120" w:type="dxa"/>
+            </w:tcMar>
+            <w:vAlign w:val="center"/>
+          </w:tcPr>
+          <w:p>
+            <w:pPr>
+              <w:spacing w:before="0" w:after="20" w:line="259" w:lineRule="auto"/>
+            </w:pPr>
+            <w:r>
+              <w:rPr>
+                <w:rFonts w:ascii="Microsoft YaHei" w:hAnsi="Microsoft YaHei" w:eastAsia="Microsoft YaHei"/>
+                <w:color w:val="243447"/>
+                <w:sz w:val="17"/>
+              </w:rPr>
+            </w:r>
+            <w:r>
+              <w:rPr>
+                <w:rFonts w:ascii="Microsoft YaHei" w:hAnsi="Microsoft YaHei" w:eastAsia="Microsoft YaHei"/>
+                <w:b w:val="0"/>
+                <w:color w:val="243447"/>
+                <w:sz w:val="17"/>
+              </w:rPr>
+              <w:t>历史保留</w:t>
+            </w:r>
+          </w:p>
+        </w:tc>
+        <w:tc>
+          <w:tcPr>
+            <w:tcW w:type="dxa" w:w="7160"/>
+            <w:tcMar>
+              <w:top w:w="80" w:type="dxa"/>
+              <w:start w:w="120" w:type="dxa"/>
+              <w:bottom w:w="80" w:type="dxa"/>
+              <w:end w:w="120" w:type="dxa"/>
+            </w:tcMar>
+            <w:vAlign w:val="center"/>
+          </w:tcPr>
+          <w:p>
+            <w:pPr>
+              <w:spacing w:before="0" w:after="20" w:line="259" w:lineRule="auto"/>
+            </w:pPr>
+            <w:r>
+              <w:rPr>
+                <w:rFonts w:ascii="Microsoft YaHei" w:hAnsi="Microsoft YaHei" w:eastAsia="Microsoft YaHei"/>
+                <w:color w:val="243447"/>
+                <w:sz w:val="17"/>
+              </w:rPr>
+            </w:r>
+            <w:r>
+              <w:rPr>
+                <w:rFonts w:ascii="Microsoft YaHei" w:hAnsi="Microsoft YaHei" w:eastAsia="Microsoft YaHei"/>
+                <w:b w:val="0"/>
+                <w:color w:val="243447"/>
+                <w:sz w:val="17"/>
+              </w:rPr>
+              <w:t>退货完成不回写或覆盖既有拆合记录；关联单据链需同时展示原订单、拆合批次、实际发货单及退货单。</w:t>
+            </w:r>
+          </w:p>
+        </w:tc>
+      </w:tr>
+      <w:tr>
+        <w:trPr>
+          <w:cantSplit/>
+        </w:trPr>
+        <w:tc>
+          <w:tcPr>
+            <w:tcW w:type="dxa" w:w="2200"/>
+            <w:tcMar>
+              <w:top w:w="80" w:type="dxa"/>
+              <w:start w:w="120" w:type="dxa"/>
+              <w:bottom w:w="80" w:type="dxa"/>
+              <w:end w:w="120" w:type="dxa"/>
+            </w:tcMar>
+            <w:vAlign w:val="center"/>
+          </w:tcPr>
+          <w:p>
+            <w:pPr>
+              <w:spacing w:before="0" w:after="20" w:line="259" w:lineRule="auto"/>
+            </w:pPr>
+            <w:r>
+              <w:rPr>
+                <w:rFonts w:ascii="Microsoft YaHei" w:hAnsi="Microsoft YaHei" w:eastAsia="Microsoft YaHei"/>
+                <w:color w:val="243447"/>
+                <w:sz w:val="17"/>
+              </w:rPr>
+            </w:r>
+            <w:r>
+              <w:rPr>
+                <w:rFonts w:ascii="Microsoft YaHei" w:hAnsi="Microsoft YaHei" w:eastAsia="Microsoft YaHei"/>
+                <w:b w:val="0"/>
+                <w:color w:val="243447"/>
+                <w:sz w:val="17"/>
+              </w:rPr>
+              <w:t>页面展示</w:t>
+            </w:r>
+          </w:p>
+        </w:tc>
+        <w:tc>
+          <w:tcPr>
+            <w:tcW w:type="dxa" w:w="7160"/>
+            <w:tcMar>
+              <w:top w:w="80" w:type="dxa"/>
+              <w:start w:w="120" w:type="dxa"/>
+              <w:bottom w:w="80" w:type="dxa"/>
+              <w:end w:w="120" w:type="dxa"/>
+            </w:tcMar>
+            <w:vAlign w:val="center"/>
+          </w:tcPr>
+          <w:p>
+            <w:pPr>
+              <w:spacing w:before="0" w:after="20" w:line="259" w:lineRule="auto"/>
+            </w:pPr>
+            <w:r>
+              <w:rPr>
+                <w:rFonts w:ascii="Microsoft YaHei" w:hAnsi="Microsoft YaHei" w:eastAsia="Microsoft YaHei"/>
+                <w:color w:val="243447"/>
+                <w:sz w:val="17"/>
+              </w:rPr>
+            </w:r>
+            <w:r>
+              <w:rPr>
+                <w:rFonts w:ascii="Microsoft YaHei" w:hAnsi="Microsoft YaHei" w:eastAsia="Microsoft YaHei"/>
+                <w:b w:val="0"/>
+                <w:color w:val="243447"/>
+                <w:sz w:val="17"/>
+              </w:rPr>
+              <w:t>系统内售后订单关联页面不展示流程图，直接展示售后订单状态、原订单与实际发货单明细、已发/已退/可退数量，以及旺店通推送条数、状态、时间和请求号。</w:t>
             </w:r>
           </w:p>
         </w:tc>
@@ -11845,6 +12200,526 @@
                 <w:sz w:val="16"/>
               </w:rPr>
               <w:t>该发货单已无可履约商品，不能拆合或同步。</w:t>
+            </w:r>
+          </w:p>
+        </w:tc>
+      </w:tr>
+      <w:tr>
+        <w:trPr>
+          <w:cantSplit/>
+        </w:trPr>
+        <w:tc>
+          <w:tcPr>
+            <w:tcW w:type="dxa" w:w="2750"/>
+            <w:tcMar>
+              <w:top w:w="80" w:type="dxa"/>
+              <w:start w:w="120" w:type="dxa"/>
+              <w:bottom w:w="80" w:type="dxa"/>
+              <w:end w:w="120" w:type="dxa"/>
+            </w:tcMar>
+            <w:vAlign w:val="center"/>
+          </w:tcPr>
+          <w:p>
+            <w:pPr>
+              <w:spacing w:before="0" w:after="20" w:line="259" w:lineRule="auto"/>
+            </w:pPr>
+            <w:r>
+              <w:rPr>
+                <w:rFonts w:ascii="Microsoft YaHei" w:hAnsi="Microsoft YaHei" w:eastAsia="Microsoft YaHei"/>
+                <w:color w:val="243447"/>
+                <w:sz w:val="16"/>
+              </w:rPr>
+            </w:r>
+            <w:r>
+              <w:rPr>
+                <w:rFonts w:ascii="Microsoft YaHei" w:hAnsi="Microsoft YaHei" w:eastAsia="Microsoft YaHei"/>
+                <w:b w:val="0"/>
+                <w:color w:val="243447"/>
+                <w:sz w:val="16"/>
+              </w:rPr>
+              <w:t>售后完成事件重复触发</w:t>
+            </w:r>
+          </w:p>
+        </w:tc>
+        <w:tc>
+          <w:tcPr>
+            <w:tcW w:type="dxa" w:w="4350"/>
+            <w:tcMar>
+              <w:top w:w="80" w:type="dxa"/>
+              <w:start w:w="120" w:type="dxa"/>
+              <w:bottom w:w="80" w:type="dxa"/>
+              <w:end w:w="120" w:type="dxa"/>
+            </w:tcMar>
+            <w:vAlign w:val="center"/>
+          </w:tcPr>
+          <w:p>
+            <w:pPr>
+              <w:spacing w:before="0" w:after="20" w:line="259" w:lineRule="auto"/>
+            </w:pPr>
+            <w:r>
+              <w:rPr>
+                <w:rFonts w:ascii="Microsoft YaHei" w:hAnsi="Microsoft YaHei" w:eastAsia="Microsoft YaHei"/>
+                <w:color w:val="243447"/>
+                <w:sz w:val="16"/>
+              </w:rPr>
+            </w:r>
+            <w:r>
+              <w:rPr>
+                <w:rFonts w:ascii="Microsoft YaHei" w:hAnsi="Microsoft YaHei" w:eastAsia="Microsoft YaHei"/>
+                <w:b w:val="0"/>
+                <w:color w:val="243447"/>
+                <w:sz w:val="16"/>
+              </w:rPr>
+              <w:t>按售后订单唯一ID和完成版本进行幂等校验，复用首次推送结果。</w:t>
+            </w:r>
+          </w:p>
+        </w:tc>
+        <w:tc>
+          <w:tcPr>
+            <w:tcW w:type="dxa" w:w="2260"/>
+            <w:tcMar>
+              <w:top w:w="80" w:type="dxa"/>
+              <w:start w:w="120" w:type="dxa"/>
+              <w:bottom w:w="80" w:type="dxa"/>
+              <w:end w:w="120" w:type="dxa"/>
+            </w:tcMar>
+            <w:vAlign w:val="center"/>
+          </w:tcPr>
+          <w:p>
+            <w:pPr>
+              <w:spacing w:before="0" w:after="20" w:line="259" w:lineRule="auto"/>
+            </w:pPr>
+            <w:r>
+              <w:rPr>
+                <w:rFonts w:ascii="Microsoft YaHei" w:hAnsi="Microsoft YaHei" w:eastAsia="Microsoft YaHei"/>
+                <w:color w:val="243447"/>
+                <w:sz w:val="16"/>
+              </w:rPr>
+            </w:r>
+            <w:r>
+              <w:rPr>
+                <w:rFonts w:ascii="Microsoft YaHei" w:hAnsi="Microsoft YaHei" w:eastAsia="Microsoft YaHei"/>
+                <w:b w:val="0"/>
+                <w:color w:val="243447"/>
+                <w:sz w:val="16"/>
+              </w:rPr>
+              <w:t>不重复向旺店通生成售后数据。</w:t>
+            </w:r>
+          </w:p>
+        </w:tc>
+      </w:tr>
+      <w:tr>
+        <w:trPr>
+          <w:cantSplit/>
+        </w:trPr>
+        <w:tc>
+          <w:tcPr>
+            <w:tcW w:type="dxa" w:w="2750"/>
+            <w:tcMar>
+              <w:top w:w="80" w:type="dxa"/>
+              <w:start w:w="120" w:type="dxa"/>
+              <w:bottom w:w="80" w:type="dxa"/>
+              <w:end w:w="120" w:type="dxa"/>
+            </w:tcMar>
+            <w:vAlign w:val="center"/>
+          </w:tcPr>
+          <w:p>
+            <w:pPr>
+              <w:spacing w:before="0" w:after="20" w:line="259" w:lineRule="auto"/>
+            </w:pPr>
+            <w:r>
+              <w:rPr>
+                <w:rFonts w:ascii="Microsoft YaHei" w:hAnsi="Microsoft YaHei" w:eastAsia="Microsoft YaHei"/>
+                <w:color w:val="243447"/>
+                <w:sz w:val="16"/>
+              </w:rPr>
+            </w:r>
+            <w:r>
+              <w:rPr>
+                <w:rFonts w:ascii="Microsoft YaHei" w:hAnsi="Microsoft YaHei" w:eastAsia="Microsoft YaHei"/>
+                <w:b w:val="0"/>
+                <w:color w:val="243447"/>
+                <w:sz w:val="16"/>
+              </w:rPr>
+              <w:t>售后完成后旺店通推送失败</w:t>
+            </w:r>
+          </w:p>
+        </w:tc>
+        <w:tc>
+          <w:tcPr>
+            <w:tcW w:type="dxa" w:w="4350"/>
+            <w:tcMar>
+              <w:top w:w="80" w:type="dxa"/>
+              <w:start w:w="120" w:type="dxa"/>
+              <w:bottom w:w="80" w:type="dxa"/>
+              <w:end w:w="120" w:type="dxa"/>
+            </w:tcMar>
+            <w:vAlign w:val="center"/>
+          </w:tcPr>
+          <w:p>
+            <w:pPr>
+              <w:spacing w:before="0" w:after="20" w:line="259" w:lineRule="auto"/>
+            </w:pPr>
+            <w:r>
+              <w:rPr>
+                <w:rFonts w:ascii="Microsoft YaHei" w:hAnsi="Microsoft YaHei" w:eastAsia="Microsoft YaHei"/>
+                <w:color w:val="243447"/>
+                <w:sz w:val="16"/>
+              </w:rPr>
+            </w:r>
+            <w:r>
+              <w:rPr>
+                <w:rFonts w:ascii="Microsoft YaHei" w:hAnsi="Microsoft YaHei" w:eastAsia="Microsoft YaHei"/>
+                <w:b w:val="0"/>
+                <w:color w:val="243447"/>
+                <w:sz w:val="16"/>
+              </w:rPr>
+              <w:t>保留售后已完成状态，记录请求参数、失败原因和重试次数；进入自动或人工重试。</w:t>
+            </w:r>
+          </w:p>
+        </w:tc>
+        <w:tc>
+          <w:tcPr>
+            <w:tcW w:type="dxa" w:w="2260"/>
+            <w:tcMar>
+              <w:top w:w="80" w:type="dxa"/>
+              <w:start w:w="120" w:type="dxa"/>
+              <w:bottom w:w="80" w:type="dxa"/>
+              <w:end w:w="120" w:type="dxa"/>
+            </w:tcMar>
+            <w:vAlign w:val="center"/>
+          </w:tcPr>
+          <w:p>
+            <w:pPr>
+              <w:spacing w:before="0" w:after="20" w:line="259" w:lineRule="auto"/>
+            </w:pPr>
+            <w:r>
+              <w:rPr>
+                <w:rFonts w:ascii="Microsoft YaHei" w:hAnsi="Microsoft YaHei" w:eastAsia="Microsoft YaHei"/>
+                <w:color w:val="243447"/>
+                <w:sz w:val="16"/>
+              </w:rPr>
+            </w:r>
+            <w:r>
+              <w:rPr>
+                <w:rFonts w:ascii="Microsoft YaHei" w:hAnsi="Microsoft YaHei" w:eastAsia="Microsoft YaHei"/>
+                <w:b w:val="0"/>
+                <w:color w:val="243447"/>
+                <w:sz w:val="16"/>
+              </w:rPr>
+              <w:t>旺店通推送失败，可重新推送。</w:t>
+            </w:r>
+          </w:p>
+        </w:tc>
+      </w:tr>
+      <w:tr>
+        <w:trPr>
+          <w:cantSplit/>
+        </w:trPr>
+        <w:tc>
+          <w:tcPr>
+            <w:tcW w:type="dxa" w:w="2750"/>
+            <w:tcMar>
+              <w:top w:w="80" w:type="dxa"/>
+              <w:start w:w="120" w:type="dxa"/>
+              <w:bottom w:w="80" w:type="dxa"/>
+              <w:end w:w="120" w:type="dxa"/>
+            </w:tcMar>
+            <w:vAlign w:val="center"/>
+          </w:tcPr>
+          <w:p>
+            <w:pPr>
+              <w:spacing w:before="0" w:after="20" w:line="259" w:lineRule="auto"/>
+            </w:pPr>
+            <w:r>
+              <w:rPr>
+                <w:rFonts w:ascii="Microsoft YaHei" w:hAnsi="Microsoft YaHei" w:eastAsia="Microsoft YaHei"/>
+                <w:color w:val="243447"/>
+                <w:sz w:val="16"/>
+              </w:rPr>
+            </w:r>
+            <w:r>
+              <w:rPr>
+                <w:rFonts w:ascii="Microsoft YaHei" w:hAnsi="Microsoft YaHei" w:eastAsia="Microsoft YaHei"/>
+                <w:b w:val="0"/>
+                <w:color w:val="243447"/>
+                <w:sz w:val="16"/>
+              </w:rPr>
+              <w:t>推送超时但结果未知</w:t>
+            </w:r>
+          </w:p>
+        </w:tc>
+        <w:tc>
+          <w:tcPr>
+            <w:tcW w:type="dxa" w:w="4350"/>
+            <w:tcMar>
+              <w:top w:w="80" w:type="dxa"/>
+              <w:start w:w="120" w:type="dxa"/>
+              <w:bottom w:w="80" w:type="dxa"/>
+              <w:end w:w="120" w:type="dxa"/>
+            </w:tcMar>
+            <w:vAlign w:val="center"/>
+          </w:tcPr>
+          <w:p>
+            <w:pPr>
+              <w:spacing w:before="0" w:after="20" w:line="259" w:lineRule="auto"/>
+            </w:pPr>
+            <w:r>
+              <w:rPr>
+                <w:rFonts w:ascii="Microsoft YaHei" w:hAnsi="Microsoft YaHei" w:eastAsia="Microsoft YaHei"/>
+                <w:color w:val="243447"/>
+                <w:sz w:val="16"/>
+              </w:rPr>
+            </w:r>
+            <w:r>
+              <w:rPr>
+                <w:rFonts w:ascii="Microsoft YaHei" w:hAnsi="Microsoft YaHei" w:eastAsia="Microsoft YaHei"/>
+                <w:b w:val="0"/>
+                <w:color w:val="243447"/>
+                <w:sz w:val="16"/>
+              </w:rPr>
+              <w:t>使用同一幂等请求号查询或重试，禁止生成新的请求号直接再次建单。</w:t>
+            </w:r>
+          </w:p>
+        </w:tc>
+        <w:tc>
+          <w:tcPr>
+            <w:tcW w:type="dxa" w:w="2260"/>
+            <w:tcMar>
+              <w:top w:w="80" w:type="dxa"/>
+              <w:start w:w="120" w:type="dxa"/>
+              <w:bottom w:w="80" w:type="dxa"/>
+              <w:end w:w="120" w:type="dxa"/>
+            </w:tcMar>
+            <w:vAlign w:val="center"/>
+          </w:tcPr>
+          <w:p>
+            <w:pPr>
+              <w:spacing w:before="0" w:after="20" w:line="259" w:lineRule="auto"/>
+            </w:pPr>
+            <w:r>
+              <w:rPr>
+                <w:rFonts w:ascii="Microsoft YaHei" w:hAnsi="Microsoft YaHei" w:eastAsia="Microsoft YaHei"/>
+                <w:color w:val="243447"/>
+                <w:sz w:val="16"/>
+              </w:rPr>
+            </w:r>
+            <w:r>
+              <w:rPr>
+                <w:rFonts w:ascii="Microsoft YaHei" w:hAnsi="Microsoft YaHei" w:eastAsia="Microsoft YaHei"/>
+                <w:b w:val="0"/>
+                <w:color w:val="243447"/>
+                <w:sz w:val="16"/>
+              </w:rPr>
+              <w:t>正在确认旺店通处理结果，请勿重复操作。</w:t>
+            </w:r>
+          </w:p>
+        </w:tc>
+      </w:tr>
+      <w:tr>
+        <w:trPr>
+          <w:cantSplit/>
+        </w:trPr>
+        <w:tc>
+          <w:tcPr>
+            <w:tcW w:type="dxa" w:w="2750"/>
+            <w:tcMar>
+              <w:top w:w="80" w:type="dxa"/>
+              <w:start w:w="120" w:type="dxa"/>
+              <w:bottom w:w="80" w:type="dxa"/>
+              <w:end w:w="120" w:type="dxa"/>
+            </w:tcMar>
+            <w:vAlign w:val="center"/>
+          </w:tcPr>
+          <w:p>
+            <w:pPr>
+              <w:spacing w:before="0" w:after="20" w:line="259" w:lineRule="auto"/>
+            </w:pPr>
+            <w:r>
+              <w:rPr>
+                <w:rFonts w:ascii="Microsoft YaHei" w:hAnsi="Microsoft YaHei" w:eastAsia="Microsoft YaHei"/>
+                <w:color w:val="243447"/>
+                <w:sz w:val="16"/>
+              </w:rPr>
+            </w:r>
+            <w:r>
+              <w:rPr>
+                <w:rFonts w:ascii="Microsoft YaHei" w:hAnsi="Microsoft YaHei" w:eastAsia="Microsoft YaHei"/>
+                <w:b w:val="0"/>
+                <w:color w:val="243447"/>
+                <w:sz w:val="16"/>
+              </w:rPr>
+              <w:t>一张售后单关联多条实际发货明细</w:t>
+            </w:r>
+          </w:p>
+        </w:tc>
+        <w:tc>
+          <w:tcPr>
+            <w:tcW w:type="dxa" w:w="4350"/>
+            <w:tcMar>
+              <w:top w:w="80" w:type="dxa"/>
+              <w:start w:w="120" w:type="dxa"/>
+              <w:bottom w:w="80" w:type="dxa"/>
+              <w:end w:w="120" w:type="dxa"/>
+            </w:tcMar>
+            <w:vAlign w:val="center"/>
+          </w:tcPr>
+          <w:p>
+            <w:pPr>
+              <w:spacing w:before="0" w:after="20" w:line="259" w:lineRule="auto"/>
+            </w:pPr>
+            <w:r>
+              <w:rPr>
+                <w:rFonts w:ascii="Microsoft YaHei" w:hAnsi="Microsoft YaHei" w:eastAsia="Microsoft YaHei"/>
+                <w:color w:val="243447"/>
+                <w:sz w:val="16"/>
+              </w:rPr>
+            </w:r>
+            <w:r>
+              <w:rPr>
+                <w:rFonts w:ascii="Microsoft YaHei" w:hAnsi="Microsoft YaHei" w:eastAsia="Microsoft YaHei"/>
+                <w:b w:val="0"/>
+                <w:color w:val="243447"/>
+                <w:sz w:val="16"/>
+              </w:rPr>
+              <w:t>先校验映射数量合计，再汇总生成1条旺店通数据。</w:t>
+            </w:r>
+          </w:p>
+        </w:tc>
+        <w:tc>
+          <w:tcPr>
+            <w:tcW w:type="dxa" w:w="2260"/>
+            <w:tcMar>
+              <w:top w:w="80" w:type="dxa"/>
+              <w:start w:w="120" w:type="dxa"/>
+              <w:bottom w:w="80" w:type="dxa"/>
+              <w:end w:w="120" w:type="dxa"/>
+            </w:tcMar>
+            <w:vAlign w:val="center"/>
+          </w:tcPr>
+          <w:p>
+            <w:pPr>
+              <w:spacing w:before="0" w:after="20" w:line="259" w:lineRule="auto"/>
+            </w:pPr>
+            <w:r>
+              <w:rPr>
+                <w:rFonts w:ascii="Microsoft YaHei" w:hAnsi="Microsoft YaHei" w:eastAsia="Microsoft YaHei"/>
+                <w:color w:val="243447"/>
+                <w:sz w:val="16"/>
+              </w:rPr>
+            </w:r>
+            <w:r>
+              <w:rPr>
+                <w:rFonts w:ascii="Microsoft YaHei" w:hAnsi="Microsoft YaHei" w:eastAsia="Microsoft YaHei"/>
+                <w:b w:val="0"/>
+                <w:color w:val="243447"/>
+                <w:sz w:val="16"/>
+              </w:rPr>
+              <w:t>推送条数仍为1条，关联明细可展开查看。</w:t>
+            </w:r>
+          </w:p>
+        </w:tc>
+      </w:tr>
+      <w:tr>
+        <w:trPr>
+          <w:cantSplit/>
+        </w:trPr>
+        <w:tc>
+          <w:tcPr>
+            <w:tcW w:type="dxa" w:w="2750"/>
+            <w:tcMar>
+              <w:top w:w="80" w:type="dxa"/>
+              <w:start w:w="120" w:type="dxa"/>
+              <w:bottom w:w="80" w:type="dxa"/>
+              <w:end w:w="120" w:type="dxa"/>
+            </w:tcMar>
+            <w:vAlign w:val="center"/>
+          </w:tcPr>
+          <w:p>
+            <w:pPr>
+              <w:spacing w:before="0" w:after="20" w:line="259" w:lineRule="auto"/>
+            </w:pPr>
+            <w:r>
+              <w:rPr>
+                <w:rFonts w:ascii="Microsoft YaHei" w:hAnsi="Microsoft YaHei" w:eastAsia="Microsoft YaHei"/>
+                <w:color w:val="243447"/>
+                <w:sz w:val="16"/>
+              </w:rPr>
+            </w:r>
+            <w:r>
+              <w:rPr>
+                <w:rFonts w:ascii="Microsoft YaHei" w:hAnsi="Microsoft YaHei" w:eastAsia="Microsoft YaHei"/>
+                <w:b w:val="0"/>
+                <w:color w:val="243447"/>
+                <w:sz w:val="16"/>
+              </w:rPr>
+              <w:t>已完成售后被撤销或冲正</w:t>
+            </w:r>
+          </w:p>
+        </w:tc>
+        <w:tc>
+          <w:tcPr>
+            <w:tcW w:type="dxa" w:w="4350"/>
+            <w:tcMar>
+              <w:top w:w="80" w:type="dxa"/>
+              <w:start w:w="120" w:type="dxa"/>
+              <w:bottom w:w="80" w:type="dxa"/>
+              <w:end w:w="120" w:type="dxa"/>
+            </w:tcMar>
+            <w:vAlign w:val="center"/>
+          </w:tcPr>
+          <w:p>
+            <w:pPr>
+              <w:spacing w:before="0" w:after="20" w:line="259" w:lineRule="auto"/>
+            </w:pPr>
+            <w:r>
+              <w:rPr>
+                <w:rFonts w:ascii="Microsoft YaHei" w:hAnsi="Microsoft YaHei" w:eastAsia="Microsoft YaHei"/>
+                <w:color w:val="243447"/>
+                <w:sz w:val="16"/>
+              </w:rPr>
+            </w:r>
+            <w:r>
+              <w:rPr>
+                <w:rFonts w:ascii="Microsoft YaHei" w:hAnsi="Microsoft YaHei" w:eastAsia="Microsoft YaHei"/>
+                <w:b w:val="0"/>
+                <w:color w:val="243447"/>
+                <w:sz w:val="16"/>
+              </w:rPr>
+              <w:t>不得直接删除已推送记录；根据旺店通是否支持撤销/冲正接口执行后续处理。</w:t>
+            </w:r>
+          </w:p>
+        </w:tc>
+        <w:tc>
+          <w:tcPr>
+            <w:tcW w:type="dxa" w:w="2260"/>
+            <w:tcMar>
+              <w:top w:w="80" w:type="dxa"/>
+              <w:start w:w="120" w:type="dxa"/>
+              <w:bottom w:w="80" w:type="dxa"/>
+              <w:end w:w="120" w:type="dxa"/>
+            </w:tcMar>
+            <w:vAlign w:val="center"/>
+          </w:tcPr>
+          <w:p>
+            <w:pPr>
+              <w:spacing w:before="0" w:after="20" w:line="259" w:lineRule="auto"/>
+            </w:pPr>
+            <w:r>
+              <w:rPr>
+                <w:rFonts w:ascii="Microsoft YaHei" w:hAnsi="Microsoft YaHei" w:eastAsia="Microsoft YaHei"/>
+                <w:color w:val="243447"/>
+                <w:sz w:val="16"/>
+              </w:rPr>
+            </w:r>
+            <w:r>
+              <w:rPr>
+                <w:rFonts w:ascii="Microsoft YaHei" w:hAnsi="Microsoft YaHei" w:eastAsia="Microsoft YaHei"/>
+                <w:b w:val="0"/>
+                <w:color w:val="243447"/>
+                <w:sz w:val="16"/>
+              </w:rPr>
+              <w:t>需确认旺店通冲正能力后处理。</w:t>
             </w:r>
           </w:p>
         </w:tc>
@@ -11945,7 +12820,7 @@
           <w:color w:val="243447"/>
           <w:sz w:val="20"/>
         </w:rPr>
-        <w:t>售后人员仍从原订单发起退款或退货；页面新增实际发货单关联信息，不改变现有售后归属和财务口径。</w:t>
+        <w:t>售后人员通过售后订单发起退款、取消或退货；售后完成后系统自动向旺店通推送1条数据，发货管理只提供售后订单关联查看和跳转。</w:t>
       </w:r>
     </w:p>
     <w:p>
@@ -12396,7 +13271,78 @@
                 <w:color w:val="243447"/>
                 <w:sz w:val="18"/>
               </w:rPr>
-              <w:t>仍以原订单商品行为业务归属；新增原订单商品行—实际发货单商品行—退货明细的数量映射，并向拆合服务提供售后占用及剩余履约数量。</w:t>
+              <w:t>以售后订单为发起与推送主体；保留原订单商品行—实际发货单商品行的数量映射，售后完成后按售后订单维度向旺店通推送1条数据。</w:t>
+            </w:r>
+          </w:p>
+        </w:tc>
+      </w:tr>
+      <w:tr>
+        <w:trPr>
+          <w:cantSplit/>
+        </w:trPr>
+        <w:tc>
+          <w:tcPr>
+            <w:tcW w:type="dxa" w:w="2300"/>
+            <w:tcMar>
+              <w:top w:w="80" w:type="dxa"/>
+              <w:start w:w="120" w:type="dxa"/>
+              <w:bottom w:w="80" w:type="dxa"/>
+              <w:end w:w="120" w:type="dxa"/>
+            </w:tcMar>
+            <w:vAlign w:val="center"/>
+          </w:tcPr>
+          <w:p>
+            <w:pPr>
+              <w:spacing w:before="0" w:after="20" w:line="259" w:lineRule="auto"/>
+            </w:pPr>
+            <w:r>
+              <w:rPr>
+                <w:rFonts w:ascii="Microsoft YaHei" w:hAnsi="Microsoft YaHei" w:eastAsia="Microsoft YaHei"/>
+                <w:color w:val="243447"/>
+                <w:sz w:val="18"/>
+              </w:rPr>
+            </w:r>
+            <w:r>
+              <w:rPr>
+                <w:rFonts w:ascii="Microsoft YaHei" w:hAnsi="Microsoft YaHei" w:eastAsia="Microsoft YaHei"/>
+                <w:b w:val="0"/>
+                <w:color w:val="243447"/>
+                <w:sz w:val="18"/>
+              </w:rPr>
+              <w:t>旺店通售后推送接口</w:t>
+            </w:r>
+          </w:p>
+        </w:tc>
+        <w:tc>
+          <w:tcPr>
+            <w:tcW w:type="dxa" w:w="7060"/>
+            <w:tcMar>
+              <w:top w:w="80" w:type="dxa"/>
+              <w:start w:w="120" w:type="dxa"/>
+              <w:bottom w:w="80" w:type="dxa"/>
+              <w:end w:w="120" w:type="dxa"/>
+            </w:tcMar>
+            <w:vAlign w:val="center"/>
+          </w:tcPr>
+          <w:p>
+            <w:pPr>
+              <w:spacing w:before="0" w:after="20" w:line="259" w:lineRule="auto"/>
+            </w:pPr>
+            <w:r>
+              <w:rPr>
+                <w:rFonts w:ascii="Microsoft YaHei" w:hAnsi="Microsoft YaHei" w:eastAsia="Microsoft YaHei"/>
+                <w:color w:val="243447"/>
+                <w:sz w:val="18"/>
+              </w:rPr>
+            </w:r>
+            <w:r>
+              <w:rPr>
+                <w:rFonts w:ascii="Microsoft YaHei" w:hAnsi="Microsoft YaHei" w:eastAsia="Microsoft YaHei"/>
+                <w:b w:val="0"/>
+                <w:color w:val="243447"/>
+                <w:sz w:val="18"/>
+              </w:rPr>
+              <w:t>新增或复用售后数据推送能力，支持售后完成触发、单条数据组装、稳定幂等键、结果查询、失败重试和推送日志。</w:t>
             </w:r>
           </w:p>
         </w:tc>
@@ -12869,7 +13815,7 @@
                 <w:color w:val="243447"/>
                 <w:sz w:val="16"/>
               </w:rPr>
-              <w:t>状态查询与订单同步接口</w:t>
+              <w:t>订单状态查询、发货同步及售后推送接口</w:t>
             </w:r>
           </w:p>
         </w:tc>
@@ -12902,7 +13848,7 @@
                 <w:color w:val="243447"/>
                 <w:sz w:val="16"/>
               </w:rPr>
-              <w:t>确认可查询状态字段、调用频率、幂等字段、旺店通单号返回时点。</w:t>
+              <w:t>确认售后数据字段、完成后推送时点、单条数据约束、幂等字段、结果查询与失败重试能力。</w:t>
             </w:r>
           </w:p>
         </w:tc>
@@ -13417,7 +14363,7 @@
                 <w:color w:val="243447"/>
                 <w:sz w:val="16"/>
               </w:rPr>
-              <w:t>退款、取消、退货状态与数量联动</w:t>
+              <w:t>售后订单状态、数量映射与完成事件</w:t>
             </w:r>
           </w:p>
         </w:tc>
@@ -13450,7 +14396,7 @@
                 <w:color w:val="243447"/>
                 <w:sz w:val="16"/>
               </w:rPr>
-              <w:t>提供原订单商品行的售后占用、累计有效退货和剩余可履约数量；保存售后明细到实际发货单商品行的数量映射。</w:t>
+              <w:t>提供售后订单发起、完成状态和完成事件；保存原订单商品行到实际发货单商品行的数量映射，并保证一张售后订单只触发1条旺店通数据。</w:t>
             </w:r>
           </w:p>
         </w:tc>
@@ -13724,7 +14670,7 @@
                 <w:color w:val="243447"/>
                 <w:sz w:val="16"/>
               </w:rPr>
-              <w:t>覆盖前置拆合、驳回拆合、多级拆合、重复提交、部分同步、再次驳回。</w:t>
+              <w:t>覆盖前置拆合、驳回拆合、多级拆合、售后完成推送1条、重复完成事件幂等、推送失败重试及结果未知。</w:t>
             </w:r>
           </w:p>
         </w:tc>
@@ -14103,7 +15049,7 @@
           <w:color w:val="243447"/>
           <w:sz w:val="20"/>
         </w:rPr>
-        <w:t>订单/售后系统的数量占用状态枚举、释放时点，以及退款、取消、拒收是否共用同一可退数量口径。</w:t>
+        <w:t>订单/售后系统中触发旺店通推送的准确“售后完成”状态枚举，以及完成事件是否可能重复发送。</w:t>
       </w:r>
     </w:p>
     <w:p>
@@ -14118,7 +15064,22 @@
           <w:color w:val="243447"/>
           <w:sz w:val="20"/>
         </w:rPr>
-        <w:t>一笔售后跨多个实际发货单时，退货单由售后系统统一生成还是按实际发货单拆分生成。</w:t>
+        <w:t>一张售后订单关联多个实际发货单商品行时，旺店通单条数据需要的明细结构、最大明细数和数量字段口径。</w:t>
+      </w:r>
+    </w:p>
+    <w:p>
+      <w:pPr>
+        <w:pStyle w:val="ListBullet"/>
+        <w:spacing w:after="80" w:line="280" w:lineRule="auto"/>
+        <w:ind w:left="720" w:hanging="360"/>
+      </w:pPr>
+      <w:r>
+        <w:rPr>
+          <w:rFonts w:ascii="Microsoft YaHei" w:hAnsi="Microsoft YaHei" w:eastAsia="Microsoft YaHei"/>
+          <w:color w:val="243447"/>
+          <w:sz w:val="20"/>
+        </w:rPr>
+        <w:t>旺店通售后推送接口的幂等字段、结果查询方式、超时重试策略，以及已推送售后的撤销/冲正能力。</w:t>
       </w:r>
     </w:p>
     <w:p>

</xml_diff>

<commit_message>
Auto sync 2026-09-09 11:50:11
</commit_message>
<xml_diff>
--- a/04-需求管理/PRD-OMS发货单拆单与合单功能-v1.0.docx
+++ b/04-需求管理/PRD-OMS发货单拆单与合单功能-v1.0.docx
@@ -1863,7 +1863,7 @@
                 <w:color w:val="243447"/>
                 <w:sz w:val="17"/>
               </w:rPr>
-              <w:t>售后订单与旺店通联动</w:t>
+              <w:t>售后订单管理</w:t>
             </w:r>
           </w:p>
         </w:tc>
@@ -1896,7 +1896,7 @@
                 <w:color w:val="243447"/>
                 <w:sz w:val="17"/>
               </w:rPr>
-              <w:t>复用现有售后退款模块：退款、退货由售后订单发起；售后完成后向旺店通推送1条数据，并关联原订单商品行与实际发货单商品行。</w:t>
+              <w:t>新增售后订单列表与申请售后页面。支持仅退款、退货退款；申请时选择退款原因，按实际发货明细填写数量和金额，提交后生成处理中售后单。售后完成后向旺店通推送1条数据，并关联原订单商品行与实际发货单商品行。</w:t>
             </w:r>
           </w:p>
         </w:tc>
@@ -1929,7 +1929,7 @@
                 <w:color w:val="243447"/>
                 <w:sz w:val="17"/>
               </w:rPr>
-              <w:t>发货管理关联入口 + 售后退款流程</w:t>
+              <w:t>售后退款菜单 + 发货管理关联入口</w:t>
             </w:r>
           </w:p>
         </w:tc>
@@ -4338,7 +4338,7 @@
                 <w:color w:val="243447"/>
                 <w:sz w:val="17"/>
               </w:rPr>
-              <w:t>售后订单关联与旺店通推送</w:t>
+              <w:t>申请售后与售后订单管理</w:t>
             </w:r>
           </w:p>
         </w:tc>
@@ -4371,7 +4371,7 @@
                 <w:color w:val="243447"/>
                 <w:sz w:val="17"/>
               </w:rPr>
-              <w:t>保存原订单商品行与实际发货单商品行映射；售后完成后按售后订单维度向旺店通幂等推送1条数据，失败可重试但不得重复建单。</w:t>
+              <w:t>提供紧凑型申请售后弹窗和售后订单列表；支持仅退款、退货退款、数量/金额校验、详情查看与完成操作。保存原订单商品行与实际发货单商品行映射；售后完成后按售后订单维度向旺店通幂等推送1条数据。</w:t>
             </w:r>
           </w:p>
         </w:tc>
@@ -5342,6 +5342,148 @@
                 <w:color w:val="243447"/>
                 <w:sz w:val="18"/>
               </w:rPr>
+              <w:t>售后订单页面</w:t>
+            </w:r>
+          </w:p>
+        </w:tc>
+        <w:tc>
+          <w:tcPr>
+            <w:tcW w:type="dxa" w:w="6860"/>
+            <w:tcMar>
+              <w:top w:w="80" w:type="dxa"/>
+              <w:start w:w="120" w:type="dxa"/>
+              <w:bottom w:w="80" w:type="dxa"/>
+              <w:end w:w="120" w:type="dxa"/>
+            </w:tcMar>
+            <w:vAlign w:val="center"/>
+          </w:tcPr>
+          <w:p>
+            <w:pPr>
+              <w:spacing w:before="0" w:after="20" w:line="259" w:lineRule="auto"/>
+            </w:pPr>
+            <w:r>
+              <w:rPr>
+                <w:rFonts w:ascii="Microsoft YaHei" w:hAnsi="Microsoft YaHei" w:eastAsia="Microsoft YaHei"/>
+                <w:color w:val="243447"/>
+                <w:sz w:val="18"/>
+              </w:rPr>
+            </w:r>
+            <w:r>
+              <w:rPr>
+                <w:rFonts w:ascii="Microsoft YaHei" w:hAnsi="Microsoft YaHei" w:eastAsia="Microsoft YaHei"/>
+                <w:b w:val="0"/>
+                <w:color w:val="243447"/>
+                <w:sz w:val="18"/>
+              </w:rPr>
+              <w:t>在售后退款菜单下新增页面；采用指标卡、紧凑筛选区和列表。列表展示售后订单/原订单、售后类型、商品与申请数量、客户、退款金额、售后状态、旺店通推送状态与条数、申请时间，并提供查看详情、完成售后、查看推送操作。</w:t>
+            </w:r>
+          </w:p>
+        </w:tc>
+      </w:tr>
+      <w:tr>
+        <w:trPr>
+          <w:cantSplit/>
+        </w:trPr>
+        <w:tc>
+          <w:tcPr>
+            <w:tcW w:type="dxa" w:w="2500"/>
+            <w:tcMar>
+              <w:top w:w="80" w:type="dxa"/>
+              <w:start w:w="120" w:type="dxa"/>
+              <w:bottom w:w="80" w:type="dxa"/>
+              <w:end w:w="120" w:type="dxa"/>
+            </w:tcMar>
+            <w:vAlign w:val="center"/>
+          </w:tcPr>
+          <w:p>
+            <w:pPr>
+              <w:spacing w:before="0" w:after="20" w:line="259" w:lineRule="auto"/>
+            </w:pPr>
+            <w:r>
+              <w:rPr>
+                <w:rFonts w:ascii="Microsoft YaHei" w:hAnsi="Microsoft YaHei" w:eastAsia="Microsoft YaHei"/>
+                <w:color w:val="243447"/>
+                <w:sz w:val="18"/>
+              </w:rPr>
+            </w:r>
+            <w:r>
+              <w:rPr>
+                <w:rFonts w:ascii="Microsoft YaHei" w:hAnsi="Microsoft YaHei" w:eastAsia="Microsoft YaHei"/>
+                <w:b w:val="0"/>
+                <w:color w:val="243447"/>
+                <w:sz w:val="18"/>
+              </w:rPr>
+              <w:t>申请售后弹窗</w:t>
+            </w:r>
+          </w:p>
+        </w:tc>
+        <w:tc>
+          <w:tcPr>
+            <w:tcW w:type="dxa" w:w="6860"/>
+            <w:tcMar>
+              <w:top w:w="80" w:type="dxa"/>
+              <w:start w:w="120" w:type="dxa"/>
+              <w:bottom w:w="80" w:type="dxa"/>
+              <w:end w:w="120" w:type="dxa"/>
+            </w:tcMar>
+            <w:vAlign w:val="center"/>
+          </w:tcPr>
+          <w:p>
+            <w:pPr>
+              <w:spacing w:before="0" w:after="20" w:line="259" w:lineRule="auto"/>
+            </w:pPr>
+            <w:r>
+              <w:rPr>
+                <w:rFonts w:ascii="Microsoft YaHei" w:hAnsi="Microsoft YaHei" w:eastAsia="Microsoft YaHei"/>
+                <w:color w:val="243447"/>
+                <w:sz w:val="18"/>
+              </w:rPr>
+            </w:r>
+            <w:r>
+              <w:rPr>
+                <w:rFonts w:ascii="Microsoft YaHei" w:hAnsi="Microsoft YaHei" w:eastAsia="Microsoft YaHei"/>
+                <w:b w:val="0"/>
+                <w:color w:val="243447"/>
+                <w:sz w:val="18"/>
+              </w:rPr>
+              <w:t>参考售后关联页的紧凑视觉：顶部切换仅退款/退货退款，依次展示说明条、商品摘要、数量指标卡、实际发货明细表、退款原因与金额表单、售后描述及凭证上传。提交后生成处理中售后单，不在申请阶段推送旺店通。</w:t>
+            </w:r>
+          </w:p>
+        </w:tc>
+      </w:tr>
+      <w:tr>
+        <w:trPr>
+          <w:cantSplit/>
+        </w:trPr>
+        <w:tc>
+          <w:tcPr>
+            <w:tcW w:type="dxa" w:w="2500"/>
+            <w:tcMar>
+              <w:top w:w="80" w:type="dxa"/>
+              <w:start w:w="120" w:type="dxa"/>
+              <w:bottom w:w="80" w:type="dxa"/>
+              <w:end w:w="120" w:type="dxa"/>
+            </w:tcMar>
+            <w:vAlign w:val="center"/>
+          </w:tcPr>
+          <w:p>
+            <w:pPr>
+              <w:spacing w:before="0" w:after="20" w:line="259" w:lineRule="auto"/>
+            </w:pPr>
+            <w:r>
+              <w:rPr>
+                <w:rFonts w:ascii="Microsoft YaHei" w:hAnsi="Microsoft YaHei" w:eastAsia="Microsoft YaHei"/>
+                <w:color w:val="243447"/>
+                <w:sz w:val="18"/>
+              </w:rPr>
+            </w:r>
+            <w:r>
+              <w:rPr>
+                <w:rFonts w:ascii="Microsoft YaHei" w:hAnsi="Microsoft YaHei" w:eastAsia="Microsoft YaHei"/>
+                <w:b w:val="0"/>
+                <w:color w:val="243447"/>
+                <w:sz w:val="18"/>
+              </w:rPr>
               <w:t>售后订单关联弹窗</w:t>
             </w:r>
           </w:p>
@@ -8886,6 +9028,432 @@
                 <w:color w:val="243447"/>
                 <w:sz w:val="17"/>
               </w:rPr>
+              <w:t>售后类型</w:t>
+            </w:r>
+          </w:p>
+        </w:tc>
+        <w:tc>
+          <w:tcPr>
+            <w:tcW w:type="dxa" w:w="7160"/>
+            <w:tcMar>
+              <w:top w:w="80" w:type="dxa"/>
+              <w:start w:w="120" w:type="dxa"/>
+              <w:bottom w:w="80" w:type="dxa"/>
+              <w:end w:w="120" w:type="dxa"/>
+            </w:tcMar>
+            <w:vAlign w:val="center"/>
+          </w:tcPr>
+          <w:p>
+            <w:pPr>
+              <w:spacing w:before="0" w:after="20" w:line="259" w:lineRule="auto"/>
+            </w:pPr>
+            <w:r>
+              <w:rPr>
+                <w:rFonts w:ascii="Microsoft YaHei" w:hAnsi="Microsoft YaHei" w:eastAsia="Microsoft YaHei"/>
+                <w:color w:val="243447"/>
+                <w:sz w:val="17"/>
+              </w:rPr>
+            </w:r>
+            <w:r>
+              <w:rPr>
+                <w:rFonts w:ascii="Microsoft YaHei" w:hAnsi="Microsoft YaHei" w:eastAsia="Microsoft YaHei"/>
+                <w:b w:val="0"/>
+                <w:color w:val="243447"/>
+                <w:sz w:val="17"/>
+              </w:rPr>
+              <w:t>申请售后支持“仅退款”和“退货退款”。切换类型时保留当前订单与商品上下文，并根据类型更新数量字段名称和提示文案。</w:t>
+            </w:r>
+          </w:p>
+        </w:tc>
+      </w:tr>
+      <w:tr>
+        <w:trPr>
+          <w:cantSplit/>
+        </w:trPr>
+        <w:tc>
+          <w:tcPr>
+            <w:tcW w:type="dxa" w:w="2200"/>
+            <w:tcMar>
+              <w:top w:w="80" w:type="dxa"/>
+              <w:start w:w="120" w:type="dxa"/>
+              <w:bottom w:w="80" w:type="dxa"/>
+              <w:end w:w="120" w:type="dxa"/>
+            </w:tcMar>
+            <w:vAlign w:val="center"/>
+          </w:tcPr>
+          <w:p>
+            <w:pPr>
+              <w:spacing w:before="0" w:after="20" w:line="259" w:lineRule="auto"/>
+            </w:pPr>
+            <w:r>
+              <w:rPr>
+                <w:rFonts w:ascii="Microsoft YaHei" w:hAnsi="Microsoft YaHei" w:eastAsia="Microsoft YaHei"/>
+                <w:color w:val="243447"/>
+                <w:sz w:val="17"/>
+              </w:rPr>
+            </w:r>
+            <w:r>
+              <w:rPr>
+                <w:rFonts w:ascii="Microsoft YaHei" w:hAnsi="Microsoft YaHei" w:eastAsia="Microsoft YaHei"/>
+                <w:b w:val="0"/>
+                <w:color w:val="243447"/>
+                <w:sz w:val="17"/>
+              </w:rPr>
+              <w:t>申请数量</w:t>
+            </w:r>
+          </w:p>
+        </w:tc>
+        <w:tc>
+          <w:tcPr>
+            <w:tcW w:type="dxa" w:w="7160"/>
+            <w:tcMar>
+              <w:top w:w="80" w:type="dxa"/>
+              <w:start w:w="120" w:type="dxa"/>
+              <w:bottom w:w="80" w:type="dxa"/>
+              <w:end w:w="120" w:type="dxa"/>
+            </w:tcMar>
+            <w:vAlign w:val="center"/>
+          </w:tcPr>
+          <w:p>
+            <w:pPr>
+              <w:spacing w:before="0" w:after="20" w:line="259" w:lineRule="auto"/>
+            </w:pPr>
+            <w:r>
+              <w:rPr>
+                <w:rFonts w:ascii="Microsoft YaHei" w:hAnsi="Microsoft YaHei" w:eastAsia="Microsoft YaHei"/>
+                <w:color w:val="243447"/>
+                <w:sz w:val="17"/>
+              </w:rPr>
+            </w:r>
+            <w:r>
+              <w:rPr>
+                <w:rFonts w:ascii="Microsoft YaHei" w:hAnsi="Microsoft YaHei" w:eastAsia="Microsoft YaHei"/>
+                <w:b w:val="0"/>
+                <w:color w:val="243447"/>
+                <w:sz w:val="17"/>
+              </w:rPr>
+              <w:t>按实际发货单商品行填写正整数；本次申请数量不得超过该原订单商品行在对应实际发货明细上的可申请数量。多条明细的申请数量合计构成本次售后数量。</w:t>
+            </w:r>
+          </w:p>
+        </w:tc>
+      </w:tr>
+      <w:tr>
+        <w:trPr>
+          <w:cantSplit/>
+        </w:trPr>
+        <w:tc>
+          <w:tcPr>
+            <w:tcW w:type="dxa" w:w="2200"/>
+            <w:tcMar>
+              <w:top w:w="80" w:type="dxa"/>
+              <w:start w:w="120" w:type="dxa"/>
+              <w:bottom w:w="80" w:type="dxa"/>
+              <w:end w:w="120" w:type="dxa"/>
+            </w:tcMar>
+            <w:vAlign w:val="center"/>
+          </w:tcPr>
+          <w:p>
+            <w:pPr>
+              <w:spacing w:before="0" w:after="20" w:line="259" w:lineRule="auto"/>
+            </w:pPr>
+            <w:r>
+              <w:rPr>
+                <w:rFonts w:ascii="Microsoft YaHei" w:hAnsi="Microsoft YaHei" w:eastAsia="Microsoft YaHei"/>
+                <w:color w:val="243447"/>
+                <w:sz w:val="17"/>
+              </w:rPr>
+            </w:r>
+            <w:r>
+              <w:rPr>
+                <w:rFonts w:ascii="Microsoft YaHei" w:hAnsi="Microsoft YaHei" w:eastAsia="Microsoft YaHei"/>
+                <w:b w:val="0"/>
+                <w:color w:val="243447"/>
+                <w:sz w:val="17"/>
+              </w:rPr>
+              <w:t>退款原因</w:t>
+            </w:r>
+          </w:p>
+        </w:tc>
+        <w:tc>
+          <w:tcPr>
+            <w:tcW w:type="dxa" w:w="7160"/>
+            <w:tcMar>
+              <w:top w:w="80" w:type="dxa"/>
+              <w:start w:w="120" w:type="dxa"/>
+              <w:bottom w:w="80" w:type="dxa"/>
+              <w:end w:w="120" w:type="dxa"/>
+            </w:tcMar>
+            <w:vAlign w:val="center"/>
+          </w:tcPr>
+          <w:p>
+            <w:pPr>
+              <w:spacing w:before="0" w:after="20" w:line="259" w:lineRule="auto"/>
+            </w:pPr>
+            <w:r>
+              <w:rPr>
+                <w:rFonts w:ascii="Microsoft YaHei" w:hAnsi="Microsoft YaHei" w:eastAsia="Microsoft YaHei"/>
+                <w:color w:val="243447"/>
+                <w:sz w:val="17"/>
+              </w:rPr>
+            </w:r>
+            <w:r>
+              <w:rPr>
+                <w:rFonts w:ascii="Microsoft YaHei" w:hAnsi="Microsoft YaHei" w:eastAsia="Microsoft YaHei"/>
+                <w:b w:val="0"/>
+                <w:color w:val="243447"/>
+                <w:sz w:val="17"/>
+              </w:rPr>
+              <w:t>退款原因为必填项；未选择时不得提交。售后相关描述和图片凭证本期为选填，业务另有强制要求时再配置。</w:t>
+            </w:r>
+          </w:p>
+        </w:tc>
+      </w:tr>
+      <w:tr>
+        <w:trPr>
+          <w:cantSplit/>
+        </w:trPr>
+        <w:tc>
+          <w:tcPr>
+            <w:tcW w:type="dxa" w:w="2200"/>
+            <w:tcMar>
+              <w:top w:w="80" w:type="dxa"/>
+              <w:start w:w="120" w:type="dxa"/>
+              <w:bottom w:w="80" w:type="dxa"/>
+              <w:end w:w="120" w:type="dxa"/>
+            </w:tcMar>
+            <w:vAlign w:val="center"/>
+          </w:tcPr>
+          <w:p>
+            <w:pPr>
+              <w:spacing w:before="0" w:after="20" w:line="259" w:lineRule="auto"/>
+            </w:pPr>
+            <w:r>
+              <w:rPr>
+                <w:rFonts w:ascii="Microsoft YaHei" w:hAnsi="Microsoft YaHei" w:eastAsia="Microsoft YaHei"/>
+                <w:color w:val="243447"/>
+                <w:sz w:val="17"/>
+              </w:rPr>
+            </w:r>
+            <w:r>
+              <w:rPr>
+                <w:rFonts w:ascii="Microsoft YaHei" w:hAnsi="Microsoft YaHei" w:eastAsia="Microsoft YaHei"/>
+                <w:b w:val="0"/>
+                <w:color w:val="243447"/>
+                <w:sz w:val="17"/>
+              </w:rPr>
+              <w:t>退款金额</w:t>
+            </w:r>
+          </w:p>
+        </w:tc>
+        <w:tc>
+          <w:tcPr>
+            <w:tcW w:type="dxa" w:w="7160"/>
+            <w:tcMar>
+              <w:top w:w="80" w:type="dxa"/>
+              <w:start w:w="120" w:type="dxa"/>
+              <w:bottom w:w="80" w:type="dxa"/>
+              <w:end w:w="120" w:type="dxa"/>
+            </w:tcMar>
+            <w:vAlign w:val="center"/>
+          </w:tcPr>
+          <w:p>
+            <w:pPr>
+              <w:spacing w:before="0" w:after="20" w:line="259" w:lineRule="auto"/>
+            </w:pPr>
+            <w:r>
+              <w:rPr>
+                <w:rFonts w:ascii="Microsoft YaHei" w:hAnsi="Microsoft YaHei" w:eastAsia="Microsoft YaHei"/>
+                <w:color w:val="243447"/>
+                <w:sz w:val="17"/>
+              </w:rPr>
+            </w:r>
+            <w:r>
+              <w:rPr>
+                <w:rFonts w:ascii="Microsoft YaHei" w:hAnsi="Microsoft YaHei" w:eastAsia="Microsoft YaHei"/>
+                <w:b w:val="0"/>
+                <w:color w:val="243447"/>
+                <w:sz w:val="17"/>
+              </w:rPr>
+              <w:t>申请退款金额必须大于0且不得超过按本次申请数量计算的可退款金额；金额保留两位小数。</w:t>
+            </w:r>
+          </w:p>
+        </w:tc>
+      </w:tr>
+      <w:tr>
+        <w:trPr>
+          <w:cantSplit/>
+        </w:trPr>
+        <w:tc>
+          <w:tcPr>
+            <w:tcW w:type="dxa" w:w="2200"/>
+            <w:tcMar>
+              <w:top w:w="80" w:type="dxa"/>
+              <w:start w:w="120" w:type="dxa"/>
+              <w:bottom w:w="80" w:type="dxa"/>
+              <w:end w:w="120" w:type="dxa"/>
+            </w:tcMar>
+            <w:vAlign w:val="center"/>
+          </w:tcPr>
+          <w:p>
+            <w:pPr>
+              <w:spacing w:before="0" w:after="20" w:line="259" w:lineRule="auto"/>
+            </w:pPr>
+            <w:r>
+              <w:rPr>
+                <w:rFonts w:ascii="Microsoft YaHei" w:hAnsi="Microsoft YaHei" w:eastAsia="Microsoft YaHei"/>
+                <w:color w:val="243447"/>
+                <w:sz w:val="17"/>
+              </w:rPr>
+            </w:r>
+            <w:r>
+              <w:rPr>
+                <w:rFonts w:ascii="Microsoft YaHei" w:hAnsi="Microsoft YaHei" w:eastAsia="Microsoft YaHei"/>
+                <w:b w:val="0"/>
+                <w:color w:val="243447"/>
+                <w:sz w:val="17"/>
+              </w:rPr>
+              <w:t>退款构成</w:t>
+            </w:r>
+          </w:p>
+        </w:tc>
+        <w:tc>
+          <w:tcPr>
+            <w:tcW w:type="dxa" w:w="7160"/>
+            <w:tcMar>
+              <w:top w:w="80" w:type="dxa"/>
+              <w:start w:w="120" w:type="dxa"/>
+              <w:bottom w:w="80" w:type="dxa"/>
+              <w:end w:w="120" w:type="dxa"/>
+            </w:tcMar>
+            <w:vAlign w:val="center"/>
+          </w:tcPr>
+          <w:p>
+            <w:pPr>
+              <w:spacing w:before="0" w:after="20" w:line="259" w:lineRule="auto"/>
+            </w:pPr>
+            <w:r>
+              <w:rPr>
+                <w:rFonts w:ascii="Microsoft YaHei" w:hAnsi="Microsoft YaHei" w:eastAsia="Microsoft YaHei"/>
+                <w:color w:val="243447"/>
+                <w:sz w:val="17"/>
+              </w:rPr>
+            </w:r>
+            <w:r>
+              <w:rPr>
+                <w:rFonts w:ascii="Microsoft YaHei" w:hAnsi="Microsoft YaHei" w:eastAsia="Microsoft YaHei"/>
+                <w:b w:val="0"/>
+                <w:color w:val="243447"/>
+                <w:sz w:val="17"/>
+              </w:rPr>
+              <w:t>进场抵扣退款、上账退款、实际支付退款均不得小于0，三项合计必须等于本次申请退款金额。</w:t>
+            </w:r>
+          </w:p>
+        </w:tc>
+      </w:tr>
+      <w:tr>
+        <w:trPr>
+          <w:cantSplit/>
+        </w:trPr>
+        <w:tc>
+          <w:tcPr>
+            <w:tcW w:type="dxa" w:w="2200"/>
+            <w:tcMar>
+              <w:top w:w="80" w:type="dxa"/>
+              <w:start w:w="120" w:type="dxa"/>
+              <w:bottom w:w="80" w:type="dxa"/>
+              <w:end w:w="120" w:type="dxa"/>
+            </w:tcMar>
+            <w:vAlign w:val="center"/>
+          </w:tcPr>
+          <w:p>
+            <w:pPr>
+              <w:spacing w:before="0" w:after="20" w:line="259" w:lineRule="auto"/>
+            </w:pPr>
+            <w:r>
+              <w:rPr>
+                <w:rFonts w:ascii="Microsoft YaHei" w:hAnsi="Microsoft YaHei" w:eastAsia="Microsoft YaHei"/>
+                <w:color w:val="243447"/>
+                <w:sz w:val="17"/>
+              </w:rPr>
+            </w:r>
+            <w:r>
+              <w:rPr>
+                <w:rFonts w:ascii="Microsoft YaHei" w:hAnsi="Microsoft YaHei" w:eastAsia="Microsoft YaHei"/>
+                <w:b w:val="0"/>
+                <w:color w:val="243447"/>
+                <w:sz w:val="17"/>
+              </w:rPr>
+              <w:t>申请提交</w:t>
+            </w:r>
+          </w:p>
+        </w:tc>
+        <w:tc>
+          <w:tcPr>
+            <w:tcW w:type="dxa" w:w="7160"/>
+            <w:tcMar>
+              <w:top w:w="80" w:type="dxa"/>
+              <w:start w:w="120" w:type="dxa"/>
+              <w:bottom w:w="80" w:type="dxa"/>
+              <w:end w:w="120" w:type="dxa"/>
+            </w:tcMar>
+            <w:vAlign w:val="center"/>
+          </w:tcPr>
+          <w:p>
+            <w:pPr>
+              <w:spacing w:before="0" w:after="20" w:line="259" w:lineRule="auto"/>
+            </w:pPr>
+            <w:r>
+              <w:rPr>
+                <w:rFonts w:ascii="Microsoft YaHei" w:hAnsi="Microsoft YaHei" w:eastAsia="Microsoft YaHei"/>
+                <w:color w:val="243447"/>
+                <w:sz w:val="17"/>
+              </w:rPr>
+            </w:r>
+            <w:r>
+              <w:rPr>
+                <w:rFonts w:ascii="Microsoft YaHei" w:hAnsi="Microsoft YaHei" w:eastAsia="Microsoft YaHei"/>
+                <w:b w:val="0"/>
+                <w:color w:val="243447"/>
+                <w:sz w:val="17"/>
+              </w:rPr>
+              <w:t>提交成功后生成唯一售后订单并进入处理中；重复点击或网络重试返回同一结果。申请创建、审核或处理中均不向旺店通推送。</w:t>
+            </w:r>
+          </w:p>
+        </w:tc>
+      </w:tr>
+      <w:tr>
+        <w:trPr>
+          <w:cantSplit/>
+        </w:trPr>
+        <w:tc>
+          <w:tcPr>
+            <w:tcW w:type="dxa" w:w="2200"/>
+            <w:tcMar>
+              <w:top w:w="80" w:type="dxa"/>
+              <w:start w:w="120" w:type="dxa"/>
+              <w:bottom w:w="80" w:type="dxa"/>
+              <w:end w:w="120" w:type="dxa"/>
+            </w:tcMar>
+            <w:vAlign w:val="center"/>
+          </w:tcPr>
+          <w:p>
+            <w:pPr>
+              <w:spacing w:before="0" w:after="20" w:line="259" w:lineRule="auto"/>
+            </w:pPr>
+            <w:r>
+              <w:rPr>
+                <w:rFonts w:ascii="Microsoft YaHei" w:hAnsi="Microsoft YaHei" w:eastAsia="Microsoft YaHei"/>
+                <w:color w:val="243447"/>
+                <w:sz w:val="17"/>
+              </w:rPr>
+            </w:r>
+            <w:r>
+              <w:rPr>
+                <w:rFonts w:ascii="Microsoft YaHei" w:hAnsi="Microsoft YaHei" w:eastAsia="Microsoft YaHei"/>
+                <w:b w:val="0"/>
+                <w:color w:val="243447"/>
+                <w:sz w:val="17"/>
+              </w:rPr>
               <w:t>推送触发点</w:t>
             </w:r>
           </w:p>
@@ -11888,6 +12456,526 @@
                 <w:sz w:val="16"/>
               </w:rPr>
               <w:t>可退数量不足，请刷新售后明细。</w:t>
+            </w:r>
+          </w:p>
+        </w:tc>
+      </w:tr>
+      <w:tr>
+        <w:trPr>
+          <w:cantSplit/>
+        </w:trPr>
+        <w:tc>
+          <w:tcPr>
+            <w:tcW w:type="dxa" w:w="2750"/>
+            <w:tcMar>
+              <w:top w:w="80" w:type="dxa"/>
+              <w:start w:w="120" w:type="dxa"/>
+              <w:bottom w:w="80" w:type="dxa"/>
+              <w:end w:w="120" w:type="dxa"/>
+            </w:tcMar>
+            <w:vAlign w:val="center"/>
+          </w:tcPr>
+          <w:p>
+            <w:pPr>
+              <w:spacing w:before="0" w:after="20" w:line="259" w:lineRule="auto"/>
+            </w:pPr>
+            <w:r>
+              <w:rPr>
+                <w:rFonts w:ascii="Microsoft YaHei" w:hAnsi="Microsoft YaHei" w:eastAsia="Microsoft YaHei"/>
+                <w:color w:val="243447"/>
+                <w:sz w:val="16"/>
+              </w:rPr>
+            </w:r>
+            <w:r>
+              <w:rPr>
+                <w:rFonts w:ascii="Microsoft YaHei" w:hAnsi="Microsoft YaHei" w:eastAsia="Microsoft YaHei"/>
+                <w:b w:val="0"/>
+                <w:color w:val="243447"/>
+                <w:sz w:val="16"/>
+              </w:rPr>
+              <w:t>申请售后未选择退款原因</w:t>
+            </w:r>
+          </w:p>
+        </w:tc>
+        <w:tc>
+          <w:tcPr>
+            <w:tcW w:type="dxa" w:w="4350"/>
+            <w:tcMar>
+              <w:top w:w="80" w:type="dxa"/>
+              <w:start w:w="120" w:type="dxa"/>
+              <w:bottom w:w="80" w:type="dxa"/>
+              <w:end w:w="120" w:type="dxa"/>
+            </w:tcMar>
+            <w:vAlign w:val="center"/>
+          </w:tcPr>
+          <w:p>
+            <w:pPr>
+              <w:spacing w:before="0" w:after="20" w:line="259" w:lineRule="auto"/>
+            </w:pPr>
+            <w:r>
+              <w:rPr>
+                <w:rFonts w:ascii="Microsoft YaHei" w:hAnsi="Microsoft YaHei" w:eastAsia="Microsoft YaHei"/>
+                <w:color w:val="243447"/>
+                <w:sz w:val="16"/>
+              </w:rPr>
+            </w:r>
+            <w:r>
+              <w:rPr>
+                <w:rFonts w:ascii="Microsoft YaHei" w:hAnsi="Microsoft YaHei" w:eastAsia="Microsoft YaHei"/>
+                <w:b w:val="0"/>
+                <w:color w:val="243447"/>
+                <w:sz w:val="16"/>
+              </w:rPr>
+              <w:t>阻止提交并定位到退款原因字段。</w:t>
+            </w:r>
+          </w:p>
+        </w:tc>
+        <w:tc>
+          <w:tcPr>
+            <w:tcW w:type="dxa" w:w="2260"/>
+            <w:tcMar>
+              <w:top w:w="80" w:type="dxa"/>
+              <w:start w:w="120" w:type="dxa"/>
+              <w:bottom w:w="80" w:type="dxa"/>
+              <w:end w:w="120" w:type="dxa"/>
+            </w:tcMar>
+            <w:vAlign w:val="center"/>
+          </w:tcPr>
+          <w:p>
+            <w:pPr>
+              <w:spacing w:before="0" w:after="20" w:line="259" w:lineRule="auto"/>
+            </w:pPr>
+            <w:r>
+              <w:rPr>
+                <w:rFonts w:ascii="Microsoft YaHei" w:hAnsi="Microsoft YaHei" w:eastAsia="Microsoft YaHei"/>
+                <w:color w:val="243447"/>
+                <w:sz w:val="16"/>
+              </w:rPr>
+            </w:r>
+            <w:r>
+              <w:rPr>
+                <w:rFonts w:ascii="Microsoft YaHei" w:hAnsi="Microsoft YaHei" w:eastAsia="Microsoft YaHei"/>
+                <w:b w:val="0"/>
+                <w:color w:val="243447"/>
+                <w:sz w:val="16"/>
+              </w:rPr>
+              <w:t>请选择退款原因。</w:t>
+            </w:r>
+          </w:p>
+        </w:tc>
+      </w:tr>
+      <w:tr>
+        <w:trPr>
+          <w:cantSplit/>
+        </w:trPr>
+        <w:tc>
+          <w:tcPr>
+            <w:tcW w:type="dxa" w:w="2750"/>
+            <w:tcMar>
+              <w:top w:w="80" w:type="dxa"/>
+              <w:start w:w="120" w:type="dxa"/>
+              <w:bottom w:w="80" w:type="dxa"/>
+              <w:end w:w="120" w:type="dxa"/>
+            </w:tcMar>
+            <w:vAlign w:val="center"/>
+          </w:tcPr>
+          <w:p>
+            <w:pPr>
+              <w:spacing w:before="0" w:after="20" w:line="259" w:lineRule="auto"/>
+            </w:pPr>
+            <w:r>
+              <w:rPr>
+                <w:rFonts w:ascii="Microsoft YaHei" w:hAnsi="Microsoft YaHei" w:eastAsia="Microsoft YaHei"/>
+                <w:color w:val="243447"/>
+                <w:sz w:val="16"/>
+              </w:rPr>
+            </w:r>
+            <w:r>
+              <w:rPr>
+                <w:rFonts w:ascii="Microsoft YaHei" w:hAnsi="Microsoft YaHei" w:eastAsia="Microsoft YaHei"/>
+                <w:b w:val="0"/>
+                <w:color w:val="243447"/>
+                <w:sz w:val="16"/>
+              </w:rPr>
+              <w:t>申请数量为空、非正整数或超过可申请数量</w:t>
+            </w:r>
+          </w:p>
+        </w:tc>
+        <w:tc>
+          <w:tcPr>
+            <w:tcW w:type="dxa" w:w="4350"/>
+            <w:tcMar>
+              <w:top w:w="80" w:type="dxa"/>
+              <w:start w:w="120" w:type="dxa"/>
+              <w:bottom w:w="80" w:type="dxa"/>
+              <w:end w:w="120" w:type="dxa"/>
+            </w:tcMar>
+            <w:vAlign w:val="center"/>
+          </w:tcPr>
+          <w:p>
+            <w:pPr>
+              <w:spacing w:before="0" w:after="20" w:line="259" w:lineRule="auto"/>
+            </w:pPr>
+            <w:r>
+              <w:rPr>
+                <w:rFonts w:ascii="Microsoft YaHei" w:hAnsi="Microsoft YaHei" w:eastAsia="Microsoft YaHei"/>
+                <w:color w:val="243447"/>
+                <w:sz w:val="16"/>
+              </w:rPr>
+            </w:r>
+            <w:r>
+              <w:rPr>
+                <w:rFonts w:ascii="Microsoft YaHei" w:hAnsi="Microsoft YaHei" w:eastAsia="Microsoft YaHei"/>
+                <w:b w:val="0"/>
+                <w:color w:val="243447"/>
+                <w:sz w:val="16"/>
+              </w:rPr>
+              <w:t>阻止提交并展示当前可申请上限。</w:t>
+            </w:r>
+          </w:p>
+        </w:tc>
+        <w:tc>
+          <w:tcPr>
+            <w:tcW w:type="dxa" w:w="2260"/>
+            <w:tcMar>
+              <w:top w:w="80" w:type="dxa"/>
+              <w:start w:w="120" w:type="dxa"/>
+              <w:bottom w:w="80" w:type="dxa"/>
+              <w:end w:w="120" w:type="dxa"/>
+            </w:tcMar>
+            <w:vAlign w:val="center"/>
+          </w:tcPr>
+          <w:p>
+            <w:pPr>
+              <w:spacing w:before="0" w:after="20" w:line="259" w:lineRule="auto"/>
+            </w:pPr>
+            <w:r>
+              <w:rPr>
+                <w:rFonts w:ascii="Microsoft YaHei" w:hAnsi="Microsoft YaHei" w:eastAsia="Microsoft YaHei"/>
+                <w:color w:val="243447"/>
+                <w:sz w:val="16"/>
+              </w:rPr>
+            </w:r>
+            <w:r>
+              <w:rPr>
+                <w:rFonts w:ascii="Microsoft YaHei" w:hAnsi="Microsoft YaHei" w:eastAsia="Microsoft YaHei"/>
+                <w:b w:val="0"/>
+                <w:color w:val="243447"/>
+                <w:sz w:val="16"/>
+              </w:rPr>
+              <w:t>申请数量需为正整数且不能超过可申请数量。</w:t>
+            </w:r>
+          </w:p>
+        </w:tc>
+      </w:tr>
+      <w:tr>
+        <w:trPr>
+          <w:cantSplit/>
+        </w:trPr>
+        <w:tc>
+          <w:tcPr>
+            <w:tcW w:type="dxa" w:w="2750"/>
+            <w:tcMar>
+              <w:top w:w="80" w:type="dxa"/>
+              <w:start w:w="120" w:type="dxa"/>
+              <w:bottom w:w="80" w:type="dxa"/>
+              <w:end w:w="120" w:type="dxa"/>
+            </w:tcMar>
+            <w:vAlign w:val="center"/>
+          </w:tcPr>
+          <w:p>
+            <w:pPr>
+              <w:spacing w:before="0" w:after="20" w:line="259" w:lineRule="auto"/>
+            </w:pPr>
+            <w:r>
+              <w:rPr>
+                <w:rFonts w:ascii="Microsoft YaHei" w:hAnsi="Microsoft YaHei" w:eastAsia="Microsoft YaHei"/>
+                <w:color w:val="243447"/>
+                <w:sz w:val="16"/>
+              </w:rPr>
+            </w:r>
+            <w:r>
+              <w:rPr>
+                <w:rFonts w:ascii="Microsoft YaHei" w:hAnsi="Microsoft YaHei" w:eastAsia="Microsoft YaHei"/>
+                <w:b w:val="0"/>
+                <w:color w:val="243447"/>
+                <w:sz w:val="16"/>
+              </w:rPr>
+              <w:t>申请退款金额为0或超过可退款金额</w:t>
+            </w:r>
+          </w:p>
+        </w:tc>
+        <w:tc>
+          <w:tcPr>
+            <w:tcW w:type="dxa" w:w="4350"/>
+            <w:tcMar>
+              <w:top w:w="80" w:type="dxa"/>
+              <w:start w:w="120" w:type="dxa"/>
+              <w:bottom w:w="80" w:type="dxa"/>
+              <w:end w:w="120" w:type="dxa"/>
+            </w:tcMar>
+            <w:vAlign w:val="center"/>
+          </w:tcPr>
+          <w:p>
+            <w:pPr>
+              <w:spacing w:before="0" w:after="20" w:line="259" w:lineRule="auto"/>
+            </w:pPr>
+            <w:r>
+              <w:rPr>
+                <w:rFonts w:ascii="Microsoft YaHei" w:hAnsi="Microsoft YaHei" w:eastAsia="Microsoft YaHei"/>
+                <w:color w:val="243447"/>
+                <w:sz w:val="16"/>
+              </w:rPr>
+            </w:r>
+            <w:r>
+              <w:rPr>
+                <w:rFonts w:ascii="Microsoft YaHei" w:hAnsi="Microsoft YaHei" w:eastAsia="Microsoft YaHei"/>
+                <w:b w:val="0"/>
+                <w:color w:val="243447"/>
+                <w:sz w:val="16"/>
+              </w:rPr>
+              <w:t>阻止提交，保留已填表单。</w:t>
+            </w:r>
+          </w:p>
+        </w:tc>
+        <w:tc>
+          <w:tcPr>
+            <w:tcW w:type="dxa" w:w="2260"/>
+            <w:tcMar>
+              <w:top w:w="80" w:type="dxa"/>
+              <w:start w:w="120" w:type="dxa"/>
+              <w:bottom w:w="80" w:type="dxa"/>
+              <w:end w:w="120" w:type="dxa"/>
+            </w:tcMar>
+            <w:vAlign w:val="center"/>
+          </w:tcPr>
+          <w:p>
+            <w:pPr>
+              <w:spacing w:before="0" w:after="20" w:line="259" w:lineRule="auto"/>
+            </w:pPr>
+            <w:r>
+              <w:rPr>
+                <w:rFonts w:ascii="Microsoft YaHei" w:hAnsi="Microsoft YaHei" w:eastAsia="Microsoft YaHei"/>
+                <w:color w:val="243447"/>
+                <w:sz w:val="16"/>
+              </w:rPr>
+            </w:r>
+            <w:r>
+              <w:rPr>
+                <w:rFonts w:ascii="Microsoft YaHei" w:hAnsi="Microsoft YaHei" w:eastAsia="Microsoft YaHei"/>
+                <w:b w:val="0"/>
+                <w:color w:val="243447"/>
+                <w:sz w:val="16"/>
+              </w:rPr>
+              <w:t>申请退款金额需大于0且不能超过可退款金额。</w:t>
+            </w:r>
+          </w:p>
+        </w:tc>
+      </w:tr>
+      <w:tr>
+        <w:trPr>
+          <w:cantSplit/>
+        </w:trPr>
+        <w:tc>
+          <w:tcPr>
+            <w:tcW w:type="dxa" w:w="2750"/>
+            <w:tcMar>
+              <w:top w:w="80" w:type="dxa"/>
+              <w:start w:w="120" w:type="dxa"/>
+              <w:bottom w:w="80" w:type="dxa"/>
+              <w:end w:w="120" w:type="dxa"/>
+            </w:tcMar>
+            <w:vAlign w:val="center"/>
+          </w:tcPr>
+          <w:p>
+            <w:pPr>
+              <w:spacing w:before="0" w:after="20" w:line="259" w:lineRule="auto"/>
+            </w:pPr>
+            <w:r>
+              <w:rPr>
+                <w:rFonts w:ascii="Microsoft YaHei" w:hAnsi="Microsoft YaHei" w:eastAsia="Microsoft YaHei"/>
+                <w:color w:val="243447"/>
+                <w:sz w:val="16"/>
+              </w:rPr>
+            </w:r>
+            <w:r>
+              <w:rPr>
+                <w:rFonts w:ascii="Microsoft YaHei" w:hAnsi="Microsoft YaHei" w:eastAsia="Microsoft YaHei"/>
+                <w:b w:val="0"/>
+                <w:color w:val="243447"/>
+                <w:sz w:val="16"/>
+              </w:rPr>
+              <w:t>退款构成合计与申请金额不一致</w:t>
+            </w:r>
+          </w:p>
+        </w:tc>
+        <w:tc>
+          <w:tcPr>
+            <w:tcW w:type="dxa" w:w="4350"/>
+            <w:tcMar>
+              <w:top w:w="80" w:type="dxa"/>
+              <w:start w:w="120" w:type="dxa"/>
+              <w:bottom w:w="80" w:type="dxa"/>
+              <w:end w:w="120" w:type="dxa"/>
+            </w:tcMar>
+            <w:vAlign w:val="center"/>
+          </w:tcPr>
+          <w:p>
+            <w:pPr>
+              <w:spacing w:before="0" w:after="20" w:line="259" w:lineRule="auto"/>
+            </w:pPr>
+            <w:r>
+              <w:rPr>
+                <w:rFonts w:ascii="Microsoft YaHei" w:hAnsi="Microsoft YaHei" w:eastAsia="Microsoft YaHei"/>
+                <w:color w:val="243447"/>
+                <w:sz w:val="16"/>
+              </w:rPr>
+            </w:r>
+            <w:r>
+              <w:rPr>
+                <w:rFonts w:ascii="Microsoft YaHei" w:hAnsi="Microsoft YaHei" w:eastAsia="Microsoft YaHei"/>
+                <w:b w:val="0"/>
+                <w:color w:val="243447"/>
+                <w:sz w:val="16"/>
+              </w:rPr>
+              <w:t>阻止提交并高亮进场抵扣、上账、实际支付三个金额字段。</w:t>
+            </w:r>
+          </w:p>
+        </w:tc>
+        <w:tc>
+          <w:tcPr>
+            <w:tcW w:type="dxa" w:w="2260"/>
+            <w:tcMar>
+              <w:top w:w="80" w:type="dxa"/>
+              <w:start w:w="120" w:type="dxa"/>
+              <w:bottom w:w="80" w:type="dxa"/>
+              <w:end w:w="120" w:type="dxa"/>
+            </w:tcMar>
+            <w:vAlign w:val="center"/>
+          </w:tcPr>
+          <w:p>
+            <w:pPr>
+              <w:spacing w:before="0" w:after="20" w:line="259" w:lineRule="auto"/>
+            </w:pPr>
+            <w:r>
+              <w:rPr>
+                <w:rFonts w:ascii="Microsoft YaHei" w:hAnsi="Microsoft YaHei" w:eastAsia="Microsoft YaHei"/>
+                <w:color w:val="243447"/>
+                <w:sz w:val="16"/>
+              </w:rPr>
+            </w:r>
+            <w:r>
+              <w:rPr>
+                <w:rFonts w:ascii="Microsoft YaHei" w:hAnsi="Microsoft YaHei" w:eastAsia="Microsoft YaHei"/>
+                <w:b w:val="0"/>
+                <w:color w:val="243447"/>
+                <w:sz w:val="16"/>
+              </w:rPr>
+              <w:t>退款构成合计必须等于申请退款金额。</w:t>
+            </w:r>
+          </w:p>
+        </w:tc>
+      </w:tr>
+      <w:tr>
+        <w:trPr>
+          <w:cantSplit/>
+        </w:trPr>
+        <w:tc>
+          <w:tcPr>
+            <w:tcW w:type="dxa" w:w="2750"/>
+            <w:tcMar>
+              <w:top w:w="80" w:type="dxa"/>
+              <w:start w:w="120" w:type="dxa"/>
+              <w:bottom w:w="80" w:type="dxa"/>
+              <w:end w:w="120" w:type="dxa"/>
+            </w:tcMar>
+            <w:vAlign w:val="center"/>
+          </w:tcPr>
+          <w:p>
+            <w:pPr>
+              <w:spacing w:before="0" w:after="20" w:line="259" w:lineRule="auto"/>
+            </w:pPr>
+            <w:r>
+              <w:rPr>
+                <w:rFonts w:ascii="Microsoft YaHei" w:hAnsi="Microsoft YaHei" w:eastAsia="Microsoft YaHei"/>
+                <w:color w:val="243447"/>
+                <w:sz w:val="16"/>
+              </w:rPr>
+            </w:r>
+            <w:r>
+              <w:rPr>
+                <w:rFonts w:ascii="Microsoft YaHei" w:hAnsi="Microsoft YaHei" w:eastAsia="Microsoft YaHei"/>
+                <w:b w:val="0"/>
+                <w:color w:val="243447"/>
+                <w:sz w:val="16"/>
+              </w:rPr>
+              <w:t>重复点击申请售后确认</w:t>
+            </w:r>
+          </w:p>
+        </w:tc>
+        <w:tc>
+          <w:tcPr>
+            <w:tcW w:type="dxa" w:w="4350"/>
+            <w:tcMar>
+              <w:top w:w="80" w:type="dxa"/>
+              <w:start w:w="120" w:type="dxa"/>
+              <w:bottom w:w="80" w:type="dxa"/>
+              <w:end w:w="120" w:type="dxa"/>
+            </w:tcMar>
+            <w:vAlign w:val="center"/>
+          </w:tcPr>
+          <w:p>
+            <w:pPr>
+              <w:spacing w:before="0" w:after="20" w:line="259" w:lineRule="auto"/>
+            </w:pPr>
+            <w:r>
+              <w:rPr>
+                <w:rFonts w:ascii="Microsoft YaHei" w:hAnsi="Microsoft YaHei" w:eastAsia="Microsoft YaHei"/>
+                <w:color w:val="243447"/>
+                <w:sz w:val="16"/>
+              </w:rPr>
+            </w:r>
+            <w:r>
+              <w:rPr>
+                <w:rFonts w:ascii="Microsoft YaHei" w:hAnsi="Microsoft YaHei" w:eastAsia="Microsoft YaHei"/>
+                <w:b w:val="0"/>
+                <w:color w:val="243447"/>
+                <w:sz w:val="16"/>
+              </w:rPr>
+              <w:t>以申请请求号和业务唯一约束返回首次创建结果。</w:t>
+            </w:r>
+          </w:p>
+        </w:tc>
+        <w:tc>
+          <w:tcPr>
+            <w:tcW w:type="dxa" w:w="2260"/>
+            <w:tcMar>
+              <w:top w:w="80" w:type="dxa"/>
+              <w:start w:w="120" w:type="dxa"/>
+              <w:bottom w:w="80" w:type="dxa"/>
+              <w:end w:w="120" w:type="dxa"/>
+            </w:tcMar>
+            <w:vAlign w:val="center"/>
+          </w:tcPr>
+          <w:p>
+            <w:pPr>
+              <w:spacing w:before="0" w:after="20" w:line="259" w:lineRule="auto"/>
+            </w:pPr>
+            <w:r>
+              <w:rPr>
+                <w:rFonts w:ascii="Microsoft YaHei" w:hAnsi="Microsoft YaHei" w:eastAsia="Microsoft YaHei"/>
+                <w:color w:val="243447"/>
+                <w:sz w:val="16"/>
+              </w:rPr>
+            </w:r>
+            <w:r>
+              <w:rPr>
+                <w:rFonts w:ascii="Microsoft YaHei" w:hAnsi="Microsoft YaHei" w:eastAsia="Microsoft YaHei"/>
+                <w:b w:val="0"/>
+                <w:color w:val="243447"/>
+                <w:sz w:val="16"/>
+              </w:rPr>
+              <w:t>售后订单已创建，请勿重复提交。</w:t>
             </w:r>
           </w:p>
         </w:tc>
@@ -12820,7 +13908,7 @@
           <w:color w:val="243447"/>
           <w:sz w:val="20"/>
         </w:rPr>
-        <w:t>售后人员通过售后订单发起退款、取消或退货；售后完成后系统自动向旺店通推送1条数据，发货管理只提供售后订单关联查看和跳转。</w:t>
+        <w:t>售后人员可在订单商品行发起申请，并在新增售后订单页面统一查询和处理。提交申请只生成处理中售后单；完成售后后系统才自动向旺店通推送1条数据。</w:t>
       </w:r>
     </w:p>
     <w:p>
@@ -13272,6 +14360,77 @@
                 <w:sz w:val="18"/>
               </w:rPr>
               <w:t>以售后订单为发起与推送主体；保留原订单商品行—实际发货单商品行的数量映射，售后完成后按售后订单维度向旺店通推送1条数据。</w:t>
+            </w:r>
+          </w:p>
+        </w:tc>
+      </w:tr>
+      <w:tr>
+        <w:trPr>
+          <w:cantSplit/>
+        </w:trPr>
+        <w:tc>
+          <w:tcPr>
+            <w:tcW w:type="dxa" w:w="2300"/>
+            <w:tcMar>
+              <w:top w:w="80" w:type="dxa"/>
+              <w:start w:w="120" w:type="dxa"/>
+              <w:bottom w:w="80" w:type="dxa"/>
+              <w:end w:w="120" w:type="dxa"/>
+            </w:tcMar>
+            <w:vAlign w:val="center"/>
+          </w:tcPr>
+          <w:p>
+            <w:pPr>
+              <w:spacing w:before="0" w:after="20" w:line="259" w:lineRule="auto"/>
+            </w:pPr>
+            <w:r>
+              <w:rPr>
+                <w:rFonts w:ascii="Microsoft YaHei" w:hAnsi="Microsoft YaHei" w:eastAsia="Microsoft YaHei"/>
+                <w:color w:val="243447"/>
+                <w:sz w:val="18"/>
+              </w:rPr>
+            </w:r>
+            <w:r>
+              <w:rPr>
+                <w:rFonts w:ascii="Microsoft YaHei" w:hAnsi="Microsoft YaHei" w:eastAsia="Microsoft YaHei"/>
+                <w:b w:val="0"/>
+                <w:color w:val="243447"/>
+                <w:sz w:val="18"/>
+              </w:rPr>
+              <w:t>售后订单页面</w:t>
+            </w:r>
+          </w:p>
+        </w:tc>
+        <w:tc>
+          <w:tcPr>
+            <w:tcW w:type="dxa" w:w="7060"/>
+            <w:tcMar>
+              <w:top w:w="80" w:type="dxa"/>
+              <w:start w:w="120" w:type="dxa"/>
+              <w:bottom w:w="80" w:type="dxa"/>
+              <w:end w:w="120" w:type="dxa"/>
+            </w:tcMar>
+            <w:vAlign w:val="center"/>
+          </w:tcPr>
+          <w:p>
+            <w:pPr>
+              <w:spacing w:before="0" w:after="20" w:line="259" w:lineRule="auto"/>
+            </w:pPr>
+            <w:r>
+              <w:rPr>
+                <w:rFonts w:ascii="Microsoft YaHei" w:hAnsi="Microsoft YaHei" w:eastAsia="Microsoft YaHei"/>
+                <w:color w:val="243447"/>
+                <w:sz w:val="18"/>
+              </w:rPr>
+            </w:r>
+            <w:r>
+              <w:rPr>
+                <w:rFonts w:ascii="Microsoft YaHei" w:hAnsi="Microsoft YaHei" w:eastAsia="Microsoft YaHei"/>
+                <w:b w:val="0"/>
+                <w:color w:val="243447"/>
+                <w:sz w:val="18"/>
+              </w:rPr>
+              <w:t>新增售后订单列表、紧凑筛选区、指标卡、申请售后弹窗、详情与推送结果展示；申请表单增加数量上限、可退金额及退款构成一致性校验。</w:t>
             </w:r>
           </w:p>
         </w:tc>
@@ -14089,7 +15248,7 @@
                 <w:color w:val="243447"/>
                 <w:sz w:val="16"/>
               </w:rPr>
-              <w:t>发货管理双Tab、拆合弹窗及结果档案</w:t>
+              <w:t>发货管理、拆合弹窗、结果档案及售后页面</w:t>
             </w:r>
           </w:p>
         </w:tc>
@@ -14122,7 +15281,7 @@
                 <w:color w:val="243447"/>
                 <w:sz w:val="16"/>
               </w:rPr>
-              <w:t>Tab切换与查询条件保留、温层快捷/自定义拆分切换、数量校验、差异高亮、关系链展示。</w:t>
+              <w:t>完成Tab切换与查询条件保留、温层快捷/自定义拆分、售后订单列表、紧凑型申请售后弹窗、数量/金额校验、详情和推送结果展示。</w:t>
             </w:r>
           </w:p>
         </w:tc>
@@ -14363,7 +15522,7 @@
                 <w:color w:val="243447"/>
                 <w:sz w:val="16"/>
               </w:rPr>
-              <w:t>售后订单状态、数量映射与完成事件</w:t>
+              <w:t>售后申请、数量金额校验、状态与完成事件</w:t>
             </w:r>
           </w:p>
         </w:tc>
@@ -14396,7 +15555,7 @@
                 <w:color w:val="243447"/>
                 <w:sz w:val="16"/>
               </w:rPr>
-              <w:t>提供售后订单发起、完成状态和完成事件；保存原订单商品行到实际发货单商品行的数量映射，并保证一张售后订单只触发1条旺店通数据。</w:t>
+              <w:t>提供仅退款/退货退款创建、退款原因、数量上限、可退金额和退款构成校验；保存原订单商品行到实际发货单商品行的数量映射，并保证一张售后订单完成只触发1条旺店通数据。</w:t>
             </w:r>
           </w:p>
         </w:tc>
@@ -14637,7 +15796,7 @@
                 <w:color w:val="243447"/>
                 <w:sz w:val="16"/>
               </w:rPr>
-              <w:t>端到端与并发测试</w:t>
+              <w:t>端到端、表单校验与并发测试</w:t>
             </w:r>
           </w:p>
         </w:tc>
@@ -14670,7 +15829,7 @@
                 <w:color w:val="243447"/>
                 <w:sz w:val="16"/>
               </w:rPr>
-              <w:t>覆盖前置拆合、驳回拆合、多级拆合、售后完成推送1条、重复完成事件幂等、推送失败重试及结果未知。</w:t>
+              <w:t>覆盖前置拆合、驳回拆合、多级拆合、两类售后申请、数量/金额边界、重复提交、售后完成推送1条、重复完成事件幂等及推送失败重试。</w:t>
             </w:r>
           </w:p>
         </w:tc>

</xml_diff>